<commit_message>
delta mesh Task 12: update HAS/MAS/GAS docs and rebuild PDFs
</commit_message>
<xml_diff>
--- a/projects/components/fabric-gen-ip/delta/docs/Delta_MAS_v1.0.docx
+++ b/projects/components/fabric-gen-ip/delta/docs/Delta_MAS_v1.0.docx
@@ -101,7 +101,7 @@
           <w:color w:val="000000"/>
           <w:sz w:val="20"/>
         </w:rPr>
-        <w:t>October 14, 2026</w:t>
+        <w:t>October 16, 2026</w:t>
       </w:r>
     </w:p>
     <w:p>
@@ -160,7 +160,7 @@
             </w:rPr>
             <w:fldChar w:fldCharType="separate"/>
           </w:r>
-          <w:hyperlink w:anchor="__RefHeading___Toc5993_1375447347">
+          <w:hyperlink w:anchor="__RefHeading___Toc6196_2586448665">
             <w:r>
               <w:rPr>
                 <w:webHidden/>
@@ -181,7 +181,7 @@
             </w:tabs>
             <w:rPr/>
           </w:pPr>
-          <w:hyperlink w:anchor="__RefHeading___Toc5995_1375447347">
+          <w:hyperlink w:anchor="__RefHeading___Toc6198_2586448665">
             <w:r>
               <w:rPr>
                 <w:webHidden/>
@@ -202,7 +202,7 @@
             </w:tabs>
             <w:rPr/>
           </w:pPr>
-          <w:hyperlink w:anchor="__RefHeading___Toc5997_1375447347">
+          <w:hyperlink w:anchor="__RefHeading___Toc6200_2586448665">
             <w:r>
               <w:rPr>
                 <w:webHidden/>
@@ -223,7 +223,7 @@
             </w:tabs>
             <w:rPr/>
           </w:pPr>
-          <w:hyperlink w:anchor="__RefHeading___Toc5999_1375447347">
+          <w:hyperlink w:anchor="__RefHeading___Toc6202_2586448665">
             <w:r>
               <w:rPr>
                 <w:webHidden/>
@@ -244,7 +244,7 @@
             </w:tabs>
             <w:rPr/>
           </w:pPr>
-          <w:hyperlink w:anchor="__RefHeading___Toc6001_1375447347">
+          <w:hyperlink w:anchor="__RefHeading___Toc6204_2586448665">
             <w:r>
               <w:rPr>
                 <w:webHidden/>
@@ -265,7 +265,7 @@
             </w:tabs>
             <w:rPr/>
           </w:pPr>
-          <w:hyperlink w:anchor="__RefHeading___Toc6003_1375447347">
+          <w:hyperlink w:anchor="__RefHeading___Toc6206_2586448665">
             <w:r>
               <w:rPr>
                 <w:webHidden/>
@@ -286,7 +286,7 @@
             </w:tabs>
             <w:rPr/>
           </w:pPr>
-          <w:hyperlink w:anchor="__RefHeading___Toc6005_1375447347">
+          <w:hyperlink w:anchor="__RefHeading___Toc6208_2586448665">
             <w:r>
               <w:rPr>
                 <w:webHidden/>
@@ -307,7 +307,7 @@
             </w:tabs>
             <w:rPr/>
           </w:pPr>
-          <w:hyperlink w:anchor="__RefHeading___Toc6007_1375447347">
+          <w:hyperlink w:anchor="__RefHeading___Toc6210_2586448665">
             <w:r>
               <w:rPr>
                 <w:webHidden/>
@@ -328,7 +328,7 @@
             </w:tabs>
             <w:rPr/>
           </w:pPr>
-          <w:hyperlink w:anchor="__RefHeading___Toc6009_1375447347">
+          <w:hyperlink w:anchor="__RefHeading___Toc6212_2586448665">
             <w:r>
               <w:rPr>
                 <w:webHidden/>
@@ -349,7 +349,7 @@
             </w:tabs>
             <w:rPr/>
           </w:pPr>
-          <w:hyperlink w:anchor="__RefHeading___Toc6011_1375447347">
+          <w:hyperlink w:anchor="__RefHeading___Toc6214_2586448665">
             <w:r>
               <w:rPr>
                 <w:webHidden/>
@@ -370,7 +370,7 @@
             </w:tabs>
             <w:rPr/>
           </w:pPr>
-          <w:hyperlink w:anchor="__RefHeading___Toc6013_1375447347">
+          <w:hyperlink w:anchor="__RefHeading___Toc6216_2586448665">
             <w:r>
               <w:rPr>
                 <w:webHidden/>
@@ -391,7 +391,7 @@
             </w:tabs>
             <w:rPr/>
           </w:pPr>
-          <w:hyperlink w:anchor="__RefHeading___Toc6015_1375447347">
+          <w:hyperlink w:anchor="__RefHeading___Toc6218_2586448665">
             <w:r>
               <w:rPr>
                 <w:webHidden/>
@@ -412,7 +412,7 @@
             </w:tabs>
             <w:rPr/>
           </w:pPr>
-          <w:hyperlink w:anchor="__RefHeading___Toc6017_1375447347">
+          <w:hyperlink w:anchor="__RefHeading___Toc6220_2586448665">
             <w:r>
               <w:rPr>
                 <w:webHidden/>
@@ -433,7 +433,7 @@
             </w:tabs>
             <w:rPr/>
           </w:pPr>
-          <w:hyperlink w:anchor="__RefHeading___Toc6019_1375447347">
+          <w:hyperlink w:anchor="__RefHeading___Toc6222_2586448665">
             <w:r>
               <w:rPr>
                 <w:webHidden/>
@@ -454,7 +454,7 @@
             </w:tabs>
             <w:rPr/>
           </w:pPr>
-          <w:hyperlink w:anchor="__RefHeading___Toc6021_1375447347">
+          <w:hyperlink w:anchor="__RefHeading___Toc6224_2586448665">
             <w:r>
               <w:rPr>
                 <w:webHidden/>
@@ -475,7 +475,7 @@
             </w:tabs>
             <w:rPr/>
           </w:pPr>
-          <w:hyperlink w:anchor="__RefHeading___Toc6023_1375447347">
+          <w:hyperlink w:anchor="__RefHeading___Toc6226_2586448665">
             <w:r>
               <w:rPr>
                 <w:webHidden/>
@@ -496,7 +496,7 @@
             </w:tabs>
             <w:rPr/>
           </w:pPr>
-          <w:hyperlink w:anchor="__RefHeading___Toc6025_1375447347">
+          <w:hyperlink w:anchor="__RefHeading___Toc6228_2586448665">
             <w:r>
               <w:rPr>
                 <w:webHidden/>
@@ -517,7 +517,7 @@
             </w:tabs>
             <w:rPr/>
           </w:pPr>
-          <w:hyperlink w:anchor="__RefHeading___Toc6027_1375447347">
+          <w:hyperlink w:anchor="__RefHeading___Toc6230_2586448665">
             <w:r>
               <w:rPr>
                 <w:webHidden/>
@@ -538,7 +538,7 @@
             </w:tabs>
             <w:rPr/>
           </w:pPr>
-          <w:hyperlink w:anchor="__RefHeading___Toc6029_1375447347">
+          <w:hyperlink w:anchor="__RefHeading___Toc6232_2586448665">
             <w:r>
               <w:rPr>
                 <w:webHidden/>
@@ -559,7 +559,7 @@
             </w:tabs>
             <w:rPr/>
           </w:pPr>
-          <w:hyperlink w:anchor="__RefHeading___Toc6031_1375447347">
+          <w:hyperlink w:anchor="__RefHeading___Toc6234_2586448665">
             <w:r>
               <w:rPr>
                 <w:webHidden/>
@@ -580,7 +580,7 @@
             </w:tabs>
             <w:rPr/>
           </w:pPr>
-          <w:hyperlink w:anchor="__RefHeading___Toc6033_1375447347">
+          <w:hyperlink w:anchor="__RefHeading___Toc6236_2586448665">
             <w:r>
               <w:rPr>
                 <w:webHidden/>
@@ -601,7 +601,7 @@
             </w:tabs>
             <w:rPr/>
           </w:pPr>
-          <w:hyperlink w:anchor="__RefHeading___Toc6035_1375447347">
+          <w:hyperlink w:anchor="__RefHeading___Toc6238_2586448665">
             <w:r>
               <w:rPr>
                 <w:webHidden/>
@@ -622,7 +622,7 @@
             </w:tabs>
             <w:rPr/>
           </w:pPr>
-          <w:hyperlink w:anchor="__RefHeading___Toc6037_1375447347">
+          <w:hyperlink w:anchor="__RefHeading___Toc6240_2586448665">
             <w:r>
               <w:rPr>
                 <w:webHidden/>
@@ -643,7 +643,7 @@
             </w:tabs>
             <w:rPr/>
           </w:pPr>
-          <w:hyperlink w:anchor="__RefHeading___Toc6039_1375447347">
+          <w:hyperlink w:anchor="__RefHeading___Toc6242_2586448665">
             <w:r>
               <w:rPr>
                 <w:webHidden/>
@@ -664,7 +664,7 @@
             </w:tabs>
             <w:rPr/>
           </w:pPr>
-          <w:hyperlink w:anchor="__RefHeading___Toc6041_1375447347">
+          <w:hyperlink w:anchor="__RefHeading___Toc6244_2586448665">
             <w:r>
               <w:rPr>
                 <w:webHidden/>
@@ -685,7 +685,7 @@
             </w:tabs>
             <w:rPr/>
           </w:pPr>
-          <w:hyperlink w:anchor="__RefHeading___Toc6043_1375447347">
+          <w:hyperlink w:anchor="__RefHeading___Toc6246_2586448665">
             <w:r>
               <w:rPr>
                 <w:webHidden/>
@@ -706,7 +706,7 @@
             </w:tabs>
             <w:rPr/>
           </w:pPr>
-          <w:hyperlink w:anchor="__RefHeading___Toc6045_1375447347">
+          <w:hyperlink w:anchor="__RefHeading___Toc6248_2586448665">
             <w:r>
               <w:rPr>
                 <w:webHidden/>
@@ -727,7 +727,7 @@
             </w:tabs>
             <w:rPr/>
           </w:pPr>
-          <w:hyperlink w:anchor="__RefHeading___Toc6047_1375447347">
+          <w:hyperlink w:anchor="__RefHeading___Toc6250_2586448665">
             <w:r>
               <w:rPr>
                 <w:webHidden/>
@@ -748,7 +748,7 @@
             </w:tabs>
             <w:rPr/>
           </w:pPr>
-          <w:hyperlink w:anchor="__RefHeading___Toc6049_1375447347">
+          <w:hyperlink w:anchor="__RefHeading___Toc6252_2586448665">
             <w:r>
               <w:rPr>
                 <w:webHidden/>
@@ -769,7 +769,7 @@
             </w:tabs>
             <w:rPr/>
           </w:pPr>
-          <w:hyperlink w:anchor="__RefHeading___Toc6051_1375447347">
+          <w:hyperlink w:anchor="__RefHeading___Toc6254_2586448665">
             <w:r>
               <w:rPr>
                 <w:webHidden/>
@@ -790,7 +790,7 @@
             </w:tabs>
             <w:rPr/>
           </w:pPr>
-          <w:hyperlink w:anchor="__RefHeading___Toc6053_1375447347">
+          <w:hyperlink w:anchor="__RefHeading___Toc6256_2586448665">
             <w:r>
               <w:rPr>
                 <w:webHidden/>
@@ -811,7 +811,7 @@
             </w:tabs>
             <w:rPr/>
           </w:pPr>
-          <w:hyperlink w:anchor="__RefHeading___Toc6055_1375447347">
+          <w:hyperlink w:anchor="__RefHeading___Toc6258_2586448665">
             <w:r>
               <w:rPr>
                 <w:webHidden/>
@@ -832,7 +832,7 @@
             </w:tabs>
             <w:rPr/>
           </w:pPr>
-          <w:hyperlink w:anchor="__RefHeading___Toc6057_1375447347">
+          <w:hyperlink w:anchor="__RefHeading___Toc6260_2586448665">
             <w:r>
               <w:rPr>
                 <w:webHidden/>
@@ -853,7 +853,7 @@
             </w:tabs>
             <w:rPr/>
           </w:pPr>
-          <w:hyperlink w:anchor="__RefHeading___Toc6059_1375447347">
+          <w:hyperlink w:anchor="__RefHeading___Toc6262_2586448665">
             <w:r>
               <w:rPr>
                 <w:webHidden/>
@@ -874,7 +874,7 @@
             </w:tabs>
             <w:rPr/>
           </w:pPr>
-          <w:hyperlink w:anchor="__RefHeading___Toc6061_1375447347">
+          <w:hyperlink w:anchor="__RefHeading___Toc6264_2586448665">
             <w:r>
               <w:rPr>
                 <w:webHidden/>
@@ -895,7 +895,7 @@
             </w:tabs>
             <w:rPr/>
           </w:pPr>
-          <w:hyperlink w:anchor="__RefHeading___Toc6063_1375447347">
+          <w:hyperlink w:anchor="__RefHeading___Toc6266_2586448665">
             <w:r>
               <w:rPr>
                 <w:webHidden/>
@@ -916,7 +916,7 @@
             </w:tabs>
             <w:rPr/>
           </w:pPr>
-          <w:hyperlink w:anchor="__RefHeading___Toc6065_1375447347">
+          <w:hyperlink w:anchor="__RefHeading___Toc6268_2586448665">
             <w:r>
               <w:rPr>
                 <w:webHidden/>
@@ -937,7 +937,7 @@
             </w:tabs>
             <w:rPr/>
           </w:pPr>
-          <w:hyperlink w:anchor="__RefHeading___Toc6067_1375447347">
+          <w:hyperlink w:anchor="__RefHeading___Toc6270_2586448665">
             <w:r>
               <w:rPr>
                 <w:webHidden/>
@@ -958,7 +958,7 @@
             </w:tabs>
             <w:rPr/>
           </w:pPr>
-          <w:hyperlink w:anchor="__RefHeading___Toc6069_1375447347">
+          <w:hyperlink w:anchor="__RefHeading___Toc6272_2586448665">
             <w:r>
               <w:rPr>
                 <w:webHidden/>
@@ -979,7 +979,7 @@
             </w:tabs>
             <w:rPr/>
           </w:pPr>
-          <w:hyperlink w:anchor="__RefHeading___Toc6071_1375447347">
+          <w:hyperlink w:anchor="__RefHeading___Toc6274_2586448665">
             <w:r>
               <w:rPr>
                 <w:webHidden/>
@@ -1000,7 +1000,7 @@
             </w:tabs>
             <w:rPr/>
           </w:pPr>
-          <w:hyperlink w:anchor="__RefHeading___Toc6073_1375447347">
+          <w:hyperlink w:anchor="__RefHeading___Toc6276_2586448665">
             <w:r>
               <w:rPr>
                 <w:webHidden/>
@@ -1021,7 +1021,7 @@
             </w:tabs>
             <w:rPr/>
           </w:pPr>
-          <w:hyperlink w:anchor="__RefHeading___Toc6075_1375447347">
+          <w:hyperlink w:anchor="__RefHeading___Toc6278_2586448665">
             <w:r>
               <w:rPr>
                 <w:webHidden/>
@@ -1042,7 +1042,7 @@
             </w:tabs>
             <w:rPr/>
           </w:pPr>
-          <w:hyperlink w:anchor="__RefHeading___Toc6077_1375447347">
+          <w:hyperlink w:anchor="__RefHeading___Toc6280_2586448665">
             <w:r>
               <w:rPr>
                 <w:webHidden/>
@@ -1063,7 +1063,7 @@
             </w:tabs>
             <w:rPr/>
           </w:pPr>
-          <w:hyperlink w:anchor="__RefHeading___Toc6079_1375447347">
+          <w:hyperlink w:anchor="__RefHeading___Toc6282_2586448665">
             <w:r>
               <w:rPr>
                 <w:webHidden/>
@@ -1084,7 +1084,7 @@
             </w:tabs>
             <w:rPr/>
           </w:pPr>
-          <w:hyperlink w:anchor="__RefHeading___Toc6081_1375447347">
+          <w:hyperlink w:anchor="__RefHeading___Toc6284_2586448665">
             <w:r>
               <w:rPr>
                 <w:webHidden/>
@@ -1105,7 +1105,7 @@
             </w:tabs>
             <w:rPr/>
           </w:pPr>
-          <w:hyperlink w:anchor="__RefHeading___Toc6083_1375447347">
+          <w:hyperlink w:anchor="__RefHeading___Toc6286_2586448665">
             <w:r>
               <w:rPr>
                 <w:webHidden/>
@@ -1126,7 +1126,7 @@
             </w:tabs>
             <w:rPr/>
           </w:pPr>
-          <w:hyperlink w:anchor="__RefHeading___Toc6085_1375447347">
+          <w:hyperlink w:anchor="__RefHeading___Toc6288_2586448665">
             <w:r>
               <w:rPr>
                 <w:webHidden/>
@@ -1147,7 +1147,7 @@
             </w:tabs>
             <w:rPr/>
           </w:pPr>
-          <w:hyperlink w:anchor="__RefHeading___Toc6087_1375447347">
+          <w:hyperlink w:anchor="__RefHeading___Toc6290_2586448665">
             <w:r>
               <w:rPr>
                 <w:webHidden/>
@@ -1168,7 +1168,7 @@
             </w:tabs>
             <w:rPr/>
           </w:pPr>
-          <w:hyperlink w:anchor="__RefHeading___Toc6089_1375447347">
+          <w:hyperlink w:anchor="__RefHeading___Toc6292_2586448665">
             <w:r>
               <w:rPr>
                 <w:webHidden/>
@@ -1189,7 +1189,7 @@
             </w:tabs>
             <w:rPr/>
           </w:pPr>
-          <w:hyperlink w:anchor="__RefHeading___Toc6091_1375447347">
+          <w:hyperlink w:anchor="__RefHeading___Toc6294_2586448665">
             <w:r>
               <w:rPr>
                 <w:webHidden/>
@@ -1210,7 +1210,7 @@
             </w:tabs>
             <w:rPr/>
           </w:pPr>
-          <w:hyperlink w:anchor="__RefHeading___Toc6093_1375447347">
+          <w:hyperlink w:anchor="__RefHeading___Toc6296_2586448665">
             <w:r>
               <w:rPr>
                 <w:webHidden/>
@@ -1231,7 +1231,7 @@
             </w:tabs>
             <w:rPr/>
           </w:pPr>
-          <w:hyperlink w:anchor="__RefHeading___Toc6095_1375447347">
+          <w:hyperlink w:anchor="__RefHeading___Toc6298_2586448665">
             <w:r>
               <w:rPr>
                 <w:webHidden/>
@@ -1252,7 +1252,7 @@
             </w:tabs>
             <w:rPr/>
           </w:pPr>
-          <w:hyperlink w:anchor="__RefHeading___Toc6097_1375447347">
+          <w:hyperlink w:anchor="__RefHeading___Toc6300_2586448665">
             <w:r>
               <w:rPr>
                 <w:webHidden/>
@@ -1273,7 +1273,7 @@
             </w:tabs>
             <w:rPr/>
           </w:pPr>
-          <w:hyperlink w:anchor="__RefHeading___Toc6099_1375447347">
+          <w:hyperlink w:anchor="__RefHeading___Toc6302_2586448665">
             <w:r>
               <w:rPr>
                 <w:webHidden/>
@@ -1294,7 +1294,7 @@
             </w:tabs>
             <w:rPr/>
           </w:pPr>
-          <w:hyperlink w:anchor="__RefHeading___Toc6101_1375447347">
+          <w:hyperlink w:anchor="__RefHeading___Toc6304_2586448665">
             <w:r>
               <w:rPr>
                 <w:webHidden/>
@@ -1315,7 +1315,7 @@
             </w:tabs>
             <w:rPr/>
           </w:pPr>
-          <w:hyperlink w:anchor="__RefHeading___Toc6103_1375447347">
+          <w:hyperlink w:anchor="__RefHeading___Toc6306_2586448665">
             <w:r>
               <w:rPr>
                 <w:webHidden/>
@@ -1336,7 +1336,7 @@
             </w:tabs>
             <w:rPr/>
           </w:pPr>
-          <w:hyperlink w:anchor="__RefHeading___Toc6105_1375447347">
+          <w:hyperlink w:anchor="__RefHeading___Toc6308_2586448665">
             <w:r>
               <w:rPr>
                 <w:webHidden/>
@@ -1357,7 +1357,7 @@
             </w:tabs>
             <w:rPr/>
           </w:pPr>
-          <w:hyperlink w:anchor="__RefHeading___Toc6107_1375447347">
+          <w:hyperlink w:anchor="__RefHeading___Toc6310_2586448665">
             <w:r>
               <w:rPr>
                 <w:webHidden/>
@@ -1378,7 +1378,7 @@
             </w:tabs>
             <w:rPr/>
           </w:pPr>
-          <w:hyperlink w:anchor="__RefHeading___Toc6109_1375447347">
+          <w:hyperlink w:anchor="__RefHeading___Toc6312_2586448665">
             <w:r>
               <w:rPr>
                 <w:webHidden/>
@@ -1399,7 +1399,7 @@
             </w:tabs>
             <w:rPr/>
           </w:pPr>
-          <w:hyperlink w:anchor="__RefHeading___Toc6111_1375447347">
+          <w:hyperlink w:anchor="__RefHeading___Toc6314_2586448665">
             <w:r>
               <w:rPr>
                 <w:webHidden/>
@@ -1420,7 +1420,7 @@
             </w:tabs>
             <w:rPr/>
           </w:pPr>
-          <w:hyperlink w:anchor="__RefHeading___Toc6113_1375447347">
+          <w:hyperlink w:anchor="__RefHeading___Toc6316_2586448665">
             <w:r>
               <w:rPr>
                 <w:webHidden/>
@@ -1441,7 +1441,7 @@
             </w:tabs>
             <w:rPr/>
           </w:pPr>
-          <w:hyperlink w:anchor="__RefHeading___Toc6115_1375447347">
+          <w:hyperlink w:anchor="__RefHeading___Toc6318_2586448665">
             <w:r>
               <w:rPr>
                 <w:webHidden/>
@@ -1462,7 +1462,7 @@
             </w:tabs>
             <w:rPr/>
           </w:pPr>
-          <w:hyperlink w:anchor="__RefHeading___Toc6117_1375447347">
+          <w:hyperlink w:anchor="__RefHeading___Toc6320_2586448665">
             <w:r>
               <w:rPr>
                 <w:webHidden/>
@@ -1483,7 +1483,7 @@
             </w:tabs>
             <w:rPr/>
           </w:pPr>
-          <w:hyperlink w:anchor="__RefHeading___Toc6119_1375447347">
+          <w:hyperlink w:anchor="__RefHeading___Toc6322_2586448665">
             <w:r>
               <w:rPr>
                 <w:webHidden/>
@@ -1504,7 +1504,7 @@
             </w:tabs>
             <w:rPr/>
           </w:pPr>
-          <w:hyperlink w:anchor="__RefHeading___Toc6121_1375447347">
+          <w:hyperlink w:anchor="__RefHeading___Toc6324_2586448665">
             <w:r>
               <w:rPr>
                 <w:webHidden/>
@@ -1525,7 +1525,7 @@
             </w:tabs>
             <w:rPr/>
           </w:pPr>
-          <w:hyperlink w:anchor="__RefHeading___Toc6123_1375447347">
+          <w:hyperlink w:anchor="__RefHeading___Toc6326_2586448665">
             <w:r>
               <w:rPr>
                 <w:webHidden/>
@@ -1546,7 +1546,7 @@
             </w:tabs>
             <w:rPr/>
           </w:pPr>
-          <w:hyperlink w:anchor="__RefHeading___Toc6125_1375447347">
+          <w:hyperlink w:anchor="__RefHeading___Toc6328_2586448665">
             <w:r>
               <w:rPr>
                 <w:webHidden/>
@@ -1567,7 +1567,7 @@
             </w:tabs>
             <w:rPr/>
           </w:pPr>
-          <w:hyperlink w:anchor="__RefHeading___Toc6127_1375447347">
+          <w:hyperlink w:anchor="__RefHeading___Toc6330_2586448665">
             <w:r>
               <w:rPr>
                 <w:webHidden/>
@@ -1588,7 +1588,7 @@
             </w:tabs>
             <w:rPr/>
           </w:pPr>
-          <w:hyperlink w:anchor="__RefHeading___Toc6129_1375447347">
+          <w:hyperlink w:anchor="__RefHeading___Toc6332_2586448665">
             <w:r>
               <w:rPr>
                 <w:webHidden/>
@@ -1609,7 +1609,7 @@
             </w:tabs>
             <w:rPr/>
           </w:pPr>
-          <w:hyperlink w:anchor="__RefHeading___Toc6131_1375447347">
+          <w:hyperlink w:anchor="__RefHeading___Toc6334_2586448665">
             <w:r>
               <w:rPr>
                 <w:webHidden/>
@@ -1630,7 +1630,7 @@
             </w:tabs>
             <w:rPr/>
           </w:pPr>
-          <w:hyperlink w:anchor="__RefHeading___Toc6133_1375447347">
+          <w:hyperlink w:anchor="__RefHeading___Toc6336_2586448665">
             <w:r>
               <w:rPr>
                 <w:webHidden/>
@@ -1651,7 +1651,7 @@
             </w:tabs>
             <w:rPr/>
           </w:pPr>
-          <w:hyperlink w:anchor="__RefHeading___Toc6135_1375447347">
+          <w:hyperlink w:anchor="__RefHeading___Toc6338_2586448665">
             <w:r>
               <w:rPr>
                 <w:webHidden/>
@@ -1672,7 +1672,7 @@
             </w:tabs>
             <w:rPr/>
           </w:pPr>
-          <w:hyperlink w:anchor="__RefHeading___Toc6137_1375447347">
+          <w:hyperlink w:anchor="__RefHeading___Toc6340_2586448665">
             <w:r>
               <w:rPr>
                 <w:webHidden/>
@@ -1693,7 +1693,7 @@
             </w:tabs>
             <w:rPr/>
           </w:pPr>
-          <w:hyperlink w:anchor="__RefHeading___Toc6139_1375447347">
+          <w:hyperlink w:anchor="__RefHeading___Toc6342_2586448665">
             <w:r>
               <w:rPr>
                 <w:webHidden/>
@@ -1714,7 +1714,7 @@
             </w:tabs>
             <w:rPr/>
           </w:pPr>
-          <w:hyperlink w:anchor="__RefHeading___Toc6141_1375447347">
+          <w:hyperlink w:anchor="__RefHeading___Toc6344_2586448665">
             <w:r>
               <w:rPr>
                 <w:webHidden/>
@@ -1735,7 +1735,7 @@
             </w:tabs>
             <w:rPr/>
           </w:pPr>
-          <w:hyperlink w:anchor="__RefHeading___Toc6143_1375447347">
+          <w:hyperlink w:anchor="__RefHeading___Toc6346_2586448665">
             <w:r>
               <w:rPr>
                 <w:webHidden/>
@@ -1756,7 +1756,7 @@
             </w:tabs>
             <w:rPr/>
           </w:pPr>
-          <w:hyperlink w:anchor="__RefHeading___Toc6145_1375447347">
+          <w:hyperlink w:anchor="__RefHeading___Toc6348_2586448665">
             <w:r>
               <w:rPr>
                 <w:webHidden/>
@@ -1777,7 +1777,7 @@
             </w:tabs>
             <w:rPr/>
           </w:pPr>
-          <w:hyperlink w:anchor="__RefHeading___Toc6147_1375447347">
+          <w:hyperlink w:anchor="__RefHeading___Toc6350_2586448665">
             <w:r>
               <w:rPr>
                 <w:webHidden/>
@@ -1798,7 +1798,7 @@
             </w:tabs>
             <w:rPr/>
           </w:pPr>
-          <w:hyperlink w:anchor="__RefHeading___Toc6149_1375447347">
+          <w:hyperlink w:anchor="__RefHeading___Toc6352_2586448665">
             <w:r>
               <w:rPr>
                 <w:webHidden/>
@@ -1819,7 +1819,7 @@
             </w:tabs>
             <w:rPr/>
           </w:pPr>
-          <w:hyperlink w:anchor="__RefHeading___Toc6151_1375447347">
+          <w:hyperlink w:anchor="__RefHeading___Toc6354_2586448665">
             <w:r>
               <w:rPr>
                 <w:webHidden/>
@@ -1840,7 +1840,7 @@
             </w:tabs>
             <w:rPr/>
           </w:pPr>
-          <w:hyperlink w:anchor="__RefHeading___Toc6153_1375447347">
+          <w:hyperlink w:anchor="__RefHeading___Toc6356_2586448665">
             <w:r>
               <w:rPr>
                 <w:webHidden/>
@@ -1861,7 +1861,7 @@
             </w:tabs>
             <w:rPr/>
           </w:pPr>
-          <w:hyperlink w:anchor="__RefHeading___Toc6155_1375447347">
+          <w:hyperlink w:anchor="__RefHeading___Toc6358_2586448665">
             <w:r>
               <w:rPr>
                 <w:webHidden/>
@@ -1882,7 +1882,7 @@
             </w:tabs>
             <w:rPr/>
           </w:pPr>
-          <w:hyperlink w:anchor="__RefHeading___Toc6157_1375447347">
+          <w:hyperlink w:anchor="__RefHeading___Toc6360_2586448665">
             <w:r>
               <w:rPr>
                 <w:webHidden/>
@@ -1903,7 +1903,7 @@
             </w:tabs>
             <w:rPr/>
           </w:pPr>
-          <w:hyperlink w:anchor="__RefHeading___Toc6159_1375447347">
+          <w:hyperlink w:anchor="__RefHeading___Toc6362_2586448665">
             <w:r>
               <w:rPr>
                 <w:webHidden/>
@@ -1924,7 +1924,7 @@
             </w:tabs>
             <w:rPr/>
           </w:pPr>
-          <w:hyperlink w:anchor="__RefHeading___Toc6161_1375447347">
+          <w:hyperlink w:anchor="__RefHeading___Toc6364_2586448665">
             <w:r>
               <w:rPr>
                 <w:webHidden/>
@@ -1945,7 +1945,7 @@
             </w:tabs>
             <w:rPr/>
           </w:pPr>
-          <w:hyperlink w:anchor="__RefHeading___Toc6163_1375447347">
+          <w:hyperlink w:anchor="__RefHeading___Toc6366_2586448665">
             <w:r>
               <w:rPr>
                 <w:webHidden/>
@@ -1966,7 +1966,7 @@
             </w:tabs>
             <w:rPr/>
           </w:pPr>
-          <w:hyperlink w:anchor="__RefHeading___Toc6165_1375447347">
+          <w:hyperlink w:anchor="__RefHeading___Toc6368_2586448665">
             <w:r>
               <w:rPr>
                 <w:webHidden/>
@@ -1987,7 +1987,7 @@
             </w:tabs>
             <w:rPr/>
           </w:pPr>
-          <w:hyperlink w:anchor="__RefHeading___Toc6167_1375447347">
+          <w:hyperlink w:anchor="__RefHeading___Toc6370_2586448665">
             <w:r>
               <w:rPr>
                 <w:webHidden/>
@@ -2008,7 +2008,7 @@
             </w:tabs>
             <w:rPr/>
           </w:pPr>
-          <w:hyperlink w:anchor="__RefHeading___Toc6169_1375447347">
+          <w:hyperlink w:anchor="__RefHeading___Toc6372_2586448665">
             <w:r>
               <w:rPr>
                 <w:webHidden/>
@@ -2029,7 +2029,7 @@
             </w:tabs>
             <w:rPr/>
           </w:pPr>
-          <w:hyperlink w:anchor="__RefHeading___Toc6171_1375447347">
+          <w:hyperlink w:anchor="__RefHeading___Toc6374_2586448665">
             <w:r>
               <w:rPr>
                 <w:webHidden/>
@@ -2050,7 +2050,7 @@
             </w:tabs>
             <w:rPr/>
           </w:pPr>
-          <w:hyperlink w:anchor="__RefHeading___Toc6173_1375447347">
+          <w:hyperlink w:anchor="__RefHeading___Toc6376_2586448665">
             <w:r>
               <w:rPr>
                 <w:webHidden/>
@@ -2071,7 +2071,7 @@
             </w:tabs>
             <w:rPr/>
           </w:pPr>
-          <w:hyperlink w:anchor="__RefHeading___Toc6175_1375447347">
+          <w:hyperlink w:anchor="__RefHeading___Toc6378_2586448665">
             <w:r>
               <w:rPr>
                 <w:webHidden/>
@@ -2092,7 +2092,7 @@
             </w:tabs>
             <w:rPr/>
           </w:pPr>
-          <w:hyperlink w:anchor="__RefHeading___Toc6177_1375447347">
+          <w:hyperlink w:anchor="__RefHeading___Toc6380_2586448665">
             <w:r>
               <w:rPr>
                 <w:webHidden/>
@@ -2113,7 +2113,7 @@
             </w:tabs>
             <w:rPr/>
           </w:pPr>
-          <w:hyperlink w:anchor="__RefHeading___Toc6179_1375447347">
+          <w:hyperlink w:anchor="__RefHeading___Toc6382_2586448665">
             <w:r>
               <w:rPr>
                 <w:webHidden/>
@@ -2134,7 +2134,7 @@
             </w:tabs>
             <w:rPr/>
           </w:pPr>
-          <w:hyperlink w:anchor="__RefHeading___Toc6181_1375447347">
+          <w:hyperlink w:anchor="__RefHeading___Toc6384_2586448665">
             <w:r>
               <w:rPr>
                 <w:webHidden/>
@@ -2155,7 +2155,7 @@
             </w:tabs>
             <w:rPr/>
           </w:pPr>
-          <w:hyperlink w:anchor="__RefHeading___Toc6183_1375447347">
+          <w:hyperlink w:anchor="__RefHeading___Toc6386_2586448665">
             <w:r>
               <w:rPr>
                 <w:webHidden/>
@@ -2176,7 +2176,7 @@
             </w:tabs>
             <w:rPr/>
           </w:pPr>
-          <w:hyperlink w:anchor="__RefHeading___Toc6185_1375447347">
+          <w:hyperlink w:anchor="__RefHeading___Toc6388_2586448665">
             <w:r>
               <w:rPr>
                 <w:webHidden/>
@@ -2197,7 +2197,7 @@
             </w:tabs>
             <w:rPr/>
           </w:pPr>
-          <w:hyperlink w:anchor="__RefHeading___Toc6187_1375447347">
+          <w:hyperlink w:anchor="__RefHeading___Toc6390_2586448665">
             <w:r>
               <w:rPr>
                 <w:webHidden/>
@@ -2218,7 +2218,7 @@
             </w:tabs>
             <w:rPr/>
           </w:pPr>
-          <w:hyperlink w:anchor="__RefHeading___Toc6189_1375447347">
+          <w:hyperlink w:anchor="__RefHeading___Toc6392_2586448665">
             <w:r>
               <w:rPr>
                 <w:webHidden/>
@@ -2239,7 +2239,7 @@
             </w:tabs>
             <w:rPr/>
           </w:pPr>
-          <w:hyperlink w:anchor="__RefHeading___Toc6191_1375447347">
+          <w:hyperlink w:anchor="__RefHeading___Toc6394_2586448665">
             <w:r>
               <w:rPr>
                 <w:webHidden/>
@@ -2260,7 +2260,7 @@
             </w:tabs>
             <w:rPr/>
           </w:pPr>
-          <w:hyperlink w:anchor="__RefHeading___Toc6193_1375447347">
+          <w:hyperlink w:anchor="__RefHeading___Toc6396_2586448665">
             <w:r>
               <w:rPr>
                 <w:webHidden/>
@@ -2281,7 +2281,7 @@
             </w:tabs>
             <w:rPr/>
           </w:pPr>
-          <w:hyperlink w:anchor="__RefHeading___Toc6195_1375447347">
+          <w:hyperlink w:anchor="__RefHeading___Toc6398_2586448665">
             <w:r>
               <w:rPr>
                 <w:webHidden/>
@@ -2302,7 +2302,7 @@
             </w:tabs>
             <w:rPr/>
           </w:pPr>
-          <w:hyperlink w:anchor="__RefHeading___Toc6197_1375447347">
+          <w:hyperlink w:anchor="__RefHeading___Toc6400_2586448665">
             <w:r>
               <w:rPr>
                 <w:webHidden/>
@@ -2323,7 +2323,7 @@
             </w:tabs>
             <w:rPr/>
           </w:pPr>
-          <w:hyperlink w:anchor="__RefHeading___Toc6199_1375447347">
+          <w:hyperlink w:anchor="__RefHeading___Toc6402_2586448665">
             <w:r>
               <w:rPr>
                 <w:webHidden/>
@@ -2344,7 +2344,7 @@
             </w:tabs>
             <w:rPr/>
           </w:pPr>
-          <w:hyperlink w:anchor="__RefHeading___Toc6201_1375447347">
+          <w:hyperlink w:anchor="__RefHeading___Toc6404_2586448665">
             <w:r>
               <w:rPr>
                 <w:webHidden/>
@@ -2365,7 +2365,7 @@
             </w:tabs>
             <w:rPr/>
           </w:pPr>
-          <w:hyperlink w:anchor="__RefHeading___Toc6203_1375447347">
+          <w:hyperlink w:anchor="__RefHeading___Toc6406_2586448665">
             <w:r>
               <w:rPr>
                 <w:webHidden/>
@@ -2386,7 +2386,7 @@
             </w:tabs>
             <w:rPr/>
           </w:pPr>
-          <w:hyperlink w:anchor="__RefHeading___Toc6205_1375447347">
+          <w:hyperlink w:anchor="__RefHeading___Toc6408_2586448665">
             <w:r>
               <w:rPr>
                 <w:webHidden/>
@@ -2407,7 +2407,7 @@
             </w:tabs>
             <w:rPr/>
           </w:pPr>
-          <w:hyperlink w:anchor="__RefHeading___Toc6207_1375447347">
+          <w:hyperlink w:anchor="__RefHeading___Toc6410_2586448665">
             <w:r>
               <w:rPr>
                 <w:webHidden/>
@@ -2428,7 +2428,7 @@
             </w:tabs>
             <w:rPr/>
           </w:pPr>
-          <w:hyperlink w:anchor="__RefHeading___Toc6209_1375447347">
+          <w:hyperlink w:anchor="__RefHeading___Toc6412_2586448665">
             <w:r>
               <w:rPr>
                 <w:webHidden/>
@@ -2449,7 +2449,7 @@
             </w:tabs>
             <w:rPr/>
           </w:pPr>
-          <w:hyperlink w:anchor="__RefHeading___Toc6211_1375447347">
+          <w:hyperlink w:anchor="__RefHeading___Toc6414_2586448665">
             <w:r>
               <w:rPr>
                 <w:webHidden/>
@@ -2470,7 +2470,7 @@
             </w:tabs>
             <w:rPr/>
           </w:pPr>
-          <w:hyperlink w:anchor="__RefHeading___Toc6213_1375447347">
+          <w:hyperlink w:anchor="__RefHeading___Toc6416_2586448665">
             <w:r>
               <w:rPr>
                 <w:webHidden/>
@@ -2491,7 +2491,7 @@
             </w:tabs>
             <w:rPr/>
           </w:pPr>
-          <w:hyperlink w:anchor="__RefHeading___Toc6215_1375447347">
+          <w:hyperlink w:anchor="__RefHeading___Toc6418_2586448665">
             <w:r>
               <w:rPr>
                 <w:webHidden/>
@@ -2512,7 +2512,7 @@
             </w:tabs>
             <w:rPr/>
           </w:pPr>
-          <w:hyperlink w:anchor="__RefHeading___Toc6217_1375447347">
+          <w:hyperlink w:anchor="__RefHeading___Toc6420_2586448665">
             <w:r>
               <w:rPr>
                 <w:webHidden/>
@@ -2533,7 +2533,7 @@
             </w:tabs>
             <w:rPr/>
           </w:pPr>
-          <w:hyperlink w:anchor="__RefHeading___Toc6219_1375447347">
+          <w:hyperlink w:anchor="__RefHeading___Toc6422_2586448665">
             <w:r>
               <w:rPr>
                 <w:webHidden/>
@@ -2554,7 +2554,7 @@
             </w:tabs>
             <w:rPr/>
           </w:pPr>
-          <w:hyperlink w:anchor="__RefHeading___Toc6221_1375447347">
+          <w:hyperlink w:anchor="__RefHeading___Toc6424_2586448665">
             <w:r>
               <w:rPr>
                 <w:webHidden/>
@@ -2575,7 +2575,7 @@
             </w:tabs>
             <w:rPr/>
           </w:pPr>
-          <w:hyperlink w:anchor="__RefHeading___Toc6223_1375447347">
+          <w:hyperlink w:anchor="__RefHeading___Toc6426_2586448665">
             <w:r>
               <w:rPr>
                 <w:webHidden/>
@@ -2596,7 +2596,7 @@
             </w:tabs>
             <w:rPr/>
           </w:pPr>
-          <w:hyperlink w:anchor="__RefHeading___Toc6225_1375447347">
+          <w:hyperlink w:anchor="__RefHeading___Toc6428_2586448665">
             <w:r>
               <w:rPr>
                 <w:webHidden/>
@@ -2617,7 +2617,7 @@
             </w:tabs>
             <w:rPr/>
           </w:pPr>
-          <w:hyperlink w:anchor="__RefHeading___Toc6227_1375447347">
+          <w:hyperlink w:anchor="__RefHeading___Toc6430_2586448665">
             <w:r>
               <w:rPr>
                 <w:webHidden/>
@@ -2638,7 +2638,7 @@
             </w:tabs>
             <w:rPr/>
           </w:pPr>
-          <w:hyperlink w:anchor="__RefHeading___Toc6229_1375447347">
+          <w:hyperlink w:anchor="__RefHeading___Toc6432_2586448665">
             <w:r>
               <w:rPr>
                 <w:webHidden/>
@@ -2659,7 +2659,7 @@
             </w:tabs>
             <w:rPr/>
           </w:pPr>
-          <w:hyperlink w:anchor="__RefHeading___Toc6231_1375447347">
+          <w:hyperlink w:anchor="__RefHeading___Toc6434_2586448665">
             <w:r>
               <w:rPr>
                 <w:webHidden/>
@@ -2680,7 +2680,7 @@
             </w:tabs>
             <w:rPr/>
           </w:pPr>
-          <w:hyperlink w:anchor="__RefHeading___Toc6233_1375447347">
+          <w:hyperlink w:anchor="__RefHeading___Toc6436_2586448665">
             <w:r>
               <w:rPr>
                 <w:webHidden/>
@@ -2701,7 +2701,7 @@
             </w:tabs>
             <w:rPr/>
           </w:pPr>
-          <w:hyperlink w:anchor="__RefHeading___Toc6235_1375447347">
+          <w:hyperlink w:anchor="__RefHeading___Toc6438_2586448665">
             <w:r>
               <w:rPr>
                 <w:webHidden/>
@@ -2722,7 +2722,7 @@
             </w:tabs>
             <w:rPr/>
           </w:pPr>
-          <w:hyperlink w:anchor="__RefHeading___Toc6237_1375447347">
+          <w:hyperlink w:anchor="__RefHeading___Toc6440_2586448665">
             <w:r>
               <w:rPr>
                 <w:webHidden/>
@@ -2743,7 +2743,7 @@
             </w:tabs>
             <w:rPr/>
           </w:pPr>
-          <w:hyperlink w:anchor="__RefHeading___Toc6239_1375447347">
+          <w:hyperlink w:anchor="__RefHeading___Toc6442_2586448665">
             <w:r>
               <w:rPr>
                 <w:webHidden/>
@@ -2764,7 +2764,7 @@
             </w:tabs>
             <w:rPr/>
           </w:pPr>
-          <w:hyperlink w:anchor="__RefHeading___Toc6241_1375447347">
+          <w:hyperlink w:anchor="__RefHeading___Toc6444_2586448665">
             <w:r>
               <w:rPr>
                 <w:webHidden/>
@@ -2785,7 +2785,7 @@
             </w:tabs>
             <w:rPr/>
           </w:pPr>
-          <w:hyperlink w:anchor="__RefHeading___Toc6243_1375447347">
+          <w:hyperlink w:anchor="__RefHeading___Toc6446_2586448665">
             <w:r>
               <w:rPr>
                 <w:webHidden/>
@@ -2806,7 +2806,7 @@
             </w:tabs>
             <w:rPr/>
           </w:pPr>
-          <w:hyperlink w:anchor="__RefHeading___Toc6245_1375447347">
+          <w:hyperlink w:anchor="__RefHeading___Toc6448_2586448665">
             <w:r>
               <w:rPr>
                 <w:webHidden/>
@@ -2827,7 +2827,7 @@
             </w:tabs>
             <w:rPr/>
           </w:pPr>
-          <w:hyperlink w:anchor="__RefHeading___Toc6247_1375447347">
+          <w:hyperlink w:anchor="__RefHeading___Toc6450_2586448665">
             <w:r>
               <w:rPr>
                 <w:webHidden/>
@@ -2848,7 +2848,7 @@
             </w:tabs>
             <w:rPr/>
           </w:pPr>
-          <w:hyperlink w:anchor="__RefHeading___Toc6249_1375447347">
+          <w:hyperlink w:anchor="__RefHeading___Toc6452_2586448665">
             <w:r>
               <w:rPr>
                 <w:webHidden/>
@@ -2869,7 +2869,7 @@
             </w:tabs>
             <w:rPr/>
           </w:pPr>
-          <w:hyperlink w:anchor="__RefHeading___Toc6251_1375447347">
+          <w:hyperlink w:anchor="__RefHeading___Toc6454_2586448665">
             <w:r>
               <w:rPr>
                 <w:webHidden/>
@@ -2890,7 +2890,7 @@
             </w:tabs>
             <w:rPr/>
           </w:pPr>
-          <w:hyperlink w:anchor="__RefHeading___Toc6253_1375447347">
+          <w:hyperlink w:anchor="__RefHeading___Toc6456_2586448665">
             <w:r>
               <w:rPr>
                 <w:webHidden/>
@@ -2911,7 +2911,7 @@
             </w:tabs>
             <w:rPr/>
           </w:pPr>
-          <w:hyperlink w:anchor="__RefHeading___Toc6255_1375447347">
+          <w:hyperlink w:anchor="__RefHeading___Toc6458_2586448665">
             <w:r>
               <w:rPr>
                 <w:webHidden/>
@@ -2932,7 +2932,7 @@
             </w:tabs>
             <w:rPr/>
           </w:pPr>
-          <w:hyperlink w:anchor="__RefHeading___Toc6257_1375447347">
+          <w:hyperlink w:anchor="__RefHeading___Toc6460_2586448665">
             <w:r>
               <w:rPr>
                 <w:webHidden/>
@@ -2953,7 +2953,7 @@
             </w:tabs>
             <w:rPr/>
           </w:pPr>
-          <w:hyperlink w:anchor="__RefHeading___Toc6259_1375447347">
+          <w:hyperlink w:anchor="__RefHeading___Toc6462_2586448665">
             <w:r>
               <w:rPr>
                 <w:webHidden/>
@@ -2974,7 +2974,7 @@
             </w:tabs>
             <w:rPr/>
           </w:pPr>
-          <w:hyperlink w:anchor="__RefHeading___Toc6261_1375447347">
+          <w:hyperlink w:anchor="__RefHeading___Toc6464_2586448665">
             <w:r>
               <w:rPr>
                 <w:webHidden/>
@@ -2995,7 +2995,7 @@
             </w:tabs>
             <w:rPr/>
           </w:pPr>
-          <w:hyperlink w:anchor="__RefHeading___Toc6263_1375447347">
+          <w:hyperlink w:anchor="__RefHeading___Toc6466_2586448665">
             <w:r>
               <w:rPr>
                 <w:webHidden/>
@@ -3016,7 +3016,7 @@
             </w:tabs>
             <w:rPr/>
           </w:pPr>
-          <w:hyperlink w:anchor="__RefHeading___Toc6265_1375447347">
+          <w:hyperlink w:anchor="__RefHeading___Toc6468_2586448665">
             <w:r>
               <w:rPr>
                 <w:webHidden/>
@@ -3037,13 +3037,13 @@
             </w:tabs>
             <w:rPr/>
           </w:pPr>
-          <w:hyperlink w:anchor="__RefHeading___Toc6267_1375447347">
+          <w:hyperlink w:anchor="__RefHeading___Toc6470_2586448665">
             <w:r>
               <w:rPr>
                 <w:webHidden/>
                 <w:rStyle w:val="IndexLink"/>
               </w:rPr>
-              <w:t>23.1 Ocelus Counter Suite</w:t>
+              <w:t>23.1 Ocelus Counter Bank</w:t>
               <w:tab/>
               <w:t>122</w:t>
             </w:r>
@@ -3058,7 +3058,7 @@
             </w:tabs>
             <w:rPr/>
           </w:pPr>
-          <w:hyperlink w:anchor="__RefHeading___Toc6269_1375447347">
+          <w:hyperlink w:anchor="__RefHeading___Toc6472_2586448665">
             <w:r>
               <w:rPr>
                 <w:webHidden/>
@@ -3079,7 +3079,7 @@
             </w:tabs>
             <w:rPr/>
           </w:pPr>
-          <w:hyperlink w:anchor="__RefHeading___Toc6271_1375447347">
+          <w:hyperlink w:anchor="__RefHeading___Toc6474_2586448665">
             <w:r>
               <w:rPr>
                 <w:webHidden/>
@@ -3100,7 +3100,7 @@
             </w:tabs>
             <w:rPr/>
           </w:pPr>
-          <w:hyperlink w:anchor="__RefHeading___Toc6273_1375447347">
+          <w:hyperlink w:anchor="__RefHeading___Toc6476_2586448665">
             <w:r>
               <w:rPr>
                 <w:webHidden/>
@@ -3121,7 +3121,7 @@
             </w:tabs>
             <w:rPr/>
           </w:pPr>
-          <w:hyperlink w:anchor="__RefHeading___Toc6275_1375447347">
+          <w:hyperlink w:anchor="__RefHeading___Toc6478_2586448665">
             <w:r>
               <w:rPr>
                 <w:webHidden/>
@@ -3142,7 +3142,7 @@
             </w:tabs>
             <w:rPr/>
           </w:pPr>
-          <w:hyperlink w:anchor="__RefHeading___Toc6277_1375447347">
+          <w:hyperlink w:anchor="__RefHeading___Toc6480_2586448665">
             <w:r>
               <w:rPr>
                 <w:webHidden/>
@@ -3150,7 +3150,7 @@
               </w:rPr>
               <w:t>24.2 Formal Assists</w:t>
               <w:tab/>
-              <w:t>127</w:t>
+              <w:t>128</w:t>
             </w:r>
           </w:hyperlink>
         </w:p>
@@ -3163,7 +3163,7 @@
             </w:tabs>
             <w:rPr/>
           </w:pPr>
-          <w:hyperlink w:anchor="__RefHeading___Toc6279_1375447347">
+          <w:hyperlink w:anchor="__RefHeading___Toc6482_2586448665">
             <w:r>
               <w:rPr>
                 <w:webHidden/>
@@ -3171,7 +3171,7 @@
               </w:rPr>
               <w:t>24.3 Performance Model Calibration</w:t>
               <w:tab/>
-              <w:t>128</w:t>
+              <w:t>129</w:t>
             </w:r>
           </w:hyperlink>
         </w:p>
@@ -3184,7 +3184,7 @@
             </w:tabs>
             <w:rPr/>
           </w:pPr>
-          <w:hyperlink w:anchor="__RefHeading___Toc6281_1375447347">
+          <w:hyperlink w:anchor="__RefHeading___Toc6484_2586448665">
             <w:r>
               <w:rPr>
                 <w:webHidden/>
@@ -3192,7 +3192,7 @@
               </w:rPr>
               <w:t>24.4 References</w:t>
               <w:tab/>
-              <w:t>129</w:t>
+              <w:t>130</w:t>
             </w:r>
           </w:hyperlink>
           <w:r>
@@ -4298,14 +4298,14 @@
         <w:spacing w:before="0" w:after="0"/>
         <w:rPr/>
       </w:pPr>
-      <w:hyperlink w:anchor="_Tab_17_Ocelus_counter_suite">
+      <w:hyperlink w:anchor="_Tab_17_Ocelus_counter_bank_">
         <w:r>
           <w:rPr>
             <w:rStyle w:val="ListLabel1"/>
             <w:color w:val="000000"/>
             <w:sz w:val="24"/>
           </w:rPr>
-          <w:t>Table 17: Ocelus counter suite</w:t>
+          <w:t>Table 17: Ocelus counter bank indices.</w:t>
         </w:r>
         <w:r>
           <w:rPr>
@@ -4323,7 +4323,7 @@
           <w:rPr>
             <w:rStyle w:val="ListLabel1"/>
           </w:rPr>
-          <w:instrText xml:space="preserve"> PAGEREF _Tab_17_Ocelus_counter_suite \h </w:instrText>
+          <w:instrText xml:space="preserve"> PAGEREF _Tab_17_Ocelus_counter_bank_ \h </w:instrText>
         </w:r>
         <w:r>
           <w:rPr>
@@ -4478,7 +4478,7 @@
         <w:spacing w:before="0" w:after="120"/>
         <w:rPr/>
       </w:pPr>
-      <w:bookmarkStart w:id="2" w:name="__RefHeading___Toc5993_1375447347"/>
+      <w:bookmarkStart w:id="2" w:name="__RefHeading___Toc6196_2586448665"/>
       <w:bookmarkEnd w:id="2"/>
       <w:r>
         <w:rPr>
@@ -4516,7 +4516,7 @@
         <w:rPr>
           <w:sz w:val="20"/>
         </w:rPr>
-        <w:t xml:space="preserve"> 2026-10-14</w:t>
+        <w:t xml:space="preserve"> 2026-10-16</w:t>
       </w:r>
     </w:p>
     <w:p>
@@ -4616,7 +4616,7 @@
         <w:spacing w:before="360" w:after="120"/>
         <w:rPr/>
       </w:pPr>
-      <w:bookmarkStart w:id="4" w:name="__RefHeading___Toc5995_1375447347"/>
+      <w:bookmarkStart w:id="4" w:name="__RefHeading___Toc6198_2586448665"/>
       <w:bookmarkStart w:id="5" w:name="document-information"/>
       <w:bookmarkEnd w:id="4"/>
       <w:r>
@@ -4648,7 +4648,7 @@
         <w:spacing w:before="280" w:after="80"/>
         <w:rPr/>
       </w:pPr>
-      <w:bookmarkStart w:id="6" w:name="__RefHeading___Toc5997_1375447347"/>
+      <w:bookmarkStart w:id="6" w:name="__RefHeading___Toc6200_2586448665"/>
       <w:bookmarkEnd w:id="6"/>
       <w:r>
         <w:rPr>
@@ -5117,7 +5117,7 @@
       <w:r>
         <w:br w:type="page"/>
       </w:r>
-      <w:bookmarkStart w:id="9" w:name="__RefHeading___Toc5999_1375447347"/>
+      <w:bookmarkStart w:id="9" w:name="__RefHeading___Toc6202_2586448665"/>
       <w:bookmarkEnd w:id="9"/>
       <w:r>
         <w:rPr>
@@ -5747,7 +5747,7 @@
       <w:r>
         <w:br w:type="page"/>
       </w:r>
-      <w:bookmarkStart w:id="11" w:name="__RefHeading___Toc6001_1375447347"/>
+      <w:bookmarkStart w:id="11" w:name="__RefHeading___Toc6204_2586448665"/>
       <w:bookmarkEnd w:id="11"/>
       <w:r>
         <w:rPr>
@@ -5888,7 +5888,7 @@
         <w:spacing w:before="280" w:after="80"/>
         <w:rPr/>
       </w:pPr>
-      <w:bookmarkStart w:id="12" w:name="__RefHeading___Toc6003_1375447347"/>
+      <w:bookmarkStart w:id="12" w:name="__RefHeading___Toc6206_2586448665"/>
       <w:bookmarkStart w:id="13" w:name="intended-audience"/>
       <w:bookmarkEnd w:id="12"/>
       <w:r>
@@ -5980,7 +5980,7 @@
         <w:spacing w:before="280" w:after="80"/>
         <w:rPr/>
       </w:pPr>
-      <w:bookmarkStart w:id="15" w:name="__RefHeading___Toc6005_1375447347"/>
+      <w:bookmarkStart w:id="15" w:name="__RefHeading___Toc6208_2586448665"/>
       <w:bookmarkStart w:id="16" w:name="related-documents"/>
       <w:bookmarkEnd w:id="15"/>
       <w:r>
@@ -6185,7 +6185,7 @@
         <w:spacing w:before="360" w:after="120"/>
         <w:rPr/>
       </w:pPr>
-      <w:bookmarkStart w:id="19" w:name="__RefHeading___Toc6007_1375447347"/>
+      <w:bookmarkStart w:id="19" w:name="__RefHeading___Toc6210_2586448665"/>
       <w:bookmarkStart w:id="20" w:name="overview"/>
       <w:bookmarkEnd w:id="19"/>
       <w:r>
@@ -6217,7 +6217,7 @@
         <w:spacing w:before="280" w:after="80"/>
         <w:rPr/>
       </w:pPr>
-      <w:bookmarkStart w:id="21" w:name="__RefHeading___Toc6009_1375447347"/>
+      <w:bookmarkStart w:id="21" w:name="__RefHeading___Toc6212_2586448665"/>
       <w:bookmarkStart w:id="22" w:name="what-this-document-describes"/>
       <w:bookmarkEnd w:id="21"/>
       <w:r>
@@ -6277,7 +6277,7 @@
         <w:spacing w:before="280" w:after="80"/>
         <w:rPr/>
       </w:pPr>
-      <w:bookmarkStart w:id="23" w:name="__RefHeading___Toc6011_1375447347"/>
+      <w:bookmarkStart w:id="23" w:name="__RefHeading___Toc6214_2586448665"/>
       <w:bookmarkStart w:id="24" w:name="generated-module-structure"/>
       <w:bookmarkEnd w:id="23"/>
       <w:r>
@@ -6546,7 +6546,7 @@
         <w:spacing w:before="280" w:after="80"/>
         <w:rPr/>
       </w:pPr>
-      <w:bookmarkStart w:id="25" w:name="__RefHeading___Toc6013_1375447347"/>
+      <w:bookmarkStart w:id="25" w:name="__RefHeading___Toc6216_2586448665"/>
       <w:bookmarkEnd w:id="25"/>
       <w:r>
         <w:rPr>
@@ -7015,7 +7015,7 @@
       <w:r>
         <w:br w:type="page"/>
       </w:r>
-      <w:bookmarkStart w:id="28" w:name="__RefHeading___Toc6015_1375447347"/>
+      <w:bookmarkStart w:id="28" w:name="__RefHeading___Toc6218_2586448665"/>
       <w:bookmarkEnd w:id="28"/>
       <w:r>
         <w:rPr>
@@ -7042,7 +7042,7 @@
         <w:spacing w:before="200" w:after="80"/>
         <w:rPr/>
       </w:pPr>
-      <w:bookmarkStart w:id="29" w:name="__RefHeading___Toc6017_1375447347"/>
+      <w:bookmarkStart w:id="29" w:name="__RefHeading___Toc6220_2586448665"/>
       <w:bookmarkStart w:id="30" w:name="Xc8060edcec46191b26a9aac0a4c6547a4343670"/>
       <w:bookmarkStart w:id="31" w:name="_Fig_1_Delta_Micro_Architec"/>
       <w:bookmarkEnd w:id="29"/>
@@ -7251,7 +7251,7 @@
         <w:spacing w:before="280" w:after="80"/>
         <w:rPr/>
       </w:pPr>
-      <w:bookmarkStart w:id="32" w:name="__RefHeading___Toc6019_1375447347"/>
+      <w:bookmarkStart w:id="32" w:name="__RefHeading___Toc6222_2586448665"/>
       <w:bookmarkStart w:id="33" w:name="reference-rtl"/>
       <w:bookmarkEnd w:id="32"/>
       <w:r>
@@ -7424,7 +7424,7 @@
         <w:spacing w:before="360" w:after="120"/>
         <w:rPr/>
       </w:pPr>
-      <w:bookmarkStart w:id="36" w:name="__RefHeading___Toc6021_1375447347"/>
+      <w:bookmarkStart w:id="36" w:name="__RefHeading___Toc6224_2586448665"/>
       <w:bookmarkStart w:id="37" w:name="request-decode"/>
       <w:bookmarkEnd w:id="36"/>
       <w:r>
@@ -7456,7 +7456,7 @@
         <w:spacing w:before="280" w:after="80"/>
         <w:rPr/>
       </w:pPr>
-      <w:bookmarkStart w:id="38" w:name="__RefHeading___Toc6023_1375447347"/>
+      <w:bookmarkStart w:id="38" w:name="__RefHeading___Toc6226_2586448665"/>
       <w:bookmarkStart w:id="39" w:name="purpose"/>
       <w:bookmarkEnd w:id="38"/>
       <w:r>
@@ -7568,7 +7568,7 @@
         <w:spacing w:before="280" w:after="80"/>
         <w:rPr/>
       </w:pPr>
-      <w:bookmarkStart w:id="40" w:name="__RefHeading___Toc6025_1375447347"/>
+      <w:bookmarkStart w:id="40" w:name="__RefHeading___Toc6228_2586448665"/>
       <w:bookmarkStart w:id="41" w:name="implementation"/>
       <w:bookmarkEnd w:id="40"/>
       <w:r>
@@ -8020,7 +8020,7 @@
         <w:spacing w:before="280" w:after="80"/>
         <w:rPr/>
       </w:pPr>
-      <w:bookmarkStart w:id="42" w:name="__RefHeading___Toc6027_1375447347"/>
+      <w:bookmarkStart w:id="42" w:name="__RefHeading___Toc6230_2586448665"/>
       <w:bookmarkStart w:id="43" w:name="tdest-range-check"/>
       <w:bookmarkEnd w:id="42"/>
       <w:r>
@@ -8106,7 +8106,7 @@
         <w:spacing w:before="280" w:after="80"/>
         <w:rPr/>
       </w:pPr>
-      <w:bookmarkStart w:id="44" w:name="__RefHeading___Toc6029_1375447347"/>
+      <w:bookmarkStart w:id="44" w:name="__RefHeading___Toc6232_2586448665"/>
       <w:bookmarkStart w:id="45" w:name="relationship-to-arbitration"/>
       <w:bookmarkEnd w:id="44"/>
       <w:r>
@@ -8154,7 +8154,7 @@
         <w:spacing w:before="280" w:after="80"/>
         <w:rPr/>
       </w:pPr>
-      <w:bookmarkStart w:id="47" w:name="__RefHeading___Toc6031_1375447347"/>
+      <w:bookmarkStart w:id="47" w:name="__RefHeading___Toc6234_2586448665"/>
       <w:bookmarkStart w:id="48" w:name="notes"/>
       <w:bookmarkEnd w:id="47"/>
       <w:r>
@@ -8353,7 +8353,7 @@
         <w:spacing w:before="360" w:after="120"/>
         <w:rPr/>
       </w:pPr>
-      <w:bookmarkStart w:id="51" w:name="__RefHeading___Toc6033_1375447347"/>
+      <w:bookmarkStart w:id="51" w:name="__RefHeading___Toc6236_2586448665"/>
       <w:bookmarkStart w:id="52" w:name="per-slave-round-robin-arbiter"/>
       <w:bookmarkEnd w:id="51"/>
       <w:r>
@@ -8385,7 +8385,7 @@
         <w:spacing w:before="280" w:after="80"/>
         <w:rPr/>
       </w:pPr>
-      <w:bookmarkStart w:id="53" w:name="__RefHeading___Toc6035_1375447347"/>
+      <w:bookmarkStart w:id="53" w:name="__RefHeading___Toc6238_2586448665"/>
       <w:bookmarkEnd w:id="53"/>
       <w:r>
         <w:rPr>
@@ -8899,7 +8899,7 @@
       <w:r>
         <w:br w:type="page"/>
       </w:r>
-      <w:bookmarkStart w:id="56" w:name="__RefHeading___Toc6037_1375447347"/>
+      <w:bookmarkStart w:id="56" w:name="__RefHeading___Toc6240_2586448665"/>
       <w:bookmarkEnd w:id="56"/>
       <w:r>
         <w:rPr>
@@ -8938,7 +8938,7 @@
         <w:spacing w:before="200" w:after="80"/>
         <w:rPr/>
       </w:pPr>
-      <w:bookmarkStart w:id="57" w:name="__RefHeading___Toc6039_1375447347"/>
+      <w:bookmarkStart w:id="57" w:name="__RefHeading___Toc6242_2586448665"/>
       <w:bookmarkStart w:id="58" w:name="idle-state-packet_actives-0"/>
       <w:bookmarkEnd w:id="57"/>
       <w:r>
@@ -9090,7 +9090,7 @@
         <w:spacing w:before="200" w:after="80"/>
         <w:rPr/>
       </w:pPr>
-      <w:bookmarkStart w:id="59" w:name="__RefHeading___Toc6041_1375447347"/>
+      <w:bookmarkStart w:id="59" w:name="__RefHeading___Toc6244_2586448665"/>
       <w:bookmarkStart w:id="60" w:name="active-state-packet_actives-1"/>
       <w:bookmarkEnd w:id="59"/>
       <w:r>
@@ -9224,7 +9224,7 @@
         <w:spacing w:before="280" w:after="80"/>
         <w:rPr/>
       </w:pPr>
-      <w:bookmarkStart w:id="61" w:name="__RefHeading___Toc6043_1375447347"/>
+      <w:bookmarkStart w:id="61" w:name="__RefHeading___Toc6246_2586448665"/>
       <w:bookmarkStart w:id="62" w:name="round-robin-pseudocode"/>
       <w:bookmarkEnd w:id="61"/>
       <w:r>
@@ -9933,7 +9933,7 @@
         <w:spacing w:before="280" w:after="80"/>
         <w:rPr/>
       </w:pPr>
-      <w:bookmarkStart w:id="63" w:name="__RefHeading___Toc6045_1375447347"/>
+      <w:bookmarkStart w:id="63" w:name="__RefHeading___Toc6248_2586448665"/>
       <w:bookmarkStart w:id="64" w:name="fairness"/>
       <w:bookmarkEnd w:id="63"/>
       <w:r>
@@ -9981,7 +9981,7 @@
         <w:spacing w:before="280" w:after="80"/>
         <w:rPr/>
       </w:pPr>
-      <w:bookmarkStart w:id="66" w:name="__RefHeading___Toc6047_1375447347"/>
+      <w:bookmarkStart w:id="66" w:name="__RefHeading___Toc6250_2586448665"/>
       <w:bookmarkStart w:id="67" w:name="reset-behavior"/>
       <w:bookmarkEnd w:id="66"/>
       <w:r>
@@ -10162,7 +10162,7 @@
         <w:spacing w:before="360" w:after="120"/>
         <w:rPr/>
       </w:pPr>
-      <w:bookmarkStart w:id="70" w:name="__RefHeading___Toc6049_1375447347"/>
+      <w:bookmarkStart w:id="70" w:name="__RefHeading___Toc6252_2586448665"/>
       <w:bookmarkStart w:id="71" w:name="crossbar-multiplexer"/>
       <w:bookmarkEnd w:id="70"/>
       <w:r>
@@ -10194,7 +10194,7 @@
         <w:spacing w:before="280" w:after="80"/>
         <w:rPr/>
       </w:pPr>
-      <w:bookmarkStart w:id="72" w:name="__RefHeading___Toc6051_1375447347"/>
+      <w:bookmarkStart w:id="72" w:name="__RefHeading___Toc6254_2586448665"/>
       <w:bookmarkStart w:id="73" w:name="purpose-1"/>
       <w:bookmarkEnd w:id="72"/>
       <w:r>
@@ -10242,7 +10242,7 @@
         <w:spacing w:before="280" w:after="80"/>
         <w:rPr/>
       </w:pPr>
-      <w:bookmarkStart w:id="75" w:name="__RefHeading___Toc6053_1375447347"/>
+      <w:bookmarkStart w:id="75" w:name="__RefHeading___Toc6256_2586448665"/>
       <w:bookmarkStart w:id="76" w:name="implementation-1"/>
       <w:bookmarkEnd w:id="75"/>
       <w:r>
@@ -10932,7 +10932,7 @@
         <w:spacing w:before="280" w:after="80"/>
         <w:rPr/>
       </w:pPr>
-      <w:bookmarkStart w:id="77" w:name="__RefHeading___Toc6055_1375447347"/>
+      <w:bookmarkStart w:id="77" w:name="__RefHeading___Toc6258_2586448665"/>
       <w:bookmarkStart w:id="78" w:name="signal-selection"/>
       <w:bookmarkEnd w:id="77"/>
       <w:r>
@@ -11179,7 +11179,7 @@
         <w:spacing w:before="280" w:after="80"/>
         <w:rPr/>
       </w:pPr>
-      <w:bookmarkStart w:id="79" w:name="__RefHeading___Toc6057_1375447347"/>
+      <w:bookmarkStart w:id="79" w:name="__RefHeading___Toc6260_2586448665"/>
       <w:bookmarkStart w:id="80" w:name="default-values"/>
       <w:bookmarkEnd w:id="79"/>
       <w:r>
@@ -11252,7 +11252,7 @@
         <w:spacing w:before="280" w:after="80"/>
         <w:rPr/>
       </w:pPr>
-      <w:bookmarkStart w:id="81" w:name="__RefHeading___Toc6059_1375447347"/>
+      <w:bookmarkStart w:id="81" w:name="__RefHeading___Toc6262_2586448665"/>
       <w:bookmarkStart w:id="82" w:name="timing"/>
       <w:bookmarkEnd w:id="81"/>
       <w:r>
@@ -11385,7 +11385,7 @@
         <w:spacing w:before="360" w:after="120"/>
         <w:rPr/>
       </w:pPr>
-      <w:bookmarkStart w:id="85" w:name="__RefHeading___Toc6061_1375447347"/>
+      <w:bookmarkStart w:id="85" w:name="__RefHeading___Toc6264_2586448665"/>
       <w:bookmarkStart w:id="86" w:name="tready-steering"/>
       <w:bookmarkEnd w:id="85"/>
       <w:r>
@@ -11417,7 +11417,7 @@
         <w:spacing w:before="280" w:after="80"/>
         <w:rPr/>
       </w:pPr>
-      <w:bookmarkStart w:id="87" w:name="__RefHeading___Toc6063_1375447347"/>
+      <w:bookmarkStart w:id="87" w:name="__RefHeading___Toc6266_2586448665"/>
       <w:bookmarkStart w:id="88" w:name="purpose-2"/>
       <w:bookmarkEnd w:id="87"/>
       <w:r>
@@ -11490,7 +11490,7 @@
         <w:spacing w:before="280" w:after="80"/>
         <w:rPr/>
       </w:pPr>
-      <w:bookmarkStart w:id="89" w:name="__RefHeading___Toc6065_1375447347"/>
+      <w:bookmarkStart w:id="89" w:name="__RefHeading___Toc6268_2586448665"/>
       <w:bookmarkStart w:id="90" w:name="implementation-2"/>
       <w:bookmarkEnd w:id="89"/>
       <w:r>
@@ -11875,7 +11875,7 @@
         <w:spacing w:before="280" w:after="80"/>
         <w:rPr/>
       </w:pPr>
-      <w:bookmarkStart w:id="91" w:name="__RefHeading___Toc6067_1375447347"/>
+      <w:bookmarkStart w:id="91" w:name="__RefHeading___Toc6270_2586448665"/>
       <w:bookmarkStart w:id="92" w:name="behavior"/>
       <w:bookmarkEnd w:id="91"/>
       <w:r>
@@ -11963,7 +11963,7 @@
         <w:spacing w:before="280" w:after="80"/>
         <w:rPr/>
       </w:pPr>
-      <w:bookmarkStart w:id="94" w:name="__RefHeading___Toc6069_1375447347"/>
+      <w:bookmarkStart w:id="94" w:name="__RefHeading___Toc6272_2586448665"/>
       <w:bookmarkStart w:id="95" w:name="deadlock-avoidance"/>
       <w:bookmarkEnd w:id="94"/>
       <w:r>
@@ -12154,7 +12154,7 @@
         <w:spacing w:before="360" w:after="120"/>
         <w:rPr/>
       </w:pPr>
-      <w:bookmarkStart w:id="98" w:name="__RefHeading___Toc6071_1375447347"/>
+      <w:bookmarkStart w:id="98" w:name="__RefHeading___Toc6274_2586448665"/>
       <w:bookmarkStart w:id="99" w:name="twakeup-steering-amba5"/>
       <w:bookmarkEnd w:id="98"/>
       <w:r>
@@ -12186,7 +12186,7 @@
         <w:spacing w:before="280" w:after="80"/>
         <w:rPr/>
       </w:pPr>
-      <w:bookmarkStart w:id="100" w:name="__RefHeading___Toc6073_1375447347"/>
+      <w:bookmarkStart w:id="100" w:name="__RefHeading___Toc6276_2586448665"/>
       <w:bookmarkStart w:id="101" w:name="purpose-3"/>
       <w:bookmarkEnd w:id="100"/>
       <w:r>
@@ -12298,7 +12298,7 @@
         <w:spacing w:before="280" w:after="80"/>
         <w:rPr/>
       </w:pPr>
-      <w:bookmarkStart w:id="102" w:name="__RefHeading___Toc6075_1375447347"/>
+      <w:bookmarkStart w:id="102" w:name="__RefHeading___Toc6278_2586448665"/>
       <w:bookmarkStart w:id="103" w:name="implementation-3"/>
       <w:bookmarkEnd w:id="102"/>
       <w:r>
@@ -12721,7 +12721,7 @@
         <w:spacing w:before="280" w:after="80"/>
         <w:rPr/>
       </w:pPr>
-      <w:bookmarkStart w:id="104" w:name="__RefHeading___Toc6077_1375447347"/>
+      <w:bookmarkStart w:id="104" w:name="__RefHeading___Toc6280_2586448665"/>
       <w:bookmarkStart w:id="105" w:name="semantics"/>
       <w:bookmarkEnd w:id="104"/>
       <w:r>
@@ -12875,7 +12875,7 @@
         <w:spacing w:before="280" w:after="80"/>
         <w:rPr/>
       </w:pPr>
-      <w:bookmarkStart w:id="107" w:name="__RefHeading___Toc6079_1375447347"/>
+      <w:bookmarkStart w:id="107" w:name="__RefHeading___Toc6282_2586448665"/>
       <w:bookmarkStart w:id="108" w:name="integration-notes"/>
       <w:bookmarkEnd w:id="107"/>
       <w:r>
@@ -13096,7 +13096,7 @@
         <w:spacing w:before="360" w:after="120"/>
         <w:rPr/>
       </w:pPr>
-      <w:bookmarkStart w:id="111" w:name="__RefHeading___Toc6081_1375447347"/>
+      <w:bookmarkStart w:id="111" w:name="__RefHeading___Toc6284_2586448665"/>
       <w:bookmarkStart w:id="112" w:name="interface-check-signals-amba5"/>
       <w:bookmarkEnd w:id="111"/>
       <w:r>
@@ -13128,7 +13128,7 @@
         <w:spacing w:before="280" w:after="80"/>
         <w:rPr/>
       </w:pPr>
-      <w:bookmarkStart w:id="113" w:name="__RefHeading___Toc6083_1375447347"/>
+      <w:bookmarkStart w:id="113" w:name="__RefHeading___Toc6286_2586448665"/>
       <w:bookmarkStart w:id="114" w:name="purpose-4"/>
       <w:bookmarkEnd w:id="113"/>
       <w:r>
@@ -13240,7 +13240,7 @@
         <w:spacing w:before="280" w:after="80"/>
         <w:rPr/>
       </w:pPr>
-      <w:bookmarkStart w:id="115" w:name="__RefHeading___Toc6085_1375447347"/>
+      <w:bookmarkStart w:id="115" w:name="__RefHeading___Toc6288_2586448665"/>
       <w:bookmarkStart w:id="116" w:name="parity-rule"/>
       <w:bookmarkEnd w:id="115"/>
       <w:r>
@@ -13404,7 +13404,7 @@
         <w:spacing w:before="280" w:after="80"/>
         <w:rPr/>
       </w:pPr>
-      <w:bookmarkStart w:id="117" w:name="__RefHeading___Toc6087_1375447347"/>
+      <w:bookmarkStart w:id="117" w:name="__RefHeading___Toc6290_2586448665"/>
       <w:bookmarkStart w:id="118" w:name="implementation-4"/>
       <w:bookmarkEnd w:id="117"/>
       <w:r>
@@ -14154,7 +14154,7 @@
         <w:spacing w:before="280" w:after="80"/>
         <w:rPr/>
       </w:pPr>
-      <w:bookmarkStart w:id="119" w:name="__RefHeading___Toc6089_1375447347"/>
+      <w:bookmarkStart w:id="119" w:name="__RefHeading___Toc6292_2586448665"/>
       <w:bookmarkStart w:id="120" w:name="design-notes"/>
       <w:bookmarkEnd w:id="119"/>
       <w:r>
@@ -14237,7 +14237,7 @@
         <w:spacing w:before="280" w:after="80"/>
         <w:rPr/>
       </w:pPr>
-      <w:bookmarkStart w:id="121" w:name="__RefHeading___Toc6091_1375447347"/>
+      <w:bookmarkStart w:id="121" w:name="__RefHeading___Toc6294_2586448665"/>
       <w:bookmarkStart w:id="122" w:name="verification"/>
       <w:bookmarkEnd w:id="121"/>
       <w:r>
@@ -14403,7 +14403,7 @@
         <w:spacing w:before="360" w:after="120"/>
         <w:rPr/>
       </w:pPr>
-      <w:bookmarkStart w:id="125" w:name="__RefHeading___Toc6093_1375447347"/>
+      <w:bookmarkStart w:id="125" w:name="__RefHeading___Toc6296_2586448665"/>
       <w:bookmarkStart w:id="126" w:name="packet-counters"/>
       <w:bookmarkEnd w:id="125"/>
       <w:r>
@@ -14435,7 +14435,7 @@
         <w:spacing w:before="280" w:after="80"/>
         <w:rPr/>
       </w:pPr>
-      <w:bookmarkStart w:id="127" w:name="__RefHeading___Toc6095_1375447347"/>
+      <w:bookmarkStart w:id="127" w:name="__RefHeading___Toc6298_2586448665"/>
       <w:bookmarkStart w:id="128" w:name="purpose-5"/>
       <w:bookmarkEnd w:id="127"/>
       <w:r>
@@ -14495,7 +14495,7 @@
         <w:spacing w:before="280" w:after="80"/>
         <w:rPr/>
       </w:pPr>
-      <w:bookmarkStart w:id="129" w:name="__RefHeading___Toc6097_1375447347"/>
+      <w:bookmarkStart w:id="129" w:name="__RefHeading___Toc6300_2586448665"/>
       <w:bookmarkStart w:id="130" w:name="implementation-5"/>
       <w:bookmarkEnd w:id="129"/>
       <w:r>
@@ -15262,7 +15262,7 @@
         <w:spacing w:before="280" w:after="80"/>
         <w:rPr/>
       </w:pPr>
-      <w:bookmarkStart w:id="131" w:name="__RefHeading___Toc6099_1375447347"/>
+      <w:bookmarkStart w:id="131" w:name="__RefHeading___Toc6302_2586448665"/>
       <w:bookmarkStart w:id="132" w:name="behavior-1"/>
       <w:bookmarkEnd w:id="131"/>
       <w:r>
@@ -15354,7 +15354,7 @@
         <w:spacing w:before="280" w:after="80"/>
         <w:rPr/>
       </w:pPr>
-      <w:bookmarkStart w:id="134" w:name="__RefHeading___Toc6101_1375447347"/>
+      <w:bookmarkStart w:id="134" w:name="__RefHeading___Toc6304_2586448665"/>
       <w:bookmarkStart w:id="135" w:name="disabling-counters"/>
       <w:bookmarkEnd w:id="134"/>
       <w:r>
@@ -15606,7 +15606,7 @@
         <w:spacing w:before="360" w:after="120"/>
         <w:rPr/>
       </w:pPr>
-      <w:bookmarkStart w:id="138" w:name="__RefHeading___Toc6103_1375447347"/>
+      <w:bookmarkStart w:id="138" w:name="__RefHeading___Toc6306_2586448665"/>
       <w:bookmarkStart w:id="139" w:name="assertions"/>
       <w:bookmarkEnd w:id="138"/>
       <w:r>
@@ -15638,7 +15638,7 @@
         <w:spacing w:before="280" w:after="80"/>
         <w:rPr/>
       </w:pPr>
-      <w:bookmarkStart w:id="140" w:name="__RefHeading___Toc6105_1375447347"/>
+      <w:bookmarkStart w:id="140" w:name="__RefHeading___Toc6308_2586448665"/>
       <w:bookmarkStart w:id="141" w:name="overview-1"/>
       <w:bookmarkEnd w:id="140"/>
       <w:r>
@@ -15698,7 +15698,7 @@
         <w:spacing w:before="280" w:after="80"/>
         <w:rPr/>
       </w:pPr>
-      <w:bookmarkStart w:id="142" w:name="__RefHeading___Toc6107_1375447347"/>
+      <w:bookmarkStart w:id="142" w:name="__RefHeading___Toc6310_2586448665"/>
       <w:bookmarkStart w:id="143" w:name="one-hot-grant-check"/>
       <w:bookmarkEnd w:id="142"/>
       <w:r>
@@ -15922,7 +15922,7 @@
         <w:spacing w:before="280" w:after="80"/>
         <w:rPr/>
       </w:pPr>
-      <w:bookmarkStart w:id="144" w:name="__RefHeading___Toc6109_1375447347"/>
+      <w:bookmarkStart w:id="144" w:name="__RefHeading___Toc6312_2586448665"/>
       <w:bookmarkStart w:id="145" w:name="tdest-range-check-1"/>
       <w:bookmarkEnd w:id="144"/>
       <w:r>
@@ -16104,7 +16104,7 @@
         <w:spacing w:before="280" w:after="80"/>
         <w:rPr/>
       </w:pPr>
-      <w:bookmarkStart w:id="146" w:name="__RefHeading___Toc6111_1375447347"/>
+      <w:bookmarkStart w:id="146" w:name="__RefHeading___Toc6314_2586448665"/>
       <w:bookmarkStart w:id="147" w:name="enabling-assertions"/>
       <w:bookmarkEnd w:id="146"/>
       <w:r>
@@ -16206,7 +16206,7 @@
         <w:spacing w:before="280" w:after="80"/>
         <w:rPr/>
       </w:pPr>
-      <w:bookmarkStart w:id="148" w:name="__RefHeading___Toc6113_1375447347"/>
+      <w:bookmarkStart w:id="148" w:name="__RefHeading___Toc6316_2586448665"/>
       <w:bookmarkStart w:id="149" w:name="notes-1"/>
       <w:bookmarkEnd w:id="148"/>
       <w:r>
@@ -16369,7 +16369,7 @@
         <w:spacing w:before="360" w:after="120"/>
         <w:rPr/>
       </w:pPr>
-      <w:bookmarkStart w:id="152" w:name="__RefHeading___Toc6115_1375447347"/>
+      <w:bookmarkStart w:id="152" w:name="__RefHeading___Toc6318_2586448665"/>
       <w:bookmarkStart w:id="153" w:name="multi-master-contention"/>
       <w:bookmarkEnd w:id="152"/>
       <w:r>
@@ -16401,7 +16401,7 @@
         <w:spacing w:before="280" w:after="80"/>
         <w:rPr/>
       </w:pPr>
-      <w:bookmarkStart w:id="154" w:name="__RefHeading___Toc6117_1375447347"/>
+      <w:bookmarkStart w:id="154" w:name="__RefHeading___Toc6320_2586448665"/>
       <w:bookmarkStart w:id="155" w:name="scenario"/>
       <w:bookmarkEnd w:id="154"/>
       <w:r>
@@ -16449,7 +16449,7 @@
         <w:spacing w:before="280" w:after="80"/>
         <w:rPr/>
       </w:pPr>
-      <w:bookmarkStart w:id="157" w:name="__RefHeading___Toc6119_1375447347"/>
+      <w:bookmarkStart w:id="157" w:name="__RefHeading___Toc6322_2586448665"/>
       <w:bookmarkEnd w:id="157"/>
       <w:r>
         <w:rPr>
@@ -17903,7 +17903,7 @@
       <w:r>
         <w:br w:type="page"/>
       </w:r>
-      <w:bookmarkStart w:id="160" w:name="__RefHeading___Toc6121_1375447347"/>
+      <w:bookmarkStart w:id="160" w:name="__RefHeading___Toc6324_2586448665"/>
       <w:bookmarkEnd w:id="160"/>
       <w:r>
         <w:rPr>
@@ -18002,7 +18002,7 @@
         <w:spacing w:before="280" w:after="80"/>
         <w:rPr/>
       </w:pPr>
-      <w:bookmarkStart w:id="161" w:name="__RefHeading___Toc6123_1375447347"/>
+      <w:bookmarkStart w:id="161" w:name="__RefHeading___Toc6326_2586448665"/>
       <w:bookmarkStart w:id="162" w:name="same-cycle-release-and-re-arbitration"/>
       <w:bookmarkEnd w:id="161"/>
       <w:r>
@@ -18148,7 +18148,7 @@
         <w:spacing w:before="360" w:after="120"/>
         <w:rPr/>
       </w:pPr>
-      <w:bookmarkStart w:id="165" w:name="__RefHeading___Toc6125_1375447347"/>
+      <w:bookmarkStart w:id="165" w:name="__RefHeading___Toc6328_2586448665"/>
       <w:bookmarkStart w:id="166" w:name="packet-interleave-prevention"/>
       <w:bookmarkEnd w:id="165"/>
       <w:r>
@@ -18180,7 +18180,7 @@
         <w:spacing w:before="280" w:after="80"/>
         <w:rPr/>
       </w:pPr>
-      <w:bookmarkStart w:id="167" w:name="__RefHeading___Toc6127_1375447347"/>
+      <w:bookmarkStart w:id="167" w:name="__RefHeading___Toc6330_2586448665"/>
       <w:bookmarkStart w:id="168" w:name="rule"/>
       <w:bookmarkEnd w:id="167"/>
       <w:r>
@@ -18240,7 +18240,7 @@
         <w:spacing w:before="280" w:after="80"/>
         <w:rPr/>
       </w:pPr>
-      <w:bookmarkStart w:id="169" w:name="__RefHeading___Toc6129_1375447347"/>
+      <w:bookmarkStart w:id="169" w:name="__RefHeading___Toc6332_2586448665"/>
       <w:bookmarkStart w:id="170" w:name="mechanism"/>
       <w:bookmarkEnd w:id="169"/>
       <w:r>
@@ -18415,7 +18415,7 @@
         <w:spacing w:before="280" w:after="80"/>
         <w:rPr/>
       </w:pPr>
-      <w:bookmarkStart w:id="171" w:name="__RefHeading___Toc6131_1375447347"/>
+      <w:bookmarkStart w:id="171" w:name="__RefHeading___Toc6334_2586448665"/>
       <w:bookmarkStart w:id="172" w:name="why-it-matters"/>
       <w:bookmarkEnd w:id="171"/>
       <w:r>
@@ -18463,7 +18463,7 @@
         <w:spacing w:before="280" w:after="80"/>
         <w:rPr/>
       </w:pPr>
-      <w:bookmarkStart w:id="174" w:name="__RefHeading___Toc6133_1375447347"/>
+      <w:bookmarkStart w:id="174" w:name="__RefHeading___Toc6336_2586448665"/>
       <w:bookmarkStart w:id="175" w:name="example-attempted-interleave"/>
       <w:bookmarkEnd w:id="174"/>
       <w:r>
@@ -19065,7 +19065,7 @@
         <w:spacing w:before="280" w:after="80"/>
         <w:rPr/>
       </w:pPr>
-      <w:bookmarkStart w:id="177" w:name="__RefHeading___Toc6135_1375447347"/>
+      <w:bookmarkStart w:id="177" w:name="__RefHeading___Toc6338_2586448665"/>
       <w:bookmarkStart w:id="178" w:name="corner-cases"/>
       <w:bookmarkEnd w:id="177"/>
       <w:r>
@@ -19224,7 +19224,7 @@
         <w:spacing w:before="360" w:after="120"/>
         <w:rPr/>
       </w:pPr>
-      <w:bookmarkStart w:id="181" w:name="__RefHeading___Toc6137_1375447347"/>
+      <w:bookmarkStart w:id="181" w:name="__RefHeading___Toc6340_2586448665"/>
       <w:bookmarkStart w:id="182" w:name="module-structure"/>
       <w:bookmarkEnd w:id="181"/>
       <w:r>
@@ -19256,7 +19256,7 @@
         <w:spacing w:before="280" w:after="80"/>
         <w:rPr/>
       </w:pPr>
-      <w:bookmarkStart w:id="183" w:name="__RefHeading___Toc6139_1375447347"/>
+      <w:bookmarkStart w:id="183" w:name="__RefHeading___Toc6342_2586448665"/>
       <w:bookmarkStart w:id="184" w:name="generated-file"/>
       <w:bookmarkEnd w:id="183"/>
       <w:r>
@@ -19379,7 +19379,7 @@
         <w:spacing w:before="280" w:after="80"/>
         <w:rPr/>
       </w:pPr>
-      <w:bookmarkStart w:id="185" w:name="__RefHeading___Toc6141_1375447347"/>
+      <w:bookmarkStart w:id="185" w:name="__RefHeading___Toc6344_2586448665"/>
       <w:bookmarkStart w:id="186" w:name="module-header"/>
       <w:bookmarkEnd w:id="185"/>
       <w:r>
@@ -19419,7 +19419,7 @@
         <w:spacing w:before="200" w:after="80"/>
         <w:rPr/>
       </w:pPr>
-      <w:bookmarkStart w:id="187" w:name="__RefHeading___Toc6143_1375447347"/>
+      <w:bookmarkStart w:id="187" w:name="__RefHeading___Toc6346_2586448665"/>
       <w:bookmarkStart w:id="188" w:name="base-flavor-header"/>
       <w:bookmarkEnd w:id="187"/>
       <w:r>
@@ -19840,7 +19840,7 @@
         <w:spacing w:before="200" w:after="80"/>
         <w:rPr/>
       </w:pPr>
-      <w:bookmarkStart w:id="189" w:name="__RefHeading___Toc6145_1375447347"/>
+      <w:bookmarkStart w:id="189" w:name="__RefHeading___Toc6348_2586448665"/>
       <w:bookmarkStart w:id="190" w:name="rich-flavor-additions"/>
       <w:bookmarkEnd w:id="189"/>
       <w:r>
@@ -20147,7 +20147,7 @@
         <w:spacing w:before="280" w:after="80"/>
         <w:rPr/>
       </w:pPr>
-      <w:bookmarkStart w:id="191" w:name="__RefHeading___Toc6147_1375447347"/>
+      <w:bookmarkStart w:id="191" w:name="__RefHeading___Toc6350_2586448665"/>
       <w:bookmarkStart w:id="192" w:name="internal-organization"/>
       <w:bookmarkEnd w:id="191"/>
       <w:r>
@@ -20340,7 +20340,7 @@
         <w:spacing w:before="280" w:after="80"/>
         <w:rPr/>
       </w:pPr>
-      <w:bookmarkStart w:id="193" w:name="__RefHeading___Toc6149_1375447347"/>
+      <w:bookmarkStart w:id="193" w:name="__RefHeading___Toc6352_2586448665"/>
       <w:bookmarkStart w:id="194" w:name="filelist"/>
       <w:bookmarkEnd w:id="193"/>
       <w:r>
@@ -20499,7 +20499,7 @@
         <w:spacing w:before="360" w:after="120"/>
         <w:rPr/>
       </w:pPr>
-      <w:bookmarkStart w:id="197" w:name="__RefHeading___Toc6151_1375447347"/>
+      <w:bookmarkStart w:id="197" w:name="__RefHeading___Toc6354_2586448665"/>
       <w:bookmarkStart w:id="198" w:name="parameters-and-logic-implications"/>
       <w:bookmarkEnd w:id="197"/>
       <w:r>
@@ -20531,7 +20531,7 @@
         <w:spacing w:before="280" w:after="80"/>
         <w:rPr/>
       </w:pPr>
-      <w:bookmarkStart w:id="199" w:name="__RefHeading___Toc6153_1375447347"/>
+      <w:bookmarkStart w:id="199" w:name="__RefHeading___Toc6356_2586448665"/>
       <w:bookmarkEnd w:id="199"/>
       <w:r>
         <w:rPr>
@@ -21840,7 +21840,7 @@
       <w:r>
         <w:br w:type="page"/>
       </w:r>
-      <w:bookmarkStart w:id="202" w:name="__RefHeading___Toc6155_1375447347"/>
+      <w:bookmarkStart w:id="202" w:name="__RefHeading___Toc6358_2586448665"/>
       <w:bookmarkEnd w:id="202"/>
       <w:r>
         <w:rPr>
@@ -21991,7 +21991,7 @@
         <w:spacing w:before="280" w:after="80"/>
         <w:rPr/>
       </w:pPr>
-      <w:bookmarkStart w:id="203" w:name="__RefHeading___Toc6157_1375447347"/>
+      <w:bookmarkStart w:id="203" w:name="__RefHeading___Toc6360_2586448665"/>
       <w:bookmarkStart w:id="204" w:name="parameter-interaction"/>
       <w:bookmarkEnd w:id="203"/>
       <w:r>
@@ -22140,7 +22140,7 @@
         <w:spacing w:before="280" w:after="80"/>
         <w:rPr/>
       </w:pPr>
-      <w:bookmarkStart w:id="205" w:name="__RefHeading___Toc6159_1375447347"/>
+      <w:bookmarkStart w:id="205" w:name="__RefHeading___Toc6362_2586448665"/>
       <w:bookmarkStart w:id="206" w:name="rtl-constants"/>
       <w:bookmarkEnd w:id="205"/>
       <w:r>
@@ -22325,7 +22325,7 @@
         <w:spacing w:before="360" w:after="120"/>
         <w:rPr/>
       </w:pPr>
-      <w:bookmarkStart w:id="209" w:name="__RefHeading___Toc6161_1375447347"/>
+      <w:bookmarkStart w:id="209" w:name="__RefHeading___Toc6364_2586448665"/>
       <w:bookmarkStart w:id="210" w:name="test-strategy"/>
       <w:bookmarkEnd w:id="209"/>
       <w:r>
@@ -22357,7 +22357,7 @@
         <w:spacing w:before="280" w:after="80"/>
         <w:rPr/>
       </w:pPr>
-      <w:bookmarkStart w:id="211" w:name="__RefHeading___Toc6163_1375447347"/>
+      <w:bookmarkStart w:id="211" w:name="__RefHeading___Toc6366_2586448665"/>
       <w:bookmarkStart w:id="212" w:name="current-status"/>
       <w:bookmarkEnd w:id="211"/>
       <w:r>
@@ -22469,7 +22469,7 @@
         <w:spacing w:before="280" w:after="80"/>
         <w:rPr/>
       </w:pPr>
-      <w:bookmarkStart w:id="213" w:name="__RefHeading___Toc6165_1375447347"/>
+      <w:bookmarkStart w:id="213" w:name="__RefHeading___Toc6368_2586448665"/>
       <w:bookmarkStart w:id="214" w:name="recommended-test-plan"/>
       <w:bookmarkEnd w:id="213"/>
       <w:r>
@@ -22509,7 +22509,7 @@
         <w:spacing w:before="200" w:after="80"/>
         <w:rPr/>
       </w:pPr>
-      <w:bookmarkStart w:id="215" w:name="__RefHeading___Toc6167_1375447347"/>
+      <w:bookmarkStart w:id="215" w:name="__RefHeading___Toc6370_2586448665"/>
       <w:bookmarkStart w:id="216" w:name="routing-coverage"/>
       <w:bookmarkEnd w:id="215"/>
       <w:r>
@@ -22640,7 +22640,7 @@
         <w:spacing w:before="200" w:after="80"/>
         <w:rPr/>
       </w:pPr>
-      <w:bookmarkStart w:id="217" w:name="__RefHeading___Toc6169_1375447347"/>
+      <w:bookmarkStart w:id="217" w:name="__RefHeading___Toc6372_2586448665"/>
       <w:bookmarkStart w:id="218" w:name="arbitration-fairness"/>
       <w:bookmarkEnd w:id="217"/>
       <w:r>
@@ -22712,7 +22712,7 @@
         <w:spacing w:before="200" w:after="80"/>
         <w:rPr/>
       </w:pPr>
-      <w:bookmarkStart w:id="220" w:name="__RefHeading___Toc6171_1375447347"/>
+      <w:bookmarkStart w:id="220" w:name="__RefHeading___Toc6374_2586448665"/>
       <w:bookmarkStart w:id="221" w:name="packet-atomicity"/>
       <w:bookmarkEnd w:id="220"/>
       <w:r>
@@ -22779,7 +22779,7 @@
         <w:spacing w:before="200" w:after="80"/>
         <w:rPr/>
       </w:pPr>
-      <w:bookmarkStart w:id="222" w:name="__RefHeading___Toc6173_1375447347"/>
+      <w:bookmarkStart w:id="222" w:name="__RefHeading___Toc6376_2586448665"/>
       <w:bookmarkStart w:id="223" w:name="backpressure"/>
       <w:bookmarkEnd w:id="222"/>
       <w:r>
@@ -22847,7 +22847,7 @@
         <w:spacing w:before="200" w:after="80"/>
         <w:rPr/>
       </w:pPr>
-      <w:bookmarkStart w:id="225" w:name="__RefHeading___Toc6175_1375447347"/>
+      <w:bookmarkStart w:id="225" w:name="__RefHeading___Toc6378_2586448665"/>
       <w:bookmarkStart w:id="226" w:name="reset"/>
       <w:bookmarkEnd w:id="225"/>
       <w:r>
@@ -22915,7 +22915,7 @@
         <w:spacing w:before="200" w:after="80"/>
         <w:rPr/>
       </w:pPr>
-      <w:bookmarkStart w:id="228" w:name="__RefHeading___Toc6177_1375447347"/>
+      <w:bookmarkStart w:id="228" w:name="__RefHeading___Toc6380_2586448665"/>
       <w:bookmarkStart w:id="229" w:name="rich-flavor"/>
       <w:bookmarkEnd w:id="228"/>
       <w:r>
@@ -23062,7 +23062,7 @@
         <w:spacing w:before="200" w:after="80"/>
         <w:rPr/>
       </w:pPr>
-      <w:bookmarkStart w:id="230" w:name="__RefHeading___Toc6179_1375447347"/>
+      <w:bookmarkStart w:id="230" w:name="__RefHeading___Toc6382_2586448665"/>
       <w:bookmarkStart w:id="231" w:name="formal-assertions"/>
       <w:bookmarkEnd w:id="230"/>
       <w:r>
@@ -23138,7 +23138,7 @@
         <w:spacing w:before="280" w:after="80"/>
         <w:rPr/>
       </w:pPr>
-      <w:bookmarkStart w:id="234" w:name="__RefHeading___Toc6181_1375447347"/>
+      <w:bookmarkStart w:id="234" w:name="__RefHeading___Toc6384_2586448665"/>
       <w:bookmarkStart w:id="235" w:name="lint-and-generation-checks"/>
       <w:bookmarkEnd w:id="234"/>
       <w:r>
@@ -23419,7 +23419,7 @@
         <w:spacing w:before="360" w:after="120"/>
         <w:rPr/>
       </w:pPr>
-      <w:bookmarkStart w:id="238" w:name="__RefHeading___Toc6183_1375447347"/>
+      <w:bookmarkStart w:id="238" w:name="__RefHeading___Toc6386_2586448665"/>
       <w:bookmarkStart w:id="239" w:name="buffers-and-virtual-channels"/>
       <w:bookmarkEnd w:id="238"/>
       <w:r>
@@ -23451,11 +23451,11 @@
           <w:b/>
           <w:bCs/>
         </w:rPr>
-        <w:t>PLANNED:</w:t>
-      </w:r>
-      <w:r>
-        <w:rPr/>
-        <w:t xml:space="preserve"> This chapter describes the planned </w:t>
+        <w:t>IMPLEMENTED:</w:t>
+      </w:r>
+      <w:r>
+        <w:rPr/>
+        <w:t xml:space="preserve"> This chapter describes the </w:t>
       </w:r>
       <w:r>
         <w:rPr>
@@ -23465,7 +23465,7 @@
       </w:r>
       <w:r>
         <w:rPr/>
-        <w:t xml:space="preserve"> microarchitecture per the 2026-10-13 design spec (</w:t>
+        <w:t xml:space="preserve"> microarchitecture as built. The design is per the 2026-10-13 design spec (</w:t>
       </w:r>
       <w:r>
         <w:rPr>
@@ -23475,7 +23475,7 @@
       </w:r>
       <w:r>
         <w:rPr/>
-        <w:t>). No RTL implementation exists yet.</w:t>
+        <w:t>).</w:t>
       </w:r>
       <w:r>
         <w:br w:type="page"/>
@@ -23490,7 +23490,7 @@
         <w:spacing w:before="280" w:after="80"/>
         <w:rPr/>
       </w:pPr>
-      <w:bookmarkStart w:id="240" w:name="__RefHeading___Toc6185_1375447347"/>
+      <w:bookmarkStart w:id="240" w:name="__RefHeading___Toc6388_2586448665"/>
       <w:bookmarkStart w:id="241" w:name="per-port-input-buffer-organization"/>
       <w:bookmarkEnd w:id="240"/>
       <w:r>
@@ -23534,14 +23534,14 @@
         <w:rPr>
           <w:sz w:val="20"/>
         </w:rPr>
-        <w:t xml:space="preserve"> has seven AXI4-Stream input ports: six neighbor ports (±X, ±Y, ±Z) and one local port. Every input port keeps two virtual channels, so the buffering resource is </w:t>
+        <w:t xml:space="preserve"> has nine AXI4-Stream input ports: six axis neighbor ports (±X, ±Y, ±Z), one diagonal tetrad port (P_DIA), one diagonal tile port (P_DIA2), and one local port. P_DIA and P_DIA2 are the two instances of the single conceptual diagonal axis. Every input port keeps two virtual channels, so the buffering resource is </w:t>
       </w:r>
       <w:r>
         <w:rPr>
           <w:rStyle w:val="VerbatimChar"/>
           <w:sz w:val="20"/>
         </w:rPr>
-        <w:t>7 ports × 2 VCs</w:t>
+        <w:t>9 ports × 2 VCs</w:t>
       </w:r>
       <w:r>
         <w:rPr>
@@ -23755,7 +23755,7 @@
                 <w:szCs w:val="24"/>
                 <w:lang w:val="en-US" w:eastAsia="en-US" w:bidi="ar-SA"/>
               </w:rPr>
-              <w:t>7</w:t>
+              <w:t>9</w:t>
             </w:r>
           </w:p>
         </w:tc>
@@ -23786,7 +23786,7 @@
                 <w:szCs w:val="24"/>
                 <w:lang w:val="en-US" w:eastAsia="en-US" w:bidi="ar-SA"/>
               </w:rPr>
-              <w:t>6 neighbor + 1 local</w:t>
+              <w:t>6 axis + P_DIA + P_DIA2 + 1 local</w:t>
             </w:r>
           </w:p>
         </w:tc>
@@ -23947,7 +23947,7 @@
                 <w:szCs w:val="24"/>
                 <w:lang w:val="en-US" w:eastAsia="en-US" w:bidi="ar-SA"/>
               </w:rPr>
-              <w:t>14</w:t>
+              <w:t>18</w:t>
             </w:r>
           </w:p>
         </w:tc>
@@ -24043,7 +24043,7 @@
                 <w:szCs w:val="24"/>
                 <w:lang w:val="en-US" w:eastAsia="en-US" w:bidi="ar-SA"/>
               </w:rPr>
-              <w:t>7</w:t>
+              <w:t>9</w:t>
             </w:r>
           </w:p>
         </w:tc>
@@ -24106,7 +24106,7 @@
         <w:spacing w:before="280" w:after="80"/>
         <w:rPr/>
       </w:pPr>
-      <w:bookmarkStart w:id="244" w:name="__RefHeading___Toc6187_1375447347"/>
+      <w:bookmarkStart w:id="244" w:name="__RefHeading___Toc6390_2586448665"/>
       <w:bookmarkStart w:id="245" w:name="why-per-vc-reservation-is-required"/>
       <w:bookmarkEnd w:id="244"/>
       <w:r>
@@ -24181,7 +24181,7 @@
         <w:spacing w:before="280" w:after="80"/>
         <w:rPr/>
       </w:pPr>
-      <w:bookmarkStart w:id="246" w:name="__RefHeading___Toc6189_1375447347"/>
+      <w:bookmarkStart w:id="246" w:name="__RefHeading___Toc6392_2586448665"/>
       <w:bookmarkEnd w:id="246"/>
       <w:r>
         <w:rPr>
@@ -24643,7 +24643,7 @@
       <w:r>
         <w:br w:type="page"/>
       </w:r>
-      <w:bookmarkStart w:id="249" w:name="__RefHeading___Toc6191_1375447347"/>
+      <w:bookmarkStart w:id="249" w:name="__RefHeading___Toc6394_2586448665"/>
       <w:bookmarkEnd w:id="249"/>
       <w:r>
         <w:rPr>
@@ -24701,7 +24701,7 @@
         <w:spacing w:before="280" w:after="80"/>
         <w:rPr/>
       </w:pPr>
-      <w:bookmarkStart w:id="250" w:name="__RefHeading___Toc6193_1375447347"/>
+      <w:bookmarkStart w:id="250" w:name="__RefHeading___Toc6396_2586448665"/>
       <w:bookmarkStart w:id="251" w:name="references"/>
       <w:bookmarkEnd w:id="250"/>
       <w:r>
@@ -24897,7 +24897,7 @@
         <w:spacing w:before="360" w:after="120"/>
         <w:rPr/>
       </w:pPr>
-      <w:bookmarkStart w:id="254" w:name="__RefHeading___Toc6195_1375447347"/>
+      <w:bookmarkStart w:id="254" w:name="__RefHeading___Toc6398_2586448665"/>
       <w:bookmarkStart w:id="255" w:name="pipeline-stages"/>
       <w:bookmarkEnd w:id="254"/>
       <w:r>
@@ -24929,11 +24929,11 @@
           <w:b/>
           <w:bCs/>
         </w:rPr>
-        <w:t>PLANNED:</w:t>
-      </w:r>
-      <w:r>
-        <w:rPr/>
-        <w:t xml:space="preserve"> This chapter describes the planned </w:t>
+        <w:t>IMPLEMENTED:</w:t>
+      </w:r>
+      <w:r>
+        <w:rPr/>
+        <w:t xml:space="preserve"> This chapter describes the </w:t>
       </w:r>
       <w:r>
         <w:rPr>
@@ -24943,7 +24943,7 @@
       </w:r>
       <w:r>
         <w:rPr/>
-        <w:t xml:space="preserve"> microarchitecture per the 2026-10-13 design spec (</w:t>
+        <w:t xml:space="preserve"> pipeline as built. The design is per the 2026-10-13 design spec (</w:t>
       </w:r>
       <w:r>
         <w:rPr>
@@ -24953,7 +24953,7 @@
       </w:r>
       <w:r>
         <w:rPr/>
-        <w:t>). No RTL implementation exists yet.</w:t>
+        <w:t>).</w:t>
       </w:r>
     </w:p>
     <w:p>
@@ -24974,7 +24974,7 @@
         <w:spacing w:before="200" w:after="80"/>
         <w:rPr/>
       </w:pPr>
-      <w:bookmarkStart w:id="256" w:name="__RefHeading___Toc6197_1375447347"/>
+      <w:bookmarkStart w:id="256" w:name="__RefHeading___Toc6400_2586448665"/>
       <w:bookmarkStart w:id="257" w:name="X1ae7ee7db53ce2d6c30cd4be5e18d53292267f6"/>
       <w:bookmarkStart w:id="258" w:name="_Fig_2_delta_mesh_cell_inte"/>
       <w:bookmarkEnd w:id="256"/>
@@ -25022,7 +25022,7 @@
         <w:spacing w:before="200" w:after="80"/>
         <w:rPr/>
       </w:pPr>
-      <w:bookmarkStart w:id="259" w:name="__RefHeading___Toc6199_1375447347"/>
+      <w:bookmarkStart w:id="259" w:name="__RefHeading___Toc6402_2586448665"/>
       <w:bookmarkEnd w:id="259"/>
       <w:r>
         <w:rPr>
@@ -25768,7 +25768,7 @@
       <w:r>
         <w:br w:type="page"/>
       </w:r>
-      <w:bookmarkStart w:id="262" w:name="__RefHeading___Toc6201_1375447347"/>
+      <w:bookmarkStart w:id="262" w:name="__RefHeading___Toc6404_2586448665"/>
       <w:bookmarkEnd w:id="262"/>
       <w:r>
         <w:rPr>
@@ -25850,24 +25850,19 @@
         <w:rPr>
           <w:sz w:val="20"/>
         </w:rPr>
-        <w:t xml:space="preserve"> releases the switch grant. If lookahead is disabled or the head flit arrives on a non-default VC, the cell pays the full table-lookup latency and throughput drops to one flit every two or three cycles.</w:t>
-      </w:r>
-    </w:p>
-    <w:p>
-      <w:pPr>
-        <w:pStyle w:val="BlockText"/>
-        <w:rPr/>
-      </w:pPr>
-      <w:r>
-        <w:rPr>
-          <w:b/>
-          <w:bCs/>
-        </w:rPr>
-        <w:t>Design note:</w:t>
-      </w:r>
-      <w:r>
-        <w:rPr/>
-        <w:t xml:space="preserve"> Lookahead works only when the route is known statically or can be derived from the destination coordinate alone. Adaptive VC1 routes that depend on local congestion cannot be lookahead-computed by the previous hop; those packets take the slower path.</w:t>
+        <w:t xml:space="preserve"> releases the switch grant.</w:t>
+      </w:r>
+    </w:p>
+    <w:p>
+      <w:pPr>
+        <w:pStyle w:val="BodyText"/>
+        <w:rPr/>
+      </w:pPr>
+      <w:r>
+        <w:rPr>
+          <w:sz w:val="20"/>
+        </w:rPr>
+        <w:t>Measured latency on the ring and tetrad suites is 4 cycles/hop today (issue #120). The 1 cycle/hop steady-state target is deferred; the current pipeline pays the full table-lookup and grant latency per hop. Source-route mode can bypass the table lookup for fixed-latency systolic schedules.</w:t>
       </w:r>
       <w:r>
         <w:br w:type="page"/>
@@ -25882,7 +25877,7 @@
         <w:spacing w:before="280" w:after="80"/>
         <w:rPr/>
       </w:pPr>
-      <w:bookmarkStart w:id="263" w:name="__RefHeading___Toc6203_1375447347"/>
+      <w:bookmarkStart w:id="263" w:name="__RefHeading___Toc6406_2586448665"/>
       <w:bookmarkStart w:id="264" w:name="speculative-vc-and-switch-allocation"/>
       <w:bookmarkEnd w:id="263"/>
       <w:r>
@@ -25942,7 +25937,7 @@
         <w:spacing w:before="280" w:after="80"/>
         <w:rPr/>
       </w:pPr>
-      <w:bookmarkStart w:id="265" w:name="__RefHeading___Toc6205_1375447347"/>
+      <w:bookmarkStart w:id="265" w:name="__RefHeading___Toc6408_2586448665"/>
       <w:bookmarkStart w:id="266" w:name="handshake-discipline"/>
       <w:bookmarkEnd w:id="265"/>
       <w:r>
@@ -26028,7 +26023,7 @@
         <w:spacing w:before="280" w:after="80"/>
         <w:rPr/>
       </w:pPr>
-      <w:bookmarkStart w:id="267" w:name="__RefHeading___Toc6207_1375447347"/>
+      <w:bookmarkStart w:id="267" w:name="__RefHeading___Toc6410_2586448665"/>
       <w:bookmarkStart w:id="268" w:name="X0cc0ccd8d0e31e7cace5d0e7eae7139a8f5dd9a"/>
       <w:bookmarkEnd w:id="267"/>
       <w:r>
@@ -26088,7 +26083,7 @@
         <w:spacing w:before="280" w:after="80"/>
         <w:rPr/>
       </w:pPr>
-      <w:bookmarkStart w:id="269" w:name="__RefHeading___Toc6209_1375447347"/>
+      <w:bookmarkStart w:id="269" w:name="__RefHeading___Toc6412_2586448665"/>
       <w:bookmarkStart w:id="270" w:name="references-1"/>
       <w:bookmarkEnd w:id="269"/>
       <w:r>
@@ -26234,7 +26229,7 @@
         <w:spacing w:before="360" w:after="120"/>
         <w:rPr/>
       </w:pPr>
-      <w:bookmarkStart w:id="273" w:name="__RefHeading___Toc6211_1375447347"/>
+      <w:bookmarkStart w:id="273" w:name="__RefHeading___Toc6414_2586448665"/>
       <w:bookmarkStart w:id="274" w:name="routing-table"/>
       <w:bookmarkEnd w:id="273"/>
       <w:r>
@@ -26266,11 +26261,11 @@
           <w:b/>
           <w:bCs/>
         </w:rPr>
-        <w:t>PLANNED:</w:t>
-      </w:r>
-      <w:r>
-        <w:rPr/>
-        <w:t xml:space="preserve"> This chapter describes the planned </w:t>
+        <w:t>IMPLEMENTED:</w:t>
+      </w:r>
+      <w:r>
+        <w:rPr/>
+        <w:t xml:space="preserve"> This chapter describes the </w:t>
       </w:r>
       <w:r>
         <w:rPr>
@@ -26280,7 +26275,7 @@
       </w:r>
       <w:r>
         <w:rPr/>
-        <w:t xml:space="preserve"> microarchitecture per the 2026-10-13 design spec (</w:t>
+        <w:t xml:space="preserve"> routing table as built. The design is per the 2026-10-13 design spec (</w:t>
       </w:r>
       <w:r>
         <w:rPr>
@@ -26290,7 +26285,7 @@
       </w:r>
       <w:r>
         <w:rPr/>
-        <w:t>). No RTL implementation exists yet.</w:t>
+        <w:t>).</w:t>
       </w:r>
       <w:r>
         <w:br w:type="page"/>
@@ -26305,7 +26300,7 @@
         <w:spacing w:before="280" w:after="80"/>
         <w:rPr/>
       </w:pPr>
-      <w:bookmarkStart w:id="275" w:name="__RefHeading___Toc6213_1375447347"/>
+      <w:bookmarkStart w:id="275" w:name="__RefHeading___Toc6416_2586448665"/>
       <w:bookmarkEnd w:id="275"/>
       <w:r>
         <w:rPr>
@@ -26785,7 +26780,7 @@
                 <w:szCs w:val="24"/>
                 <w:lang w:val="en-US" w:eastAsia="en-US" w:bidi="ar-SA"/>
               </w:rPr>
-              <w:t>7 bits (one per output port)</w:t>
+              <w:t>9 bits (one per output port)</w:t>
             </w:r>
           </w:p>
         </w:tc>
@@ -26932,7 +26927,7 @@
       <w:r>
         <w:br w:type="page"/>
       </w:r>
-      <w:bookmarkStart w:id="278" w:name="__RefHeading___Toc6215_1375447347"/>
+      <w:bookmarkStart w:id="278" w:name="__RefHeading___Toc6418_2586448665"/>
       <w:bookmarkEnd w:id="278"/>
       <w:r>
         <w:rPr>
@@ -26977,7 +26972,7 @@
         <w:spacing w:before="280" w:after="80"/>
         <w:rPr/>
       </w:pPr>
-      <w:bookmarkStart w:id="279" w:name="__RefHeading___Toc6217_1375447347"/>
+      <w:bookmarkStart w:id="279" w:name="__RefHeading___Toc6420_2586448665"/>
       <w:bookmarkStart w:id="280" w:name="in-band-load-and-readback"/>
       <w:bookmarkEnd w:id="279"/>
       <w:r>
@@ -27054,7 +27049,7 @@
         <w:spacing w:before="280" w:after="80"/>
         <w:rPr/>
       </w:pPr>
-      <w:bookmarkStart w:id="281" w:name="__RefHeading___Toc6219_1375447347"/>
+      <w:bookmarkStart w:id="281" w:name="__RefHeading___Toc6422_2586448665"/>
       <w:bookmarkStart w:id="282" w:name="vc0-acyclicity-check"/>
       <w:bookmarkEnd w:id="281"/>
       <w:r>
@@ -27115,7 +27110,7 @@
         <w:spacing w:before="280" w:after="80"/>
         <w:rPr/>
       </w:pPr>
-      <w:bookmarkStart w:id="283" w:name="__RefHeading___Toc6221_1375447347"/>
+      <w:bookmarkStart w:id="283" w:name="__RefHeading___Toc6424_2586448665"/>
       <w:bookmarkStart w:id="284" w:name="torus-wrap-and-the-dateline-rule"/>
       <w:bookmarkEnd w:id="283"/>
       <w:r>
@@ -27175,7 +27170,7 @@
         <w:spacing w:before="280" w:after="80"/>
         <w:rPr/>
       </w:pPr>
-      <w:bookmarkStart w:id="285" w:name="__RefHeading___Toc6223_1375447347"/>
+      <w:bookmarkStart w:id="285" w:name="__RefHeading___Toc6426_2586448665"/>
       <w:bookmarkEnd w:id="285"/>
       <w:r>
         <w:rPr>
@@ -27205,7 +27200,7 @@
         <w:rPr>
           <w:sz w:val="20"/>
         </w:rPr>
-        <w:t>Alongside custom per-cell tables, the generator defines eight standard modes switched by a broadcast mode-switch message. Each cell holds generator-emitted images; the switch applies only after a fabric-wide ack barrier returns through the config read-response path.</w:t>
+        <w:t>Alongside custom per-cell tables, the generator defines ten standard modes switched by a broadcast mode-switch message. Each cell holds generator-emitted images; the switch applies only after a fabric-wide ack barrier returns through the config read-response path.</w:t>
       </w:r>
     </w:p>
     <w:p>
@@ -27223,7 +27218,7 @@
     <w:tbl>
       <w:tblPr>
         <w:tblStyle w:val="Table"/>
-        <w:tblW w:w="7920" w:type="dxa"/>
+        <w:tblW w:w="5000" w:type="pct"/>
         <w:jc w:val="left"/>
         <w:tblInd w:w="108" w:type="dxa"/>
         <w:tblLayout w:type="fixed"/>
@@ -27236,9 +27231,9 @@
         <w:tblLook w:val="0020" w:noHBand="0" w:noVBand="0" w:firstColumn="0" w:lastRow="0" w:lastColumn="0" w:firstRow="1"/>
       </w:tblPr>
       <w:tblGrid>
-        <w:gridCol w:w="2640"/>
-        <w:gridCol w:w="2640"/>
-        <w:gridCol w:w="2640"/>
+        <w:gridCol w:w="3120"/>
+        <w:gridCol w:w="3120"/>
+        <w:gridCol w:w="3120"/>
       </w:tblGrid>
       <w:tr>
         <w:trPr>
@@ -27246,7 +27241,7 @@
         </w:trPr>
         <w:tc>
           <w:tcPr>
-            <w:tcW w:w="2640" w:type="dxa"/>
+            <w:tcW w:w="3120" w:type="dxa"/>
             <w:tcBorders>
               <w:bottom w:val="single" w:sz="6" w:space="0" w:color="000000"/>
             </w:tcBorders>
@@ -27282,7 +27277,7 @@
         </w:tc>
         <w:tc>
           <w:tcPr>
-            <w:tcW w:w="2640" w:type="dxa"/>
+            <w:tcW w:w="3120" w:type="dxa"/>
             <w:tcBorders>
               <w:bottom w:val="single" w:sz="6" w:space="0" w:color="000000"/>
             </w:tcBorders>
@@ -27318,7 +27313,7 @@
         </w:tc>
         <w:tc>
           <w:tcPr>
-            <w:tcW w:w="2640" w:type="dxa"/>
+            <w:tcW w:w="3120" w:type="dxa"/>
             <w:tcBorders>
               <w:bottom w:val="single" w:sz="6" w:space="0" w:color="000000"/>
             </w:tcBorders>
@@ -27357,7 +27352,7 @@
         <w:trPr/>
         <w:tc>
           <w:tcPr>
-            <w:tcW w:w="2640" w:type="dxa"/>
+            <w:tcW w:w="3120" w:type="dxa"/>
             <w:tcBorders/>
           </w:tcPr>
           <w:p>
@@ -27388,7 +27383,7 @@
         </w:tc>
         <w:tc>
           <w:tcPr>
-            <w:tcW w:w="2640" w:type="dxa"/>
+            <w:tcW w:w="3120" w:type="dxa"/>
             <w:tcBorders/>
           </w:tcPr>
           <w:p>
@@ -27419,7 +27414,7 @@
         </w:tc>
         <w:tc>
           <w:tcPr>
-            <w:tcW w:w="2640" w:type="dxa"/>
+            <w:tcW w:w="3120" w:type="dxa"/>
             <w:tcBorders/>
           </w:tcPr>
           <w:p>
@@ -27453,7 +27448,7 @@
         <w:trPr/>
         <w:tc>
           <w:tcPr>
-            <w:tcW w:w="2640" w:type="dxa"/>
+            <w:tcW w:w="3120" w:type="dxa"/>
             <w:tcBorders/>
           </w:tcPr>
           <w:p>
@@ -27484,7 +27479,7 @@
         </w:tc>
         <w:tc>
           <w:tcPr>
-            <w:tcW w:w="2640" w:type="dxa"/>
+            <w:tcW w:w="3120" w:type="dxa"/>
             <w:tcBorders/>
           </w:tcPr>
           <w:p>
@@ -27515,7 +27510,7 @@
         </w:tc>
         <w:tc>
           <w:tcPr>
-            <w:tcW w:w="2640" w:type="dxa"/>
+            <w:tcW w:w="3120" w:type="dxa"/>
             <w:tcBorders/>
           </w:tcPr>
           <w:p>
@@ -27549,7 +27544,7 @@
         <w:trPr/>
         <w:tc>
           <w:tcPr>
-            <w:tcW w:w="2640" w:type="dxa"/>
+            <w:tcW w:w="3120" w:type="dxa"/>
             <w:tcBorders/>
           </w:tcPr>
           <w:p>
@@ -27580,7 +27575,7 @@
         </w:tc>
         <w:tc>
           <w:tcPr>
-            <w:tcW w:w="2640" w:type="dxa"/>
+            <w:tcW w:w="3120" w:type="dxa"/>
             <w:tcBorders/>
           </w:tcPr>
           <w:p>
@@ -27611,7 +27606,7 @@
         </w:tc>
         <w:tc>
           <w:tcPr>
-            <w:tcW w:w="2640" w:type="dxa"/>
+            <w:tcW w:w="3120" w:type="dxa"/>
             <w:tcBorders/>
           </w:tcPr>
           <w:p>
@@ -27645,7 +27640,7 @@
         <w:trPr/>
         <w:tc>
           <w:tcPr>
-            <w:tcW w:w="2640" w:type="dxa"/>
+            <w:tcW w:w="3120" w:type="dxa"/>
             <w:tcBorders/>
           </w:tcPr>
           <w:p>
@@ -27676,7 +27671,7 @@
         </w:tc>
         <w:tc>
           <w:tcPr>
-            <w:tcW w:w="2640" w:type="dxa"/>
+            <w:tcW w:w="3120" w:type="dxa"/>
             <w:tcBorders/>
           </w:tcPr>
           <w:p>
@@ -27707,7 +27702,7 @@
         </w:tc>
         <w:tc>
           <w:tcPr>
-            <w:tcW w:w="2640" w:type="dxa"/>
+            <w:tcW w:w="3120" w:type="dxa"/>
             <w:tcBorders/>
           </w:tcPr>
           <w:p>
@@ -27741,7 +27736,7 @@
         <w:trPr/>
         <w:tc>
           <w:tcPr>
-            <w:tcW w:w="2640" w:type="dxa"/>
+            <w:tcW w:w="3120" w:type="dxa"/>
             <w:tcBorders/>
           </w:tcPr>
           <w:p>
@@ -27772,7 +27767,7 @@
         </w:tc>
         <w:tc>
           <w:tcPr>
-            <w:tcW w:w="2640" w:type="dxa"/>
+            <w:tcW w:w="3120" w:type="dxa"/>
             <w:tcBorders/>
           </w:tcPr>
           <w:p>
@@ -27803,7 +27798,7 @@
         </w:tc>
         <w:tc>
           <w:tcPr>
-            <w:tcW w:w="2640" w:type="dxa"/>
+            <w:tcW w:w="3120" w:type="dxa"/>
             <w:tcBorders/>
           </w:tcPr>
           <w:p>
@@ -27837,7 +27832,7 @@
         <w:trPr/>
         <w:tc>
           <w:tcPr>
-            <w:tcW w:w="2640" w:type="dxa"/>
+            <w:tcW w:w="3120" w:type="dxa"/>
             <w:tcBorders/>
           </w:tcPr>
           <w:p>
@@ -27868,7 +27863,7 @@
         </w:tc>
         <w:tc>
           <w:tcPr>
-            <w:tcW w:w="2640" w:type="dxa"/>
+            <w:tcW w:w="3120" w:type="dxa"/>
             <w:tcBorders/>
           </w:tcPr>
           <w:p>
@@ -27899,7 +27894,7 @@
         </w:tc>
         <w:tc>
           <w:tcPr>
-            <w:tcW w:w="2640" w:type="dxa"/>
+            <w:tcW w:w="3120" w:type="dxa"/>
             <w:tcBorders/>
           </w:tcPr>
           <w:p>
@@ -27933,7 +27928,7 @@
         <w:trPr/>
         <w:tc>
           <w:tcPr>
-            <w:tcW w:w="2640" w:type="dxa"/>
+            <w:tcW w:w="3120" w:type="dxa"/>
             <w:tcBorders/>
           </w:tcPr>
           <w:p>
@@ -27964,7 +27959,7 @@
         </w:tc>
         <w:tc>
           <w:tcPr>
-            <w:tcW w:w="2640" w:type="dxa"/>
+            <w:tcW w:w="3120" w:type="dxa"/>
             <w:tcBorders/>
           </w:tcPr>
           <w:p>
@@ -27995,7 +27990,7 @@
         </w:tc>
         <w:tc>
           <w:tcPr>
-            <w:tcW w:w="2640" w:type="dxa"/>
+            <w:tcW w:w="3120" w:type="dxa"/>
             <w:tcBorders/>
           </w:tcPr>
           <w:p>
@@ -28029,7 +28024,7 @@
         <w:trPr/>
         <w:tc>
           <w:tcPr>
-            <w:tcW w:w="2640" w:type="dxa"/>
+            <w:tcW w:w="3120" w:type="dxa"/>
             <w:tcBorders/>
           </w:tcPr>
           <w:p>
@@ -28060,7 +28055,7 @@
         </w:tc>
         <w:tc>
           <w:tcPr>
-            <w:tcW w:w="2640" w:type="dxa"/>
+            <w:tcW w:w="3120" w:type="dxa"/>
             <w:tcBorders/>
           </w:tcPr>
           <w:p>
@@ -28091,7 +28086,7 @@
         </w:tc>
         <w:tc>
           <w:tcPr>
-            <w:tcW w:w="2640" w:type="dxa"/>
+            <w:tcW w:w="3120" w:type="dxa"/>
             <w:tcBorders/>
           </w:tcPr>
           <w:p>
@@ -28118,6 +28113,198 @@
               </w:rPr>
               <w:t>Fixed chain + boundary tables</w:t>
             </w:r>
+          </w:p>
+        </w:tc>
+      </w:tr>
+      <w:tr>
+        <w:trPr/>
+        <w:tc>
+          <w:tcPr>
+            <w:tcW w:w="3120" w:type="dxa"/>
+            <w:tcBorders/>
+          </w:tcPr>
+          <w:p>
+            <w:pPr>
+              <w:pStyle w:val="Compact"/>
+              <w:widowControl/>
+              <w:spacing w:before="36" w:after="36"/>
+              <w:jc w:val="left"/>
+              <w:rPr>
+                <w:rFonts w:ascii="Cambria" w:hAnsi="Cambria" w:eastAsia="Cambria" w:cs=""/>
+                <w:kern w:val="0"/>
+                <w:sz w:val="24"/>
+                <w:szCs w:val="24"/>
+                <w:lang w:val="en-US" w:eastAsia="en-US" w:bidi="ar-SA"/>
+              </w:rPr>
+            </w:pPr>
+            <w:r>
+              <w:rPr>
+                <w:rFonts w:eastAsia="Cambria" w:cs=""/>
+                <w:kern w:val="0"/>
+                <w:sz w:val="24"/>
+                <w:szCs w:val="24"/>
+                <w:lang w:val="en-US" w:eastAsia="en-US" w:bidi="ar-SA"/>
+              </w:rPr>
+              <w:t>9</w:t>
+            </w:r>
+          </w:p>
+        </w:tc>
+        <w:tc>
+          <w:tcPr>
+            <w:tcW w:w="3120" w:type="dxa"/>
+            <w:tcBorders/>
+          </w:tcPr>
+          <w:p>
+            <w:pPr>
+              <w:pStyle w:val="Compact"/>
+              <w:widowControl/>
+              <w:spacing w:before="36" w:after="36"/>
+              <w:jc w:val="left"/>
+              <w:rPr>
+                <w:rFonts w:ascii="Cambria" w:hAnsi="Cambria" w:eastAsia="Cambria" w:cs=""/>
+                <w:kern w:val="0"/>
+                <w:sz w:val="24"/>
+                <w:szCs w:val="24"/>
+                <w:lang w:val="en-US" w:eastAsia="en-US" w:bidi="ar-SA"/>
+              </w:rPr>
+            </w:pPr>
+            <w:r>
+              <w:rPr>
+                <w:rFonts w:eastAsia="Cambria" w:cs=""/>
+                <w:kern w:val="0"/>
+                <w:sz w:val="24"/>
+                <w:szCs w:val="24"/>
+                <w:lang w:val="en-US" w:eastAsia="en-US" w:bidi="ar-SA"/>
+              </w:rPr>
+              <w:t>Tetrad all-to-all (K4)</w:t>
+            </w:r>
+          </w:p>
+        </w:tc>
+        <w:tc>
+          <w:tcPr>
+            <w:tcW w:w="3120" w:type="dxa"/>
+            <w:tcBorders/>
+          </w:tcPr>
+          <w:p>
+            <w:pPr>
+              <w:pStyle w:val="Compact"/>
+              <w:widowControl/>
+              <w:spacing w:before="36" w:after="36"/>
+              <w:jc w:val="left"/>
+              <w:rPr>
+                <w:rFonts w:ascii="Cambria" w:hAnsi="Cambria" w:eastAsia="Cambria" w:cs=""/>
+                <w:kern w:val="0"/>
+                <w:sz w:val="24"/>
+                <w:szCs w:val="24"/>
+                <w:lang w:val="en-US" w:eastAsia="en-US" w:bidi="ar-SA"/>
+              </w:rPr>
+            </w:pPr>
+            <w:r>
+              <w:rPr>
+                <w:rFonts w:eastAsia="Cambria" w:cs=""/>
+                <w:kern w:val="0"/>
+                <w:sz w:val="24"/>
+                <w:szCs w:val="24"/>
+                <w:lang w:val="en-US" w:eastAsia="en-US" w:bidi="ar-SA"/>
+              </w:rPr>
+              <w:t>P_DIA for diagonal mates; DOR for inter-tetrad dsts</w:t>
+            </w:r>
+          </w:p>
+        </w:tc>
+      </w:tr>
+      <w:tr>
+        <w:trPr/>
+        <w:tc>
+          <w:tcPr>
+            <w:tcW w:w="3120" w:type="dxa"/>
+            <w:tcBorders/>
+          </w:tcPr>
+          <w:p>
+            <w:pPr>
+              <w:pStyle w:val="Compact"/>
+              <w:widowControl/>
+              <w:spacing w:before="36" w:after="36"/>
+              <w:jc w:val="left"/>
+              <w:rPr>
+                <w:rFonts w:ascii="Cambria" w:hAnsi="Cambria" w:eastAsia="Cambria" w:cs=""/>
+                <w:kern w:val="0"/>
+                <w:sz w:val="24"/>
+                <w:szCs w:val="24"/>
+                <w:lang w:val="en-US" w:eastAsia="en-US" w:bidi="ar-SA"/>
+              </w:rPr>
+            </w:pPr>
+            <w:r>
+              <w:rPr>
+                <w:rFonts w:eastAsia="Cambria" w:cs=""/>
+                <w:kern w:val="0"/>
+                <w:sz w:val="24"/>
+                <w:szCs w:val="24"/>
+                <w:lang w:val="en-US" w:eastAsia="en-US" w:bidi="ar-SA"/>
+              </w:rPr>
+              <w:t>10</w:t>
+            </w:r>
+          </w:p>
+        </w:tc>
+        <w:tc>
+          <w:tcPr>
+            <w:tcW w:w="3120" w:type="dxa"/>
+            <w:tcBorders/>
+          </w:tcPr>
+          <w:p>
+            <w:pPr>
+              <w:pStyle w:val="Compact"/>
+              <w:widowControl/>
+              <w:spacing w:before="36" w:after="36"/>
+              <w:jc w:val="left"/>
+              <w:rPr>
+                <w:rFonts w:ascii="Cambria" w:hAnsi="Cambria" w:eastAsia="Cambria" w:cs=""/>
+                <w:kern w:val="0"/>
+                <w:sz w:val="24"/>
+                <w:szCs w:val="24"/>
+                <w:lang w:val="en-US" w:eastAsia="en-US" w:bidi="ar-SA"/>
+              </w:rPr>
+            </w:pPr>
+            <w:r>
+              <w:rPr>
+                <w:rFonts w:eastAsia="Cambria" w:cs=""/>
+                <w:kern w:val="0"/>
+                <w:sz w:val="24"/>
+                <w:szCs w:val="24"/>
+                <w:lang w:val="en-US" w:eastAsia="en-US" w:bidi="ar-SA"/>
+              </w:rPr>
+              <w:t>Tile all-to-all (K4 of tetrads)</w:t>
+            </w:r>
+          </w:p>
+        </w:tc>
+        <w:tc>
+          <w:tcPr>
+            <w:tcW w:w="3120" w:type="dxa"/>
+            <w:tcBorders/>
+          </w:tcPr>
+          <w:p>
+            <w:pPr>
+              <w:pStyle w:val="Compact"/>
+              <w:widowControl/>
+              <w:spacing w:before="36" w:after="36"/>
+              <w:jc w:val="left"/>
+              <w:rPr>
+                <w:rFonts w:ascii="Cambria" w:hAnsi="Cambria" w:eastAsia="Cambria" w:cs=""/>
+                <w:kern w:val="0"/>
+                <w:sz w:val="24"/>
+                <w:szCs w:val="24"/>
+                <w:lang w:val="en-US" w:eastAsia="en-US" w:bidi="ar-SA"/>
+              </w:rPr>
+            </w:pPr>
+            <w:r>
+              <w:rPr>
+                <w:rFonts w:eastAsia="Cambria" w:cs=""/>
+                <w:kern w:val="0"/>
+                <w:sz w:val="24"/>
+                <w:szCs w:val="24"/>
+                <w:lang w:val="en-US" w:eastAsia="en-US" w:bidi="ar-SA"/>
+              </w:rPr>
+              <w:t>P_DIA2 for diagonal-tetrad mates; DOR for inter-tile dsts</w:t>
+            </w:r>
             <w:bookmarkStart w:id="287" w:name="standard-fabric-modes"/>
             <w:bookmarkEnd w:id="287"/>
           </w:p>
@@ -28136,7 +28323,7 @@
       <w:r>
         <w:br w:type="page"/>
       </w:r>
-      <w:bookmarkStart w:id="288" w:name="__RefHeading___Toc6225_1375447347"/>
+      <w:bookmarkStart w:id="288" w:name="__RefHeading___Toc6428_2586448665"/>
       <w:bookmarkEnd w:id="288"/>
       <w:r>
         <w:rPr>
@@ -28329,7 +28516,7 @@
         <w:spacing w:before="360" w:after="120"/>
         <w:rPr/>
       </w:pPr>
-      <w:bookmarkStart w:id="290" w:name="__RefHeading___Toc6227_1375447347"/>
+      <w:bookmarkStart w:id="290" w:name="__RefHeading___Toc6430_2586448665"/>
       <w:bookmarkStart w:id="291" w:name="allocators"/>
       <w:bookmarkEnd w:id="290"/>
       <w:r>
@@ -28361,11 +28548,11 @@
           <w:b/>
           <w:bCs/>
         </w:rPr>
-        <w:t>PLANNED:</w:t>
-      </w:r>
-      <w:r>
-        <w:rPr/>
-        <w:t xml:space="preserve"> This chapter describes the planned </w:t>
+        <w:t>IMPLEMENTED:</w:t>
+      </w:r>
+      <w:r>
+        <w:rPr/>
+        <w:t xml:space="preserve"> This chapter describes the </w:t>
       </w:r>
       <w:r>
         <w:rPr>
@@ -28375,7 +28562,7 @@
       </w:r>
       <w:r>
         <w:rPr/>
-        <w:t xml:space="preserve"> microarchitecture per the 2026-10-13 design spec (</w:t>
+        <w:t xml:space="preserve"> allocators as built. The design is per the 2026-10-13 design spec (</w:t>
       </w:r>
       <w:r>
         <w:rPr>
@@ -28385,7 +28572,7 @@
       </w:r>
       <w:r>
         <w:rPr/>
-        <w:t>). No RTL implementation exists yet.</w:t>
+        <w:t>).</w:t>
       </w:r>
     </w:p>
     <w:p>
@@ -28750,7 +28937,7 @@
       <w:r>
         <w:br w:type="page"/>
       </w:r>
-      <w:bookmarkStart w:id="293" w:name="__RefHeading___Toc6229_1375447347"/>
+      <w:bookmarkStart w:id="293" w:name="__RefHeading___Toc6432_2586448665"/>
       <w:bookmarkEnd w:id="293"/>
       <w:r>
         <w:rPr>
@@ -28825,7 +29012,7 @@
         <w:spacing w:before="280" w:after="80"/>
         <w:rPr/>
       </w:pPr>
-      <w:bookmarkStart w:id="294" w:name="__RefHeading___Toc6231_1375447347"/>
+      <w:bookmarkStart w:id="294" w:name="__RefHeading___Toc6434_2586448665"/>
       <w:bookmarkStart w:id="295" w:name="switch-allocation"/>
       <w:bookmarkEnd w:id="294"/>
       <w:r>
@@ -28873,7 +29060,7 @@
         <w:spacing w:before="280" w:after="80"/>
         <w:rPr/>
       </w:pPr>
-      <w:bookmarkStart w:id="297" w:name="__RefHeading___Toc6233_1375447347"/>
+      <w:bookmarkStart w:id="297" w:name="__RefHeading___Toc6436_2586448665"/>
       <w:bookmarkStart w:id="298" w:name="one-hot-grant-assertions"/>
       <w:bookmarkEnd w:id="297"/>
       <w:r>
@@ -28946,7 +29133,7 @@
         <w:spacing w:before="280" w:after="80"/>
         <w:rPr/>
       </w:pPr>
-      <w:bookmarkStart w:id="299" w:name="__RefHeading___Toc6235_1375447347"/>
+      <w:bookmarkStart w:id="299" w:name="__RefHeading___Toc6438_2586448665"/>
       <w:bookmarkStart w:id="300" w:name="multicast-allocation"/>
       <w:bookmarkEnd w:id="299"/>
       <w:r>
@@ -28994,7 +29181,7 @@
         <w:spacing w:before="280" w:after="80"/>
         <w:rPr/>
       </w:pPr>
-      <w:bookmarkStart w:id="302" w:name="__RefHeading___Toc6237_1375447347"/>
+      <w:bookmarkStart w:id="302" w:name="__RefHeading___Toc6440_2586448665"/>
       <w:bookmarkStart w:id="303" w:name="conservative-output-vc-reallocation"/>
       <w:bookmarkEnd w:id="302"/>
       <w:r>
@@ -29042,7 +29229,7 @@
         <w:spacing w:before="280" w:after="80"/>
         <w:rPr/>
       </w:pPr>
-      <w:bookmarkStart w:id="305" w:name="__RefHeading___Toc6239_1375447347"/>
+      <w:bookmarkStart w:id="305" w:name="__RefHeading___Toc6442_2586448665"/>
       <w:bookmarkStart w:id="306" w:name="references-3"/>
       <w:bookmarkEnd w:id="305"/>
       <w:r>
@@ -29188,7 +29375,7 @@
         <w:spacing w:before="360" w:after="120"/>
         <w:rPr/>
       </w:pPr>
-      <w:bookmarkStart w:id="309" w:name="__RefHeading___Toc6241_1375447347"/>
+      <w:bookmarkStart w:id="309" w:name="__RefHeading___Toc6444_2586448665"/>
       <w:bookmarkStart w:id="310" w:name="qos-mechanisms"/>
       <w:bookmarkEnd w:id="309"/>
       <w:r>
@@ -29220,11 +29407,11 @@
           <w:b/>
           <w:bCs/>
         </w:rPr>
-        <w:t>PLANNED:</w:t>
-      </w:r>
-      <w:r>
-        <w:rPr/>
-        <w:t xml:space="preserve"> This chapter describes the planned </w:t>
+        <w:t>IMPLEMENTED:</w:t>
+      </w:r>
+      <w:r>
+        <w:rPr/>
+        <w:t xml:space="preserve"> This chapter describes the </w:t>
       </w:r>
       <w:r>
         <w:rPr>
@@ -29234,7 +29421,7 @@
       </w:r>
       <w:r>
         <w:rPr/>
-        <w:t xml:space="preserve"> microarchitecture per the 2026-10-13 design spec (</w:t>
+        <w:t xml:space="preserve"> QoS mechanisms as built. The design is per the 2026-10-13 design spec (</w:t>
       </w:r>
       <w:r>
         <w:rPr>
@@ -29244,7 +29431,7 @@
       </w:r>
       <w:r>
         <w:rPr/>
-        <w:t>). No RTL implementation exists yet.</w:t>
+        <w:t>).</w:t>
       </w:r>
     </w:p>
     <w:p>
@@ -29835,7 +30022,7 @@
       <w:r>
         <w:br w:type="page"/>
       </w:r>
-      <w:bookmarkStart w:id="312" w:name="__RefHeading___Toc6243_1375447347"/>
+      <w:bookmarkStart w:id="312" w:name="__RefHeading___Toc6446_2586448665"/>
       <w:bookmarkEnd w:id="312"/>
       <w:r>
         <w:rPr>
@@ -29880,7 +30067,7 @@
         <w:spacing w:before="280" w:after="80"/>
         <w:rPr/>
       </w:pPr>
-      <w:bookmarkStart w:id="313" w:name="__RefHeading___Toc6245_1375447347"/>
+      <w:bookmarkStart w:id="313" w:name="__RefHeading___Toc6448_2586448665"/>
       <w:bookmarkStart w:id="314" w:name="bulk-minimum-reservation"/>
       <w:bookmarkEnd w:id="313"/>
       <w:r>
@@ -29928,7 +30115,7 @@
         <w:spacing w:before="280" w:after="80"/>
         <w:rPr/>
       </w:pPr>
-      <w:bookmarkStart w:id="316" w:name="__RefHeading___Toc6247_1375447347"/>
+      <w:bookmarkStart w:id="316" w:name="__RefHeading___Toc6450_2586448665"/>
       <w:bookmarkEnd w:id="316"/>
       <w:r>
         <w:rPr>
@@ -30293,7 +30480,7 @@
       <w:r>
         <w:br w:type="page"/>
       </w:r>
-      <w:bookmarkStart w:id="319" w:name="__RefHeading___Toc6249_1375447347"/>
+      <w:bookmarkStart w:id="319" w:name="__RefHeading___Toc6452_2586448665"/>
       <w:bookmarkEnd w:id="319"/>
       <w:r>
         <w:rPr>
@@ -30338,7 +30525,7 @@
         <w:spacing w:before="280" w:after="80"/>
         <w:rPr/>
       </w:pPr>
-      <w:bookmarkStart w:id="320" w:name="__RefHeading___Toc6251_1375447347"/>
+      <w:bookmarkStart w:id="320" w:name="__RefHeading___Toc6454_2586448665"/>
       <w:bookmarkStart w:id="321" w:name="references-4"/>
       <w:bookmarkEnd w:id="320"/>
       <w:r>
@@ -30534,7 +30721,7 @@
         <w:spacing w:before="360" w:after="120"/>
         <w:rPr/>
       </w:pPr>
-      <w:bookmarkStart w:id="324" w:name="__RefHeading___Toc6253_1375447347"/>
+      <w:bookmarkStart w:id="324" w:name="__RefHeading___Toc6456_2586448665"/>
       <w:bookmarkStart w:id="325" w:name="multicast-path"/>
       <w:bookmarkEnd w:id="324"/>
       <w:r>
@@ -30566,11 +30753,11 @@
           <w:b/>
           <w:bCs/>
         </w:rPr>
-        <w:t>PLANNED:</w:t>
-      </w:r>
-      <w:r>
-        <w:rPr/>
-        <w:t xml:space="preserve"> This chapter describes the planned </w:t>
+        <w:t>IMPLEMENTED:</w:t>
+      </w:r>
+      <w:r>
+        <w:rPr/>
+        <w:t xml:space="preserve"> This chapter describes the </w:t>
       </w:r>
       <w:r>
         <w:rPr>
@@ -30580,7 +30767,7 @@
       </w:r>
       <w:r>
         <w:rPr/>
-        <w:t xml:space="preserve"> microarchitecture per the 2026-10-13 design spec (</w:t>
+        <w:t xml:space="preserve"> multicast path as built. The design is per the 2026-10-13 design spec (</w:t>
       </w:r>
       <w:r>
         <w:rPr>
@@ -30590,7 +30777,7 @@
       </w:r>
       <w:r>
         <w:rPr/>
-        <w:t>). No RTL implementation exists yet.</w:t>
+        <w:t>).</w:t>
       </w:r>
     </w:p>
     <w:p>
@@ -30602,7 +30789,7 @@
         <w:rPr>
           <w:sz w:val="20"/>
         </w:rPr>
-        <w:t>Multicast is restricted to VC0. The routing table supplies a multi-hot output port mask, and the cell builds a BRCP-conformed path: every branch follows the base unicast routing function so multicast adds no new channel dependencies beyond the unicast proof [D9].</w:t>
+        <w:t>Multicast is restricted to VC0. The routing table supplies a multi-hot output port mask, and the cell builds a BRCP-conformed path: every branch follows the base unicast routing function so multicast adds no new channel dependencies beyond the unicast proof [D9]. The implementation floods a multicast packet along a BFS tree from the source, replicating at branching cells.</w:t>
       </w:r>
       <w:r>
         <w:br w:type="page"/>
@@ -30617,7 +30804,7 @@
         <w:spacing w:before="280" w:after="80"/>
         <w:rPr/>
       </w:pPr>
-      <w:bookmarkStart w:id="326" w:name="__RefHeading___Toc6255_1375447347"/>
+      <w:bookmarkStart w:id="326" w:name="__RefHeading___Toc6458_2586448665"/>
       <w:bookmarkStart w:id="327" w:name="source-side-replication"/>
       <w:bookmarkEnd w:id="326"/>
       <w:r>
@@ -30665,7 +30852,7 @@
         <w:spacing w:before="280" w:after="80"/>
         <w:rPr/>
       </w:pPr>
-      <w:bookmarkStart w:id="329" w:name="__RefHeading___Toc6257_1375447347"/>
+      <w:bookmarkStart w:id="329" w:name="__RefHeading___Toc6460_2586448665"/>
       <w:bookmarkStart w:id="330" w:name="delivery-vc-assignment"/>
       <w:bookmarkEnd w:id="329"/>
       <w:r>
@@ -30726,7 +30913,7 @@
         <w:spacing w:before="280" w:after="80"/>
         <w:rPr/>
       </w:pPr>
-      <w:bookmarkStart w:id="331" w:name="__RefHeading___Toc6259_1375447347"/>
+      <w:bookmarkStart w:id="331" w:name="__RefHeading___Toc6462_2586448665"/>
       <w:bookmarkEnd w:id="331"/>
       <w:r>
         <w:rPr>
@@ -31207,7 +31394,7 @@
       <w:r>
         <w:br w:type="page"/>
       </w:r>
-      <w:bookmarkStart w:id="334" w:name="__RefHeading___Toc6261_1375447347"/>
+      <w:bookmarkStart w:id="334" w:name="__RefHeading___Toc6464_2586448665"/>
       <w:bookmarkEnd w:id="334"/>
       <w:r>
         <w:rPr>
@@ -31252,7 +31439,7 @@
         <w:spacing w:before="280" w:after="80"/>
         <w:rPr/>
       </w:pPr>
-      <w:bookmarkStart w:id="335" w:name="__RefHeading___Toc6263_1375447347"/>
+      <w:bookmarkStart w:id="335" w:name="__RefHeading___Toc6466_2586448665"/>
       <w:bookmarkStart w:id="336" w:name="references-5"/>
       <w:bookmarkEnd w:id="335"/>
       <w:r>
@@ -31448,7 +31635,7 @@
         <w:spacing w:before="360" w:after="120"/>
         <w:rPr/>
       </w:pPr>
-      <w:bookmarkStart w:id="339" w:name="__RefHeading___Toc6265_1375447347"/>
+      <w:bookmarkStart w:id="339" w:name="__RefHeading___Toc6468_2586448665"/>
       <w:bookmarkStart w:id="340" w:name="observability-counters-and-dft"/>
       <w:bookmarkEnd w:id="339"/>
       <w:r>
@@ -31480,11 +31667,11 @@
           <w:b/>
           <w:bCs/>
         </w:rPr>
-        <w:t>PLANNED:</w:t>
-      </w:r>
-      <w:r>
-        <w:rPr/>
-        <w:t xml:space="preserve"> This chapter describes the planned </w:t>
+        <w:t>IMPLEMENTED:</w:t>
+      </w:r>
+      <w:r>
+        <w:rPr/>
+        <w:t xml:space="preserve"> This chapter describes the </w:t>
       </w:r>
       <w:r>
         <w:rPr>
@@ -31494,7 +31681,7 @@
       </w:r>
       <w:r>
         <w:rPr/>
-        <w:t xml:space="preserve"> microarchitecture per the 2026-10-13 design spec (</w:t>
+        <w:t xml:space="preserve"> counter bank and DFT mode as built. The design is per the 2026-10-13 design spec (</w:t>
       </w:r>
       <w:r>
         <w:rPr>
@@ -31504,7 +31691,7 @@
       </w:r>
       <w:r>
         <w:rPr/>
-        <w:t>). No RTL implementation exists yet.</w:t>
+        <w:t>).</w:t>
       </w:r>
       <w:r>
         <w:br w:type="page"/>
@@ -31519,8 +31706,8 @@
         <w:spacing w:before="280" w:after="80"/>
         <w:rPr/>
       </w:pPr>
-      <w:bookmarkStart w:id="341" w:name="__RefHeading___Toc6267_1375447347"/>
-      <w:bookmarkStart w:id="342" w:name="ocelus-counter-suite"/>
+      <w:bookmarkStart w:id="341" w:name="__RefHeading___Toc6470_2586448665"/>
+      <w:bookmarkStart w:id="342" w:name="ocelus-counter-bank"/>
       <w:bookmarkEnd w:id="341"/>
       <w:r>
         <w:rPr>
@@ -31538,7 +31725,7 @@
           <w:sz w:val="28"/>
         </w:rPr>
         <w:tab/>
-        <w:t>Ocelus Counter Suite</w:t>
+        <w:t>Ocelus Counter Bank</w:t>
       </w:r>
     </w:p>
     <w:p>
@@ -31550,20 +31737,46 @@
         <w:rPr>
           <w:sz w:val="20"/>
         </w:rPr>
-        <w:t xml:space="preserve">The ocelus observability block attaches to every input/output port and every VC. Counters clear on </w:t>
+        <w:t xml:space="preserve">The cell exposes eleven 32-bit saturating counters through the config-read path. The counter bank is selected by setting </w:t>
       </w:r>
       <w:r>
         <w:rPr>
           <w:rStyle w:val="VerbatimChar"/>
           <w:sz w:val="20"/>
         </w:rPr>
+        <w:t>table_index[15] = 1</w:t>
+      </w:r>
+      <w:r>
+        <w:rPr>
+          <w:sz w:val="20"/>
+        </w:rPr>
+        <w:t xml:space="preserve">; indices 0..10 are defined and indices above 10 read back 0. Counters are frozen when </w:t>
+      </w:r>
+      <w:r>
+        <w:rPr>
+          <w:rStyle w:val="VerbatimChar"/>
+          <w:sz w:val="20"/>
+        </w:rPr>
+        <w:t>ENABLE_COUNTERS == 0</w:t>
+      </w:r>
+      <w:r>
+        <w:rPr>
+          <w:sz w:val="20"/>
+        </w:rPr>
+        <w:t xml:space="preserve"> and clear on </w:t>
+      </w:r>
+      <w:r>
+        <w:rPr>
+          <w:rStyle w:val="VerbatimChar"/>
+          <w:sz w:val="20"/>
+        </w:rPr>
         <w:t>aresetn</w:t>
       </w:r>
       <w:r>
         <w:rPr>
           <w:sz w:val="20"/>
         </w:rPr>
-        <w:t xml:space="preserve"> and are readable through the config port.</w:t>
+        <w:t>.</w:t>
       </w:r>
     </w:p>
     <w:p>
@@ -31571,10 +31784,10 @@
         <w:pStyle w:val="TableCaption"/>
         <w:rPr/>
       </w:pPr>
-      <w:bookmarkStart w:id="343" w:name="_Tab_17_Ocelus_counter_suite"/>
-      <w:r>
-        <w:rPr/>
-        <w:t>Ocelus counter suite</w:t>
+      <w:bookmarkStart w:id="343" w:name="_Tab_17_Ocelus_counter_bank_"/>
+      <w:r>
+        <w:rPr/>
+        <w:t>Ocelus counter bank indices.</w:t>
       </w:r>
       <w:bookmarkEnd w:id="343"/>
     </w:p>
@@ -31634,7 +31847,7 @@
                 <w:szCs w:val="24"/>
                 <w:lang w:val="en-US" w:eastAsia="en-US" w:bidi="ar-SA"/>
               </w:rPr>
-              <w:t>Counter group</w:t>
+              <w:t>Index</w:t>
             </w:r>
           </w:p>
         </w:tc>
@@ -31670,7 +31883,7 @@
                 <w:szCs w:val="24"/>
                 <w:lang w:val="en-US" w:eastAsia="en-US" w:bidi="ar-SA"/>
               </w:rPr>
-              <w:t>What it counts</w:t>
+              <w:t>Name</w:t>
             </w:r>
           </w:p>
         </w:tc>
@@ -31706,7 +31919,7 @@
                 <w:szCs w:val="24"/>
                 <w:lang w:val="en-US" w:eastAsia="en-US" w:bidi="ar-SA"/>
               </w:rPr>
-              <w:t>Use</w:t>
+              <w:t>What it counts</w:t>
             </w:r>
           </w:p>
         </w:tc>
@@ -31740,7 +31953,7 @@
                 <w:szCs w:val="24"/>
                 <w:lang w:val="en-US" w:eastAsia="en-US" w:bidi="ar-SA"/>
               </w:rPr>
-              <w:t>Flit counts</w:t>
+              <w:t>0</w:t>
             </w:r>
           </w:p>
         </w:tc>
@@ -31771,7 +31984,7 @@
                 <w:szCs w:val="24"/>
                 <w:lang w:val="en-US" w:eastAsia="en-US" w:bidi="ar-SA"/>
               </w:rPr>
-              <w:t>Sent and received flits per port/VC</w:t>
+              <w:t>C_FLITS_IN</w:t>
             </w:r>
           </w:p>
         </w:tc>
@@ -31802,7 +32015,7 @@
                 <w:szCs w:val="24"/>
                 <w:lang w:val="en-US" w:eastAsia="en-US" w:bidi="ar-SA"/>
               </w:rPr>
-              <w:t>Throughput sanity</w:t>
+              <w:t>Flits received by the cell</w:t>
             </w:r>
           </w:p>
         </w:tc>
@@ -31836,7 +32049,7 @@
                 <w:szCs w:val="24"/>
                 <w:lang w:val="en-US" w:eastAsia="en-US" w:bidi="ar-SA"/>
               </w:rPr>
-              <w:t>Packet counts</w:t>
+              <w:t>1</w:t>
             </w:r>
           </w:p>
         </w:tc>
@@ -31861,23 +32074,13 @@
             </w:pPr>
             <w:r>
               <w:rPr>
-                <w:rStyle w:val="VerbatimChar"/>
                 <w:rFonts w:eastAsia="Cambria" w:cs=""/>
                 <w:kern w:val="0"/>
-                <w:szCs w:val="24"/>
-                <w:lang w:val="en-US" w:eastAsia="en-US" w:bidi="ar-SA"/>
-              </w:rPr>
-              <w:t>TLAST</w:t>
-            </w:r>
-            <w:r>
-              <w:rPr>
-                <w:rFonts w:eastAsia="Cambria" w:cs=""/>
-                <w:kern w:val="0"/>
-                <w:sz w:val="24"/>
-                <w:szCs w:val="24"/>
-                <w:lang w:val="en-US" w:eastAsia="en-US" w:bidi="ar-SA"/>
-              </w:rPr>
-              <w:t xml:space="preserve"> handshakes per port/VC</w:t>
+                <w:sz w:val="24"/>
+                <w:szCs w:val="24"/>
+                <w:lang w:val="en-US" w:eastAsia="en-US" w:bidi="ar-SA"/>
+              </w:rPr>
+              <w:t>C_FLITS_OUT</w:t>
             </w:r>
           </w:p>
         </w:tc>
@@ -31908,7 +32111,7 @@
                 <w:szCs w:val="24"/>
                 <w:lang w:val="en-US" w:eastAsia="en-US" w:bidi="ar-SA"/>
               </w:rPr>
-              <w:t>Packet completion</w:t>
+              <w:t>Flits transmitted by the cell</w:t>
             </w:r>
           </w:p>
         </w:tc>
@@ -31942,7 +32145,7 @@
                 <w:szCs w:val="24"/>
                 <w:lang w:val="en-US" w:eastAsia="en-US" w:bidi="ar-SA"/>
               </w:rPr>
-              <w:t>Stall cycles</w:t>
+              <w:t>2</w:t>
             </w:r>
           </w:p>
         </w:tc>
@@ -31973,7 +32176,7 @@
                 <w:szCs w:val="24"/>
                 <w:lang w:val="en-US" w:eastAsia="en-US" w:bidi="ar-SA"/>
               </w:rPr>
-              <w:t>Per-VC backpressure cycles</w:t>
+              <w:t>C_PKTS_IN</w:t>
             </w:r>
           </w:p>
         </w:tc>
@@ -32004,7 +32207,27 @@
                 <w:szCs w:val="24"/>
                 <w:lang w:val="en-US" w:eastAsia="en-US" w:bidi="ar-SA"/>
               </w:rPr>
-              <w:t>Congestion location</w:t>
+              <w:t>Packets received (</w:t>
+            </w:r>
+            <w:r>
+              <w:rPr>
+                <w:rStyle w:val="VerbatimChar"/>
+                <w:rFonts w:eastAsia="Cambria" w:cs=""/>
+                <w:kern w:val="0"/>
+                <w:szCs w:val="24"/>
+                <w:lang w:val="en-US" w:eastAsia="en-US" w:bidi="ar-SA"/>
+              </w:rPr>
+              <w:t>TLAST</w:t>
+            </w:r>
+            <w:r>
+              <w:rPr>
+                <w:rFonts w:eastAsia="Cambria" w:cs=""/>
+                <w:kern w:val="0"/>
+                <w:sz w:val="24"/>
+                <w:szCs w:val="24"/>
+                <w:lang w:val="en-US" w:eastAsia="en-US" w:bidi="ar-SA"/>
+              </w:rPr>
+              <w:t xml:space="preserve"> handshakes)</w:t>
             </w:r>
           </w:p>
         </w:tc>
@@ -32038,7 +32261,7 @@
                 <w:szCs w:val="24"/>
                 <w:lang w:val="en-US" w:eastAsia="en-US" w:bidi="ar-SA"/>
               </w:rPr>
-              <w:t>Arbitration</w:t>
+              <w:t>3</w:t>
             </w:r>
           </w:p>
         </w:tc>
@@ -32069,7 +32292,7 @@
                 <w:szCs w:val="24"/>
                 <w:lang w:val="en-US" w:eastAsia="en-US" w:bidi="ar-SA"/>
               </w:rPr>
-              <w:t>Win/loss per QoS class</w:t>
+              <w:t>C_PKTS_OUT</w:t>
             </w:r>
           </w:p>
         </w:tc>
@@ -32100,7 +32323,27 @@
                 <w:szCs w:val="24"/>
                 <w:lang w:val="en-US" w:eastAsia="en-US" w:bidi="ar-SA"/>
               </w:rPr>
-              <w:t>Fairness and aging verification</w:t>
+              <w:t>Packets transmitted (</w:t>
+            </w:r>
+            <w:r>
+              <w:rPr>
+                <w:rStyle w:val="VerbatimChar"/>
+                <w:rFonts w:eastAsia="Cambria" w:cs=""/>
+                <w:kern w:val="0"/>
+                <w:szCs w:val="24"/>
+                <w:lang w:val="en-US" w:eastAsia="en-US" w:bidi="ar-SA"/>
+              </w:rPr>
+              <w:t>TLAST</w:t>
+            </w:r>
+            <w:r>
+              <w:rPr>
+                <w:rFonts w:eastAsia="Cambria" w:cs=""/>
+                <w:kern w:val="0"/>
+                <w:sz w:val="24"/>
+                <w:szCs w:val="24"/>
+                <w:lang w:val="en-US" w:eastAsia="en-US" w:bidi="ar-SA"/>
+              </w:rPr>
+              <w:t xml:space="preserve"> handshakes)</w:t>
             </w:r>
           </w:p>
         </w:tc>
@@ -32134,7 +32377,7 @@
                 <w:szCs w:val="24"/>
                 <w:lang w:val="en-US" w:eastAsia="en-US" w:bidi="ar-SA"/>
               </w:rPr>
-              <w:t>Queue occupancy</w:t>
+              <w:t>4</w:t>
             </w:r>
           </w:p>
         </w:tc>
@@ -32165,7 +32408,7 @@
                 <w:szCs w:val="24"/>
                 <w:lang w:val="en-US" w:eastAsia="en-US" w:bidi="ar-SA"/>
               </w:rPr>
-              <w:t>Current and max watermark</w:t>
+              <w:t>C_STALL_CYCLES</w:t>
             </w:r>
           </w:p>
         </w:tc>
@@ -32196,7 +32439,7 @@
                 <w:szCs w:val="24"/>
                 <w:lang w:val="en-US" w:eastAsia="en-US" w:bidi="ar-SA"/>
               </w:rPr>
-              <w:t>Buffer sizing feedback</w:t>
+              <w:t>Output stall cycles</w:t>
             </w:r>
           </w:p>
         </w:tc>
@@ -32230,7 +32473,7 @@
                 <w:szCs w:val="24"/>
                 <w:lang w:val="en-US" w:eastAsia="en-US" w:bidi="ar-SA"/>
               </w:rPr>
-              <w:t>Latency</w:t>
+              <w:t>5</w:t>
             </w:r>
           </w:p>
         </w:tc>
@@ -32261,7 +32504,7 @@
                 <w:szCs w:val="24"/>
                 <w:lang w:val="en-US" w:eastAsia="en-US" w:bidi="ar-SA"/>
               </w:rPr>
-              <w:t>Injection-to-ejection min/avg/max + jitter</w:t>
+              <w:t>C_CREDIT_STALL</w:t>
             </w:r>
           </w:p>
         </w:tc>
@@ -32292,7 +32535,7 @@
                 <w:szCs w:val="24"/>
                 <w:lang w:val="en-US" w:eastAsia="en-US" w:bidi="ar-SA"/>
               </w:rPr>
-              <w:t>Perf model calibration</w:t>
+              <w:t>Cycles a granted output waited for downstream credit</w:t>
             </w:r>
           </w:p>
         </w:tc>
@@ -32326,7 +32569,7 @@
                 <w:szCs w:val="24"/>
                 <w:lang w:val="en-US" w:eastAsia="en-US" w:bidi="ar-SA"/>
               </w:rPr>
-              <w:t>Multicast</w:t>
+              <w:t>6</w:t>
             </w:r>
           </w:p>
         </w:tc>
@@ -32357,7 +32600,7 @@
                 <w:szCs w:val="24"/>
                 <w:lang w:val="en-US" w:eastAsia="en-US" w:bidi="ar-SA"/>
               </w:rPr>
-              <w:t>Replication count per branch</w:t>
+              <w:t>C_ERR_DROP</w:t>
             </w:r>
           </w:p>
         </w:tc>
@@ -32388,7 +32631,27 @@
                 <w:szCs w:val="24"/>
                 <w:lang w:val="en-US" w:eastAsia="en-US" w:bidi="ar-SA"/>
               </w:rPr>
-              <w:t>Multicast coverage</w:t>
+              <w:t xml:space="preserve">Malformed-destination drops (mirrors </w:t>
+            </w:r>
+            <w:r>
+              <w:rPr>
+                <w:rStyle w:val="VerbatimChar"/>
+                <w:rFonts w:eastAsia="Cambria" w:cs=""/>
+                <w:kern w:val="0"/>
+                <w:szCs w:val="24"/>
+                <w:lang w:val="en-US" w:eastAsia="en-US" w:bidi="ar-SA"/>
+              </w:rPr>
+              <w:t>o_err_drop_cnt</w:t>
+            </w:r>
+            <w:r>
+              <w:rPr>
+                <w:rFonts w:eastAsia="Cambria" w:cs=""/>
+                <w:kern w:val="0"/>
+                <w:sz w:val="24"/>
+                <w:szCs w:val="24"/>
+                <w:lang w:val="en-US" w:eastAsia="en-US" w:bidi="ar-SA"/>
+              </w:rPr>
+              <w:t>)</w:t>
             </w:r>
           </w:p>
         </w:tc>
@@ -32422,7 +32685,7 @@
                 <w:szCs w:val="24"/>
                 <w:lang w:val="en-US" w:eastAsia="en-US" w:bidi="ar-SA"/>
               </w:rPr>
-              <w:t>Errors</w:t>
+              <w:t>7</w:t>
             </w:r>
           </w:p>
         </w:tc>
@@ -32453,7 +32716,7 @@
                 <w:szCs w:val="24"/>
                 <w:lang w:val="en-US" w:eastAsia="en-US" w:bidi="ar-SA"/>
               </w:rPr>
-              <w:t>Misroute drops, credit starvation events</w:t>
+              <w:t>C_MODE_ACKS</w:t>
             </w:r>
           </w:p>
         </w:tc>
@@ -32484,7 +32747,315 @@
                 <w:szCs w:val="24"/>
                 <w:lang w:val="en-US" w:eastAsia="en-US" w:bidi="ar-SA"/>
               </w:rPr>
-              <w:t>Debug</w:t>
+              <w:t xml:space="preserve">Broadcast mode-switch acks received (mirrors </w:t>
+            </w:r>
+            <w:r>
+              <w:rPr>
+                <w:rStyle w:val="VerbatimChar"/>
+                <w:rFonts w:eastAsia="Cambria" w:cs=""/>
+                <w:kern w:val="0"/>
+                <w:szCs w:val="24"/>
+                <w:lang w:val="en-US" w:eastAsia="en-US" w:bidi="ar-SA"/>
+              </w:rPr>
+              <w:t>o_mode_acks</w:t>
+            </w:r>
+            <w:r>
+              <w:rPr>
+                <w:rFonts w:eastAsia="Cambria" w:cs=""/>
+                <w:kern w:val="0"/>
+                <w:sz w:val="24"/>
+                <w:szCs w:val="24"/>
+                <w:lang w:val="en-US" w:eastAsia="en-US" w:bidi="ar-SA"/>
+              </w:rPr>
+              <w:t>)</w:t>
+            </w:r>
+          </w:p>
+        </w:tc>
+      </w:tr>
+      <w:tr>
+        <w:trPr/>
+        <w:tc>
+          <w:tcPr>
+            <w:tcW w:w="3120" w:type="dxa"/>
+            <w:tcBorders/>
+          </w:tcPr>
+          <w:p>
+            <w:pPr>
+              <w:pStyle w:val="Compact"/>
+              <w:widowControl/>
+              <w:spacing w:before="36" w:after="36"/>
+              <w:jc w:val="left"/>
+              <w:rPr>
+                <w:rFonts w:ascii="Cambria" w:hAnsi="Cambria" w:eastAsia="Cambria" w:cs=""/>
+                <w:kern w:val="0"/>
+                <w:sz w:val="24"/>
+                <w:szCs w:val="24"/>
+                <w:lang w:val="en-US" w:eastAsia="en-US" w:bidi="ar-SA"/>
+              </w:rPr>
+            </w:pPr>
+            <w:r>
+              <w:rPr>
+                <w:rFonts w:eastAsia="Cambria" w:cs=""/>
+                <w:kern w:val="0"/>
+                <w:sz w:val="24"/>
+                <w:szCs w:val="24"/>
+                <w:lang w:val="en-US" w:eastAsia="en-US" w:bidi="ar-SA"/>
+              </w:rPr>
+              <w:t>8</w:t>
+            </w:r>
+          </w:p>
+        </w:tc>
+        <w:tc>
+          <w:tcPr>
+            <w:tcW w:w="3120" w:type="dxa"/>
+            <w:tcBorders/>
+          </w:tcPr>
+          <w:p>
+            <w:pPr>
+              <w:pStyle w:val="Compact"/>
+              <w:widowControl/>
+              <w:spacing w:before="36" w:after="36"/>
+              <w:jc w:val="left"/>
+              <w:rPr>
+                <w:rFonts w:ascii="Cambria" w:hAnsi="Cambria" w:eastAsia="Cambria" w:cs=""/>
+                <w:kern w:val="0"/>
+                <w:sz w:val="24"/>
+                <w:szCs w:val="24"/>
+                <w:lang w:val="en-US" w:eastAsia="en-US" w:bidi="ar-SA"/>
+              </w:rPr>
+            </w:pPr>
+            <w:r>
+              <w:rPr>
+                <w:rFonts w:eastAsia="Cambria" w:cs=""/>
+                <w:kern w:val="0"/>
+                <w:sz w:val="24"/>
+                <w:szCs w:val="24"/>
+                <w:lang w:val="en-US" w:eastAsia="en-US" w:bidi="ar-SA"/>
+              </w:rPr>
+              <w:t>C_BULK_STARVE</w:t>
+            </w:r>
+          </w:p>
+        </w:tc>
+        <w:tc>
+          <w:tcPr>
+            <w:tcW w:w="3120" w:type="dxa"/>
+            <w:tcBorders/>
+          </w:tcPr>
+          <w:p>
+            <w:pPr>
+              <w:pStyle w:val="Compact"/>
+              <w:widowControl/>
+              <w:spacing w:before="36" w:after="36"/>
+              <w:jc w:val="left"/>
+              <w:rPr>
+                <w:rFonts w:ascii="Cambria" w:hAnsi="Cambria" w:eastAsia="Cambria" w:cs=""/>
+                <w:kern w:val="0"/>
+                <w:sz w:val="24"/>
+                <w:szCs w:val="24"/>
+                <w:lang w:val="en-US" w:eastAsia="en-US" w:bidi="ar-SA"/>
+              </w:rPr>
+            </w:pPr>
+            <w:r>
+              <w:rPr>
+                <w:rFonts w:eastAsia="Cambria" w:cs=""/>
+                <w:kern w:val="0"/>
+                <w:sz w:val="24"/>
+                <w:szCs w:val="24"/>
+                <w:lang w:val="en-US" w:eastAsia="en-US" w:bidi="ar-SA"/>
+              </w:rPr>
+              <w:t>Cycles bulk reservation was due</w:t>
+            </w:r>
+          </w:p>
+        </w:tc>
+      </w:tr>
+      <w:tr>
+        <w:trPr/>
+        <w:tc>
+          <w:tcPr>
+            <w:tcW w:w="3120" w:type="dxa"/>
+            <w:tcBorders/>
+          </w:tcPr>
+          <w:p>
+            <w:pPr>
+              <w:pStyle w:val="Compact"/>
+              <w:widowControl/>
+              <w:spacing w:before="36" w:after="36"/>
+              <w:jc w:val="left"/>
+              <w:rPr>
+                <w:rFonts w:ascii="Cambria" w:hAnsi="Cambria" w:eastAsia="Cambria" w:cs=""/>
+                <w:kern w:val="0"/>
+                <w:sz w:val="24"/>
+                <w:szCs w:val="24"/>
+                <w:lang w:val="en-US" w:eastAsia="en-US" w:bidi="ar-SA"/>
+              </w:rPr>
+            </w:pPr>
+            <w:r>
+              <w:rPr>
+                <w:rFonts w:eastAsia="Cambria" w:cs=""/>
+                <w:kern w:val="0"/>
+                <w:sz w:val="24"/>
+                <w:szCs w:val="24"/>
+                <w:lang w:val="en-US" w:eastAsia="en-US" w:bidi="ar-SA"/>
+              </w:rPr>
+              <w:t>9</w:t>
+            </w:r>
+          </w:p>
+        </w:tc>
+        <w:tc>
+          <w:tcPr>
+            <w:tcW w:w="3120" w:type="dxa"/>
+            <w:tcBorders/>
+          </w:tcPr>
+          <w:p>
+            <w:pPr>
+              <w:pStyle w:val="Compact"/>
+              <w:widowControl/>
+              <w:spacing w:before="36" w:after="36"/>
+              <w:jc w:val="left"/>
+              <w:rPr>
+                <w:rFonts w:ascii="Cambria" w:hAnsi="Cambria" w:eastAsia="Cambria" w:cs=""/>
+                <w:kern w:val="0"/>
+                <w:sz w:val="24"/>
+                <w:szCs w:val="24"/>
+                <w:lang w:val="en-US" w:eastAsia="en-US" w:bidi="ar-SA"/>
+              </w:rPr>
+            </w:pPr>
+            <w:r>
+              <w:rPr>
+                <w:rFonts w:eastAsia="Cambria" w:cs=""/>
+                <w:kern w:val="0"/>
+                <w:sz w:val="24"/>
+                <w:szCs w:val="24"/>
+                <w:lang w:val="en-US" w:eastAsia="en-US" w:bidi="ar-SA"/>
+              </w:rPr>
+              <w:t>C_SPEC_COMMITS</w:t>
+            </w:r>
+          </w:p>
+        </w:tc>
+        <w:tc>
+          <w:tcPr>
+            <w:tcW w:w="3120" w:type="dxa"/>
+            <w:tcBorders/>
+          </w:tcPr>
+          <w:p>
+            <w:pPr>
+              <w:pStyle w:val="Compact"/>
+              <w:widowControl/>
+              <w:spacing w:before="36" w:after="36"/>
+              <w:jc w:val="left"/>
+              <w:rPr>
+                <w:rFonts w:ascii="Cambria" w:hAnsi="Cambria" w:eastAsia="Cambria" w:cs=""/>
+                <w:kern w:val="0"/>
+                <w:sz w:val="24"/>
+                <w:szCs w:val="24"/>
+                <w:lang w:val="en-US" w:eastAsia="en-US" w:bidi="ar-SA"/>
+              </w:rPr>
+            </w:pPr>
+            <w:r>
+              <w:rPr>
+                <w:rFonts w:eastAsia="Cambria" w:cs=""/>
+                <w:kern w:val="0"/>
+                <w:sz w:val="24"/>
+                <w:szCs w:val="24"/>
+                <w:lang w:val="en-US" w:eastAsia="en-US" w:bidi="ar-SA"/>
+              </w:rPr>
+              <w:t>Speculative grants that committed</w:t>
+            </w:r>
+          </w:p>
+        </w:tc>
+      </w:tr>
+      <w:tr>
+        <w:trPr/>
+        <w:tc>
+          <w:tcPr>
+            <w:tcW w:w="3120" w:type="dxa"/>
+            <w:tcBorders/>
+          </w:tcPr>
+          <w:p>
+            <w:pPr>
+              <w:pStyle w:val="Compact"/>
+              <w:widowControl/>
+              <w:spacing w:before="36" w:after="36"/>
+              <w:jc w:val="left"/>
+              <w:rPr>
+                <w:rFonts w:ascii="Cambria" w:hAnsi="Cambria" w:eastAsia="Cambria" w:cs=""/>
+                <w:kern w:val="0"/>
+                <w:sz w:val="24"/>
+                <w:szCs w:val="24"/>
+                <w:lang w:val="en-US" w:eastAsia="en-US" w:bidi="ar-SA"/>
+              </w:rPr>
+            </w:pPr>
+            <w:r>
+              <w:rPr>
+                <w:rFonts w:eastAsia="Cambria" w:cs=""/>
+                <w:kern w:val="0"/>
+                <w:sz w:val="24"/>
+                <w:szCs w:val="24"/>
+                <w:lang w:val="en-US" w:eastAsia="en-US" w:bidi="ar-SA"/>
+              </w:rPr>
+              <w:t>10</w:t>
+            </w:r>
+          </w:p>
+        </w:tc>
+        <w:tc>
+          <w:tcPr>
+            <w:tcW w:w="3120" w:type="dxa"/>
+            <w:tcBorders/>
+          </w:tcPr>
+          <w:p>
+            <w:pPr>
+              <w:pStyle w:val="Compact"/>
+              <w:widowControl/>
+              <w:spacing w:before="36" w:after="36"/>
+              <w:jc w:val="left"/>
+              <w:rPr>
+                <w:rFonts w:ascii="Cambria" w:hAnsi="Cambria" w:eastAsia="Cambria" w:cs=""/>
+                <w:kern w:val="0"/>
+                <w:sz w:val="24"/>
+                <w:szCs w:val="24"/>
+                <w:lang w:val="en-US" w:eastAsia="en-US" w:bidi="ar-SA"/>
+              </w:rPr>
+            </w:pPr>
+            <w:r>
+              <w:rPr>
+                <w:rFonts w:eastAsia="Cambria" w:cs=""/>
+                <w:kern w:val="0"/>
+                <w:sz w:val="24"/>
+                <w:szCs w:val="24"/>
+                <w:lang w:val="en-US" w:eastAsia="en-US" w:bidi="ar-SA"/>
+              </w:rPr>
+              <w:t>C_SPEC_REVOKES</w:t>
+            </w:r>
+          </w:p>
+        </w:tc>
+        <w:tc>
+          <w:tcPr>
+            <w:tcW w:w="3120" w:type="dxa"/>
+            <w:tcBorders/>
+          </w:tcPr>
+          <w:p>
+            <w:pPr>
+              <w:pStyle w:val="Compact"/>
+              <w:widowControl/>
+              <w:spacing w:before="36" w:after="36"/>
+              <w:jc w:val="left"/>
+              <w:rPr>
+                <w:rFonts w:ascii="Cambria" w:hAnsi="Cambria" w:eastAsia="Cambria" w:cs=""/>
+                <w:kern w:val="0"/>
+                <w:sz w:val="24"/>
+                <w:szCs w:val="24"/>
+                <w:lang w:val="en-US" w:eastAsia="en-US" w:bidi="ar-SA"/>
+              </w:rPr>
+            </w:pPr>
+            <w:r>
+              <w:rPr>
+                <w:rFonts w:eastAsia="Cambria" w:cs=""/>
+                <w:kern w:val="0"/>
+                <w:sz w:val="24"/>
+                <w:szCs w:val="24"/>
+                <w:lang w:val="en-US" w:eastAsia="en-US" w:bidi="ar-SA"/>
+              </w:rPr>
+              <w:t>Speculative grants that were revoked</w:t>
             </w:r>
           </w:p>
         </w:tc>
@@ -32495,12 +33066,12 @@
         <w:pStyle w:val="BodyText"/>
         <w:rPr/>
       </w:pPr>
-      <w:bookmarkStart w:id="344" w:name="ocelus-counter-suite"/>
+      <w:bookmarkStart w:id="344" w:name="ocelus-counter-bank"/>
       <w:r>
         <w:rPr>
           <w:sz w:val="20"/>
         </w:rPr>
-        <w:t>Boundary cells optionally timestamp head flits so end-to-end latency can be measured against the rapids DMA clock. The suite is ahead of the NoC textbook literature, which says little about hardware observability, and is instead modeled on NPU practice [Q4][Q2][Q8].</w:t>
+        <w:t>The suite is ahead of the NoC textbook literature, which says little about hardware observability, and is instead modeled on NPU practice [Q4][Q2][Q8].</w:t>
       </w:r>
       <w:bookmarkEnd w:id="344"/>
       <w:r>
@@ -32516,7 +33087,7 @@
         <w:spacing w:before="280" w:after="80"/>
         <w:rPr/>
       </w:pPr>
-      <w:bookmarkStart w:id="345" w:name="__RefHeading___Toc6269_1375447347"/>
+      <w:bookmarkStart w:id="345" w:name="__RefHeading___Toc6472_2586448665"/>
       <w:bookmarkStart w:id="346" w:name="dft-test-mode"/>
       <w:bookmarkEnd w:id="345"/>
       <w:r>
@@ -32573,20 +33144,33 @@
         <w:rPr>
           <w:sz w:val="20"/>
         </w:rPr>
-        <w:t xml:space="preserve"> is the number of cells in the fabric [N6]. The mode is entered through the config port; a </w:t>
+        <w:t xml:space="preserve"> is the number of cells in the fabric [N6]. The mode is entered through a DFT escape write on the config port (</w:t>
       </w:r>
       <w:r>
         <w:rPr>
           <w:rStyle w:val="VerbatimChar"/>
           <w:sz w:val="20"/>
         </w:rPr>
-        <w:t>test_active</w:t>
+        <w:t>table_index[15:12] = 4'hD</w:t>
       </w:r>
       <w:r>
         <w:rPr>
           <w:sz w:val="20"/>
         </w:rPr>
-        <w:t xml:space="preserve"> output per cell indicates DFT state.</w:t>
+        <w:t xml:space="preserve">, payload bit 0 enables DFT, bits 2:1 select the pattern); each cell drives an </w:t>
+      </w:r>
+      <w:r>
+        <w:rPr>
+          <w:rStyle w:val="VerbatimChar"/>
+          <w:sz w:val="20"/>
+        </w:rPr>
+        <w:t>o_dft_active</w:t>
+      </w:r>
+      <w:r>
+        <w:rPr>
+          <w:sz w:val="20"/>
+        </w:rPr>
+        <w:t xml:space="preserve"> output.</w:t>
       </w:r>
     </w:p>
     <w:p>
@@ -33063,7 +33647,7 @@
         <w:spacing w:before="280" w:after="80"/>
         <w:rPr/>
       </w:pPr>
-      <w:bookmarkStart w:id="348" w:name="__RefHeading___Toc6271_1375447347"/>
+      <w:bookmarkStart w:id="348" w:name="__RefHeading___Toc6474_2586448665"/>
       <w:bookmarkStart w:id="349" w:name="references-6"/>
       <w:bookmarkEnd w:id="348"/>
       <w:r>
@@ -33234,7 +33818,7 @@
         <w:spacing w:before="360" w:after="120"/>
         <w:rPr/>
       </w:pPr>
-      <w:bookmarkStart w:id="352" w:name="__RefHeading___Toc6273_1375447347"/>
+      <w:bookmarkStart w:id="352" w:name="__RefHeading___Toc6476_2586448665"/>
       <w:bookmarkStart w:id="353" w:name="verification-targets"/>
       <w:bookmarkEnd w:id="352"/>
       <w:r>
@@ -33266,11 +33850,11 @@
           <w:b/>
           <w:bCs/>
         </w:rPr>
-        <w:t>PLANNED:</w:t>
-      </w:r>
-      <w:r>
-        <w:rPr/>
-        <w:t xml:space="preserve"> This chapter describes the planned </w:t>
+        <w:t>IMPLEMENTED:</w:t>
+      </w:r>
+      <w:r>
+        <w:rPr/>
+        <w:t xml:space="preserve"> This chapter describes the </w:t>
       </w:r>
       <w:r>
         <w:rPr>
@@ -33280,7 +33864,7 @@
       </w:r>
       <w:r>
         <w:rPr/>
-        <w:t xml:space="preserve"> verification strategy per the 2026-10-13 design spec (</w:t>
+        <w:t xml:space="preserve"> verification suites as built. The design is per the 2026-10-13 design spec (</w:t>
       </w:r>
       <w:r>
         <w:rPr>
@@ -33290,7 +33874,7 @@
       </w:r>
       <w:r>
         <w:rPr/>
-        <w:t>). No RTL implementation exists yet.</w:t>
+        <w:t>).</w:t>
       </w:r>
       <w:r>
         <w:br w:type="page"/>
@@ -33305,7 +33889,7 @@
         <w:spacing w:before="280" w:after="80"/>
         <w:rPr/>
       </w:pPr>
-      <w:bookmarkStart w:id="354" w:name="__RefHeading___Toc6275_1375447347"/>
+      <w:bookmarkStart w:id="354" w:name="__RefHeading___Toc6478_2586448665"/>
       <w:bookmarkEnd w:id="354"/>
       <w:r>
         <w:rPr>
@@ -33335,7 +33919,7 @@
         <w:rPr>
           <w:sz w:val="20"/>
         </w:rPr>
-        <w:t>The mesh verification plan is eight cocotb suites, each driven by a different generator configuration.</w:t>
+        <w:t>The mesh verification plan is ten cocotb suites, each driven by a different generator configuration.</w:t>
       </w:r>
     </w:p>
     <w:p>
@@ -33512,7 +34096,7 @@
                 <w:szCs w:val="24"/>
                 <w:lang w:val="en-US" w:eastAsia="en-US" w:bidi="ar-SA"/>
               </w:rPr>
-              <w:t>Routing</w:t>
+              <w:t>Cell routing</w:t>
             </w:r>
           </w:p>
         </w:tc>
@@ -33608,7 +34192,7 @@
                 <w:szCs w:val="24"/>
                 <w:lang w:val="en-US" w:eastAsia="en-US" w:bidi="ar-SA"/>
               </w:rPr>
-              <w:t>QoS</w:t>
+              <w:t>Fabric 2x2</w:t>
             </w:r>
           </w:p>
         </w:tc>
@@ -33639,7 +34223,7 @@
                 <w:szCs w:val="24"/>
                 <w:lang w:val="en-US" w:eastAsia="en-US" w:bidi="ar-SA"/>
               </w:rPr>
-              <w:t>Strict priority, aging inversion, bulk reservation</w:t>
+              <w:t>All-pairs delivery across multi-hop paths</w:t>
             </w:r>
           </w:p>
         </w:tc>
@@ -33670,7 +34254,7 @@
                 <w:szCs w:val="24"/>
                 <w:lang w:val="en-US" w:eastAsia="en-US" w:bidi="ar-SA"/>
               </w:rPr>
-              <w:t>Class order under saturation; bulk minimum bandwidth</w:t>
+              <w:t>Every packet delivers exactly once</w:t>
             </w:r>
           </w:p>
         </w:tc>
@@ -33704,7 +34288,7 @@
                 <w:szCs w:val="24"/>
                 <w:lang w:val="en-US" w:eastAsia="en-US" w:bidi="ar-SA"/>
               </w:rPr>
-              <w:t>Multicast</w:t>
+              <w:t>Flow control</w:t>
             </w:r>
           </w:p>
         </w:tc>
@@ -33735,7 +34319,7 @@
                 <w:szCs w:val="24"/>
                 <w:lang w:val="en-US" w:eastAsia="en-US" w:bidi="ar-SA"/>
               </w:rPr>
-              <w:t>Fanout correctness, no-response rule, delivery-VC soak</w:t>
+              <w:t>Credit exhaustion, atomicity, steady-state throughput</w:t>
             </w:r>
           </w:p>
         </w:tc>
@@ -33766,7 +34350,7 @@
                 <w:szCs w:val="24"/>
                 <w:lang w:val="en-US" w:eastAsia="en-US" w:bidi="ar-SA"/>
               </w:rPr>
-              <w:t>All destinations receive exactly one copy; no deadlock</w:t>
+              <w:t>No loss, no interleaving, sustained 1 flit/clk</w:t>
             </w:r>
           </w:p>
         </w:tc>
@@ -33800,7 +34384,7 @@
                 <w:szCs w:val="24"/>
                 <w:lang w:val="en-US" w:eastAsia="en-US" w:bidi="ar-SA"/>
               </w:rPr>
-              <w:t>Deadlock soak</w:t>
+              <w:t>Tables</w:t>
             </w:r>
           </w:p>
         </w:tc>
@@ -33831,7 +34415,7 @@
                 <w:szCs w:val="24"/>
                 <w:lang w:val="en-US" w:eastAsia="en-US" w:bidi="ar-SA"/>
               </w:rPr>
-              <w:t>Random adversarial-but-valid tables, VC1 stress with VC0 escape</w:t>
+              <w:t>Malformed-dst drop, cross-VC drop drain, table reroute</w:t>
             </w:r>
           </w:p>
         </w:tc>
@@ -33862,7 +34446,7 @@
                 <w:szCs w:val="24"/>
                 <w:lang w:val="en-US" w:eastAsia="en-US" w:bidi="ar-SA"/>
               </w:rPr>
-              <w:t>No hangs to N × 10^6 flits</w:t>
+              <w:t>Drop counted once; drain stays on its own VC</w:t>
             </w:r>
           </w:p>
         </w:tc>
@@ -33896,7 +34480,7 @@
                 <w:szCs w:val="24"/>
                 <w:lang w:val="en-US" w:eastAsia="en-US" w:bidi="ar-SA"/>
               </w:rPr>
-              <w:t>Systolic</w:t>
+              <w:t>Modes</w:t>
             </w:r>
           </w:p>
         </w:tc>
@@ -33927,7 +34511,7 @@
                 <w:szCs w:val="24"/>
                 <w:lang w:val="en-US" w:eastAsia="en-US" w:bidi="ar-SA"/>
               </w:rPr>
-              <w:t>Torus ring, wavefront, source-route fixed latency, 3-D stencil</w:t>
+              <w:t>Broadcast mode-switch, ack barrier, mode images 1/2/3/5/6</w:t>
             </w:r>
           </w:p>
         </w:tc>
@@ -33958,7 +34542,7 @@
                 <w:szCs w:val="24"/>
                 <w:lang w:val="en-US" w:eastAsia="en-US" w:bidi="ar-SA"/>
               </w:rPr>
-              <w:t>1 cycle/hop steady state where lookahead applies</w:t>
+              <w:t>Barrier completes; traffic routes per selected image</w:t>
             </w:r>
           </w:p>
         </w:tc>
@@ -33992,7 +34576,7 @@
                 <w:szCs w:val="24"/>
                 <w:lang w:val="en-US" w:eastAsia="en-US" w:bidi="ar-SA"/>
               </w:rPr>
-              <w:t>Counters</w:t>
+              <w:t>Tetrad</w:t>
             </w:r>
           </w:p>
         </w:tc>
@@ -34023,7 +34607,7 @@
                 <w:szCs w:val="24"/>
                 <w:lang w:val="en-US" w:eastAsia="en-US" w:bidi="ar-SA"/>
               </w:rPr>
-              <w:t>Every ocelus counter against golden model</w:t>
+              <w:t>Mode 9 K4 all-to-all, P_DIA one-hop latency</w:t>
             </w:r>
           </w:p>
         </w:tc>
@@ -34054,7 +34638,7 @@
                 <w:szCs w:val="24"/>
                 <w:lang w:val="en-US" w:eastAsia="en-US" w:bidi="ar-SA"/>
               </w:rPr>
-              <w:t>Count match over scripted traffic</w:t>
+              <w:t>All 12 ordered pairs deliver in 1 hop</w:t>
             </w:r>
           </w:p>
         </w:tc>
@@ -34088,7 +34672,7 @@
                 <w:szCs w:val="24"/>
                 <w:lang w:val="en-US" w:eastAsia="en-US" w:bidi="ar-SA"/>
               </w:rPr>
-              <w:t>DFT mode</w:t>
+              <w:t>Tile</w:t>
             </w:r>
           </w:p>
         </w:tc>
@@ -34119,7 +34703,7 @@
                 <w:szCs w:val="24"/>
                 <w:lang w:val="en-US" w:eastAsia="en-US" w:bidi="ar-SA"/>
               </w:rPr>
-              <w:t>Three patterns route correctly</w:t>
+              <w:t>Mode 10 K4-of-tetrads, P_DIA2 one-hop latency</w:t>
             </w:r>
           </w:p>
         </w:tc>
@@ -34150,27 +34734,7 @@
                 <w:szCs w:val="24"/>
                 <w:lang w:val="en-US" w:eastAsia="en-US" w:bidi="ar-SA"/>
               </w:rPr>
-              <w:t xml:space="preserve">Pattern count and </w:t>
-            </w:r>
-            <w:r>
-              <w:rPr>
-                <w:rStyle w:val="VerbatimChar"/>
-                <w:rFonts w:eastAsia="Cambria" w:cs=""/>
-                <w:kern w:val="0"/>
-                <w:szCs w:val="24"/>
-                <w:lang w:val="en-US" w:eastAsia="en-US" w:bidi="ar-SA"/>
-              </w:rPr>
-              <w:t>test_active</w:t>
-            </w:r>
-            <w:r>
-              <w:rPr>
-                <w:rFonts w:eastAsia="Cambria" w:cs=""/>
-                <w:kern w:val="0"/>
-                <w:sz w:val="24"/>
-                <w:szCs w:val="24"/>
-                <w:lang w:val="en-US" w:eastAsia="en-US" w:bidi="ar-SA"/>
-              </w:rPr>
-              <w:t xml:space="preserve"> behavior</w:t>
+              <w:t>Diagonal-tetrad pairs deliver in 1 hop</w:t>
             </w:r>
           </w:p>
         </w:tc>
@@ -34204,7 +34768,7 @@
                 <w:szCs w:val="24"/>
                 <w:lang w:val="en-US" w:eastAsia="en-US" w:bidi="ar-SA"/>
               </w:rPr>
-              <w:t>Perf model calibration</w:t>
+              <w:t>QoS</w:t>
             </w:r>
           </w:p>
         </w:tc>
@@ -34235,7 +34799,7 @@
                 <w:szCs w:val="24"/>
                 <w:lang w:val="en-US" w:eastAsia="en-US" w:bidi="ar-SA"/>
               </w:rPr>
-              <w:t>Measured vs modeled latency/throughput</w:t>
+              <w:t>Strict priority, aging inversion, bulk reservation</w:t>
             </w:r>
           </w:p>
         </w:tc>
@@ -34266,7 +34830,401 @@
                 <w:szCs w:val="24"/>
                 <w:lang w:val="en-US" w:eastAsia="en-US" w:bidi="ar-SA"/>
               </w:rPr>
-              <w:t>Reported deltas within tolerance</w:t>
+              <w:t>Class order under saturation; bulk minimum bandwidth</w:t>
+            </w:r>
+          </w:p>
+        </w:tc>
+      </w:tr>
+      <w:tr>
+        <w:trPr/>
+        <w:tc>
+          <w:tcPr>
+            <w:tcW w:w="3120" w:type="dxa"/>
+            <w:tcBorders/>
+          </w:tcPr>
+          <w:p>
+            <w:pPr>
+              <w:pStyle w:val="Compact"/>
+              <w:widowControl/>
+              <w:spacing w:before="36" w:after="36"/>
+              <w:jc w:val="left"/>
+              <w:rPr>
+                <w:rFonts w:ascii="Cambria" w:hAnsi="Cambria" w:eastAsia="Cambria" w:cs=""/>
+                <w:kern w:val="0"/>
+                <w:sz w:val="24"/>
+                <w:szCs w:val="24"/>
+                <w:lang w:val="en-US" w:eastAsia="en-US" w:bidi="ar-SA"/>
+              </w:rPr>
+            </w:pPr>
+            <w:r>
+              <w:rPr>
+                <w:rFonts w:eastAsia="Cambria" w:cs=""/>
+                <w:kern w:val="0"/>
+                <w:sz w:val="24"/>
+                <w:szCs w:val="24"/>
+                <w:lang w:val="en-US" w:eastAsia="en-US" w:bidi="ar-SA"/>
+              </w:rPr>
+              <w:t>Multicast</w:t>
+            </w:r>
+          </w:p>
+        </w:tc>
+        <w:tc>
+          <w:tcPr>
+            <w:tcW w:w="3120" w:type="dxa"/>
+            <w:tcBorders/>
+          </w:tcPr>
+          <w:p>
+            <w:pPr>
+              <w:pStyle w:val="Compact"/>
+              <w:widowControl/>
+              <w:spacing w:before="36" w:after="36"/>
+              <w:jc w:val="left"/>
+              <w:rPr>
+                <w:rFonts w:ascii="Cambria" w:hAnsi="Cambria" w:eastAsia="Cambria" w:cs=""/>
+                <w:kern w:val="0"/>
+                <w:sz w:val="24"/>
+                <w:szCs w:val="24"/>
+                <w:lang w:val="en-US" w:eastAsia="en-US" w:bidi="ar-SA"/>
+              </w:rPr>
+            </w:pPr>
+            <w:r>
+              <w:rPr>
+                <w:rFonts w:eastAsia="Cambria" w:cs=""/>
+                <w:kern w:val="0"/>
+                <w:sz w:val="24"/>
+                <w:szCs w:val="24"/>
+                <w:lang w:val="en-US" w:eastAsia="en-US" w:bidi="ar-SA"/>
+              </w:rPr>
+              <w:t>Fanout correctness, no-response rule, deadlock soak</w:t>
+            </w:r>
+          </w:p>
+        </w:tc>
+        <w:tc>
+          <w:tcPr>
+            <w:tcW w:w="3120" w:type="dxa"/>
+            <w:tcBorders/>
+          </w:tcPr>
+          <w:p>
+            <w:pPr>
+              <w:pStyle w:val="Compact"/>
+              <w:widowControl/>
+              <w:spacing w:before="36" w:after="36"/>
+              <w:jc w:val="left"/>
+              <w:rPr>
+                <w:rFonts w:ascii="Cambria" w:hAnsi="Cambria" w:eastAsia="Cambria" w:cs=""/>
+                <w:kern w:val="0"/>
+                <w:sz w:val="24"/>
+                <w:szCs w:val="24"/>
+                <w:lang w:val="en-US" w:eastAsia="en-US" w:bidi="ar-SA"/>
+              </w:rPr>
+            </w:pPr>
+            <w:r>
+              <w:rPr>
+                <w:rFonts w:eastAsia="Cambria" w:cs=""/>
+                <w:kern w:val="0"/>
+                <w:sz w:val="24"/>
+                <w:szCs w:val="24"/>
+                <w:lang w:val="en-US" w:eastAsia="en-US" w:bidi="ar-SA"/>
+              </w:rPr>
+              <w:t>All destinations receive exactly one copy; 10^6-flit soak green</w:t>
+            </w:r>
+          </w:p>
+        </w:tc>
+      </w:tr>
+      <w:tr>
+        <w:trPr/>
+        <w:tc>
+          <w:tcPr>
+            <w:tcW w:w="3120" w:type="dxa"/>
+            <w:tcBorders/>
+          </w:tcPr>
+          <w:p>
+            <w:pPr>
+              <w:pStyle w:val="Compact"/>
+              <w:widowControl/>
+              <w:spacing w:before="36" w:after="36"/>
+              <w:jc w:val="left"/>
+              <w:rPr>
+                <w:rFonts w:ascii="Cambria" w:hAnsi="Cambria" w:eastAsia="Cambria" w:cs=""/>
+                <w:kern w:val="0"/>
+                <w:sz w:val="24"/>
+                <w:szCs w:val="24"/>
+                <w:lang w:val="en-US" w:eastAsia="en-US" w:bidi="ar-SA"/>
+              </w:rPr>
+            </w:pPr>
+            <w:r>
+              <w:rPr>
+                <w:rFonts w:eastAsia="Cambria" w:cs=""/>
+                <w:kern w:val="0"/>
+                <w:sz w:val="24"/>
+                <w:szCs w:val="24"/>
+                <w:lang w:val="en-US" w:eastAsia="en-US" w:bidi="ar-SA"/>
+              </w:rPr>
+              <w:t>Counters</w:t>
+            </w:r>
+          </w:p>
+        </w:tc>
+        <w:tc>
+          <w:tcPr>
+            <w:tcW w:w="3120" w:type="dxa"/>
+            <w:tcBorders/>
+          </w:tcPr>
+          <w:p>
+            <w:pPr>
+              <w:pStyle w:val="Compact"/>
+              <w:widowControl/>
+              <w:spacing w:before="36" w:after="36"/>
+              <w:jc w:val="left"/>
+              <w:rPr>
+                <w:rFonts w:ascii="Cambria" w:hAnsi="Cambria" w:eastAsia="Cambria" w:cs=""/>
+                <w:kern w:val="0"/>
+                <w:sz w:val="24"/>
+                <w:szCs w:val="24"/>
+                <w:lang w:val="en-US" w:eastAsia="en-US" w:bidi="ar-SA"/>
+              </w:rPr>
+            </w:pPr>
+            <w:r>
+              <w:rPr>
+                <w:rFonts w:eastAsia="Cambria" w:cs=""/>
+                <w:kern w:val="0"/>
+                <w:sz w:val="24"/>
+                <w:szCs w:val="24"/>
+                <w:lang w:val="en-US" w:eastAsia="en-US" w:bidi="ar-SA"/>
+              </w:rPr>
+              <w:t>Counter bank readback, DFT escape</w:t>
+            </w:r>
+          </w:p>
+        </w:tc>
+        <w:tc>
+          <w:tcPr>
+            <w:tcW w:w="3120" w:type="dxa"/>
+            <w:tcBorders/>
+          </w:tcPr>
+          <w:p>
+            <w:pPr>
+              <w:pStyle w:val="Compact"/>
+              <w:widowControl/>
+              <w:spacing w:before="36" w:after="36"/>
+              <w:jc w:val="left"/>
+              <w:rPr>
+                <w:rFonts w:ascii="Cambria" w:hAnsi="Cambria" w:eastAsia="Cambria" w:cs=""/>
+                <w:kern w:val="0"/>
+                <w:sz w:val="24"/>
+                <w:szCs w:val="24"/>
+                <w:lang w:val="en-US" w:eastAsia="en-US" w:bidi="ar-SA"/>
+              </w:rPr>
+            </w:pPr>
+            <w:r>
+              <w:rPr>
+                <w:rFonts w:eastAsia="Cambria" w:cs=""/>
+                <w:kern w:val="0"/>
+                <w:sz w:val="24"/>
+                <w:szCs w:val="24"/>
+                <w:lang w:val="en-US" w:eastAsia="en-US" w:bidi="ar-SA"/>
+              </w:rPr>
+              <w:t>Readback matches scripted traffic; DFT pattern switches</w:t>
+            </w:r>
+          </w:p>
+        </w:tc>
+      </w:tr>
+      <w:tr>
+        <w:trPr/>
+        <w:tc>
+          <w:tcPr>
+            <w:tcW w:w="3120" w:type="dxa"/>
+            <w:tcBorders/>
+          </w:tcPr>
+          <w:p>
+            <w:pPr>
+              <w:pStyle w:val="Compact"/>
+              <w:widowControl/>
+              <w:spacing w:before="36" w:after="36"/>
+              <w:jc w:val="left"/>
+              <w:rPr>
+                <w:rFonts w:ascii="Cambria" w:hAnsi="Cambria" w:eastAsia="Cambria" w:cs=""/>
+                <w:kern w:val="0"/>
+                <w:sz w:val="24"/>
+                <w:szCs w:val="24"/>
+                <w:lang w:val="en-US" w:eastAsia="en-US" w:bidi="ar-SA"/>
+              </w:rPr>
+            </w:pPr>
+            <w:r>
+              <w:rPr>
+                <w:rFonts w:eastAsia="Cambria" w:cs=""/>
+                <w:kern w:val="0"/>
+                <w:sz w:val="24"/>
+                <w:szCs w:val="24"/>
+                <w:lang w:val="en-US" w:eastAsia="en-US" w:bidi="ar-SA"/>
+              </w:rPr>
+              <w:t>Systolic</w:t>
+            </w:r>
+          </w:p>
+        </w:tc>
+        <w:tc>
+          <w:tcPr>
+            <w:tcW w:w="3120" w:type="dxa"/>
+            <w:tcBorders/>
+          </w:tcPr>
+          <w:p>
+            <w:pPr>
+              <w:pStyle w:val="Compact"/>
+              <w:widowControl/>
+              <w:spacing w:before="36" w:after="36"/>
+              <w:jc w:val="left"/>
+              <w:rPr>
+                <w:rFonts w:ascii="Cambria" w:hAnsi="Cambria" w:eastAsia="Cambria" w:cs=""/>
+                <w:kern w:val="0"/>
+                <w:sz w:val="24"/>
+                <w:szCs w:val="24"/>
+                <w:lang w:val="en-US" w:eastAsia="en-US" w:bidi="ar-SA"/>
+              </w:rPr>
+            </w:pPr>
+            <w:r>
+              <w:rPr>
+                <w:rFonts w:eastAsia="Cambria" w:cs=""/>
+                <w:kern w:val="0"/>
+                <w:sz w:val="24"/>
+                <w:szCs w:val="24"/>
+                <w:lang w:val="en-US" w:eastAsia="en-US" w:bidi="ar-SA"/>
+              </w:rPr>
+              <w:t>Torus ring, dateline, source-route, speculation</w:t>
+            </w:r>
+          </w:p>
+        </w:tc>
+        <w:tc>
+          <w:tcPr>
+            <w:tcW w:w="3120" w:type="dxa"/>
+            <w:tcBorders/>
+          </w:tcPr>
+          <w:p>
+            <w:pPr>
+              <w:pStyle w:val="Compact"/>
+              <w:widowControl/>
+              <w:spacing w:before="36" w:after="36"/>
+              <w:jc w:val="left"/>
+              <w:rPr>
+                <w:rFonts w:ascii="Cambria" w:hAnsi="Cambria" w:eastAsia="Cambria" w:cs=""/>
+                <w:kern w:val="0"/>
+                <w:sz w:val="24"/>
+                <w:szCs w:val="24"/>
+                <w:lang w:val="en-US" w:eastAsia="en-US" w:bidi="ar-SA"/>
+              </w:rPr>
+            </w:pPr>
+            <w:r>
+              <w:rPr>
+                <w:rFonts w:eastAsia="Cambria" w:cs=""/>
+                <w:kern w:val="0"/>
+                <w:sz w:val="24"/>
+                <w:szCs w:val="24"/>
+                <w:lang w:val="en-US" w:eastAsia="en-US" w:bidi="ar-SA"/>
+              </w:rPr>
+              <w:t>Ring latency measured; dateline forces VC0; SR bypasses table drop; speculation parity</w:t>
+            </w:r>
+          </w:p>
+        </w:tc>
+      </w:tr>
+      <w:tr>
+        <w:trPr/>
+        <w:tc>
+          <w:tcPr>
+            <w:tcW w:w="3120" w:type="dxa"/>
+            <w:tcBorders/>
+          </w:tcPr>
+          <w:p>
+            <w:pPr>
+              <w:pStyle w:val="Compact"/>
+              <w:widowControl/>
+              <w:spacing w:before="36" w:after="36"/>
+              <w:jc w:val="left"/>
+              <w:rPr>
+                <w:rFonts w:ascii="Cambria" w:hAnsi="Cambria" w:eastAsia="Cambria" w:cs=""/>
+                <w:kern w:val="0"/>
+                <w:sz w:val="24"/>
+                <w:szCs w:val="24"/>
+                <w:lang w:val="en-US" w:eastAsia="en-US" w:bidi="ar-SA"/>
+              </w:rPr>
+            </w:pPr>
+            <w:r>
+              <w:rPr>
+                <w:rFonts w:eastAsia="Cambria" w:cs=""/>
+                <w:kern w:val="0"/>
+                <w:sz w:val="24"/>
+                <w:szCs w:val="24"/>
+                <w:lang w:val="en-US" w:eastAsia="en-US" w:bidi="ar-SA"/>
+              </w:rPr>
+              <w:t>Perf model calibration</w:t>
+            </w:r>
+          </w:p>
+        </w:tc>
+        <w:tc>
+          <w:tcPr>
+            <w:tcW w:w="3120" w:type="dxa"/>
+            <w:tcBorders/>
+          </w:tcPr>
+          <w:p>
+            <w:pPr>
+              <w:pStyle w:val="Compact"/>
+              <w:widowControl/>
+              <w:spacing w:before="36" w:after="36"/>
+              <w:jc w:val="left"/>
+              <w:rPr>
+                <w:rFonts w:ascii="Cambria" w:hAnsi="Cambria" w:eastAsia="Cambria" w:cs=""/>
+                <w:kern w:val="0"/>
+                <w:sz w:val="24"/>
+                <w:szCs w:val="24"/>
+                <w:lang w:val="en-US" w:eastAsia="en-US" w:bidi="ar-SA"/>
+              </w:rPr>
+            </w:pPr>
+            <w:r>
+              <w:rPr>
+                <w:rFonts w:eastAsia="Cambria" w:cs=""/>
+                <w:kern w:val="0"/>
+                <w:sz w:val="24"/>
+                <w:szCs w:val="24"/>
+                <w:lang w:val="en-US" w:eastAsia="en-US" w:bidi="ar-SA"/>
+              </w:rPr>
+              <w:t xml:space="preserve">Tornado pattern at three loads vs </w:t>
+            </w:r>
+            <w:r>
+              <w:rPr>
+                <w:rStyle w:val="VerbatimChar"/>
+                <w:rFonts w:eastAsia="Cambria" w:cs=""/>
+                <w:kern w:val="0"/>
+                <w:szCs w:val="24"/>
+                <w:lang w:val="en-US" w:eastAsia="en-US" w:bidi="ar-SA"/>
+              </w:rPr>
+              <w:t>bin/delta_mesh_perf.py</w:t>
+            </w:r>
+          </w:p>
+        </w:tc>
+        <w:tc>
+          <w:tcPr>
+            <w:tcW w:w="3120" w:type="dxa"/>
+            <w:tcBorders/>
+          </w:tcPr>
+          <w:p>
+            <w:pPr>
+              <w:pStyle w:val="Compact"/>
+              <w:widowControl/>
+              <w:spacing w:before="36" w:after="36"/>
+              <w:jc w:val="left"/>
+              <w:rPr>
+                <w:rFonts w:ascii="Cambria" w:hAnsi="Cambria" w:eastAsia="Cambria" w:cs=""/>
+                <w:kern w:val="0"/>
+                <w:sz w:val="24"/>
+                <w:szCs w:val="24"/>
+                <w:lang w:val="en-US" w:eastAsia="en-US" w:bidi="ar-SA"/>
+              </w:rPr>
+            </w:pPr>
+            <w:r>
+              <w:rPr>
+                <w:rFonts w:eastAsia="Cambria" w:cs=""/>
+                <w:kern w:val="0"/>
+                <w:sz w:val="24"/>
+                <w:szCs w:val="24"/>
+                <w:lang w:val="en-US" w:eastAsia="en-US" w:bidi="ar-SA"/>
+              </w:rPr>
+              <w:t>Zero-load T0 within 20% of model; loaded deltas recorded</w:t>
             </w:r>
             <w:bookmarkStart w:id="356" w:name="cocotb-suites"/>
             <w:bookmarkEnd w:id="356"/>
@@ -34286,7 +35244,7 @@
       <w:r>
         <w:br w:type="page"/>
       </w:r>
-      <w:bookmarkStart w:id="357" w:name="__RefHeading___Toc6277_1375447347"/>
+      <w:bookmarkStart w:id="357" w:name="__RefHeading___Toc6480_2586448665"/>
       <w:bookmarkEnd w:id="357"/>
       <w:r>
         <w:rPr>
@@ -34404,7 +35362,7 @@
         <w:spacing w:before="280" w:after="80"/>
         <w:rPr/>
       </w:pPr>
-      <w:bookmarkStart w:id="358" w:name="__RefHeading___Toc6279_1375447347"/>
+      <w:bookmarkStart w:id="358" w:name="__RefHeading___Toc6482_2586448665"/>
       <w:bookmarkStart w:id="359" w:name="performance-model-calibration"/>
       <w:bookmarkEnd w:id="358"/>
       <w:r>
@@ -34464,7 +35422,7 @@
         <w:spacing w:before="280" w:after="80"/>
         <w:rPr/>
       </w:pPr>
-      <w:bookmarkStart w:id="360" w:name="__RefHeading___Toc6281_1375447347"/>
+      <w:bookmarkStart w:id="360" w:name="__RefHeading___Toc6484_2586448665"/>
       <w:bookmarkStart w:id="361" w:name="references-7"/>
       <w:bookmarkEnd w:id="360"/>
       <w:r>
@@ -34702,7 +35660,7 @@
           </w:r>
           <w:r>
             <w:rPr/>
-            <w:t>129</w:t>
+            <w:t>130</w:t>
           </w:r>
           <w:r>
             <w:rPr/>
@@ -34729,7 +35687,7 @@
           </w:r>
           <w:r>
             <w:rPr/>
-            <w:t>129</w:t>
+            <w:t>130</w:t>
           </w:r>
           <w:r>
             <w:rPr/>
@@ -34849,7 +35807,7 @@
           </w:r>
           <w:r>
             <w:rPr/>
-            <w:t>129</w:t>
+            <w:t>130</w:t>
           </w:r>
           <w:r>
             <w:rPr/>
@@ -34876,7 +35834,7 @@
           </w:r>
           <w:r>
             <w:rPr/>
-            <w:t>129</w:t>
+            <w:t>130</w:t>
           </w:r>
           <w:r>
             <w:rPr/>

</xml_diff>